<commit_message>
Plan OWNA gap closure: BRD v2.2, delivery plan section 13, ADRs 0004-0006
- BRD v2.2: learning moves into Phase 1 via the family feed (resolves
  OI-04), new section 13B service compliance (CMP-001..009, Phase 2E),
  payroll by integration only (new OI-19).
- Delivery plan section 13: OWNA gap analysis, U0-U5 stages, decisions.
- ADR 0004 media storage (S3/MinIO, sharp EXIF strip, 5-min signed URLs),
  ADR 0005 in-house forms and e-signature, ADR 0006 Fat Zebra gateway.
- open-items, CLAUDE.md build sequence and README updated to match.

Co-Authored-By: Claude Opus 5.5 <noreply@anthropic.com>
</commit_message>
<xml_diff>
--- a/Requirement and design/Next_Gen_Childcare_Delivery_Plan.docx
+++ b/Requirement and design/Next_Gen_Childcare_Delivery_Plan.docx
@@ -48,7 +48,7 @@
           <w:sz w:val="20"/>
           <w:szCs w:val="20"/>
         </w:rPr>
-        <w:t xml:space="preserve">How to build a production-grade release of BRD v2.1  |  Prepared 2 October 2026</w:t>
+        <w:t xml:space="preserve">How to build a production-grade release of BRD v2.1  |  Prepared 2 October 2026  |  Updated 5 October 2026 (section 13: OWNA gap analysis and decisions)</w:t>
       </w:r>
     </w:p>
     <w:p>
@@ -15136,7 +15136,37 @@
           <w:sz w:val="30"/>
           <w:szCs w:val="30"/>
         </w:rPr>
-        <w:t xml:space="preserve">Sources and starting points</w:t>
+        <w:t xml:space="preserve">13. Competitor gap analysis (OWNA) and update plan</w:t>
+      </w:r>
+    </w:p>
+    <w:p>
+      <w:pPr>
+        <w:spacing w:after="120" w:line="276"/>
+      </w:pPr>
+      <w:r>
+        <w:rPr>
+          <w:rFonts w:ascii="Arial" w:cs="Arial" w:eastAsia="Arial" w:hAnsi="Arial"/>
+          <w:sz w:val="20"/>
+          <w:szCs w:val="20"/>
+        </w:rPr>
+        <w:t xml:space="preserve">Added 4 October 2026; decisions recorded 5 October 2026. This section compares the current build with OWNA, an established Australian childcare platform, and sets out how to close the gaps that matter. It is based on OWNA’s public website, App Store listing and published reviews, not on hands-on use of their product or a review of their screens.</w:t>
+      </w:r>
+    </w:p>
+    <w:p>
+      <w:pPr>
+        <w:pStyle w:val="Heading2"/>
+        <w:spacing w:after="100" w:before="220"/>
+      </w:pPr>
+      <w:r>
+        <w:rPr>
+          <w:rFonts w:ascii="Arial" w:cs="Arial" w:eastAsia="Arial" w:hAnsi="Arial"/>
+          <w:b/>
+          <w:bCs/>
+          <w:color w:val="1B3A5C"/>
+          <w:sz w:val="24"/>
+          <w:szCs w:val="24"/>
+        </w:rPr>
+        <w:t xml:space="preserve">13.1 Where the build stands</w:t>
       </w:r>
     </w:p>
     <w:p>
@@ -15151,10 +15181,20 @@
       <w:r>
         <w:rPr>
           <w:rFonts w:ascii="Arial" w:cs="Arial" w:eastAsia="Arial" w:hAnsi="Arial"/>
+          <w:b/>
+          <w:bCs/>
           <w:sz w:val="20"/>
           <w:szCs w:val="20"/>
         </w:rPr>
-        <w:t xml:space="preserve">Australian Government Department of Education – registered child care software and the Child Care Subsidy system pages (education.gov.au/early-childhood/providers). Not read in detail for this plan; confirm directly.</w:t>
+        <w:t xml:space="preserve">Built and tested: </w:t>
+      </w:r>
+      <w:r>
+        <w:rPr>
+          <w:rFonts w:ascii="Arial" w:cs="Arial" w:eastAsia="Arial" w:hAnsi="Arial"/>
+          <w:sz w:val="20"/>
+          <w:szCs w:val="20"/>
+        </w:rPr>
+        <w:t xml:space="preserve">backend Stages 0–5 (tenancy and RLS, auth and MFA, audit, sync, attendance, group care logging, medication, incidents, messaging API, pickup, billing ledger, mocked CCS, hardening), the centre web portal and the educator app.</w:t>
       </w:r>
     </w:p>
     <w:p>
@@ -15169,10 +15209,20 @@
       <w:r>
         <w:rPr>
           <w:rFonts w:ascii="Arial" w:cs="Arial" w:eastAsia="Arial" w:hAnsi="Arial"/>
+          <w:b/>
+          <w:bCs/>
           <w:sz w:val="20"/>
           <w:szCs w:val="20"/>
         </w:rPr>
-        <w:t xml:space="preserve">Services Australia – child care providers, PRODA information.</w:t>
+        <w:t xml:space="preserve">Not started: </w:t>
+      </w:r>
+      <w:r>
+        <w:rPr>
+          <w:rFonts w:ascii="Arial" w:cs="Arial" w:eastAsia="Arial" w:hAnsi="Arial"/>
+          <w:sz w:val="20"/>
+          <w:szCs w:val="20"/>
+        </w:rPr>
+        <w:t xml:space="preserve">the parent mobile app. Parents use the portal’s parent view for now.</w:t>
       </w:r>
     </w:p>
     <w:p>
@@ -15187,10 +15237,2410 @@
       <w:r>
         <w:rPr>
           <w:rFonts w:ascii="Arial" w:cs="Arial" w:eastAsia="Arial" w:hAnsi="Arial"/>
+          <w:b/>
+          <w:bCs/>
           <w:sz w:val="20"/>
           <w:szCs w:val="20"/>
         </w:rPr>
-        <w:t xml:space="preserve">ACECQA – educator-to-child ratios and the ratio calculator (acecqa.gov.au/nqf/educator-to-child-ratios).</w:t>
+        <w:t xml:space="preserve">Mocked or open: </w:t>
+      </w:r>
+      <w:r>
+        <w:rPr>
+          <w:rFonts w:ascii="Arial" w:cs="Arial" w:eastAsia="Arial" w:hAnsi="Arial"/>
+          <w:sz w:val="20"/>
+          <w:szCs w:val="20"/>
+        </w:rPr>
+        <w:t xml:space="preserve">payment gateway (OI-12), CCS registration (OI-14), media file storage (OI-09), digital forms (OI-11), MFA enforcement (OI-16), data retention and export (OI-17).</w:t>
+      </w:r>
+    </w:p>
+    <w:p>
+      <w:pPr>
+        <w:pStyle w:val="Heading2"/>
+        <w:spacing w:after="100" w:before="220"/>
+      </w:pPr>
+      <w:r>
+        <w:rPr>
+          <w:rFonts w:ascii="Arial" w:cs="Arial" w:eastAsia="Arial" w:hAnsi="Arial"/>
+          <w:b/>
+          <w:bCs/>
+          <w:color w:val="1B3A5C"/>
+          <w:sz w:val="24"/>
+          <w:szCs w:val="24"/>
+        </w:rPr>
+        <w:t xml:space="preserve">13.2 Feature gaps against OWNA</w:t>
+      </w:r>
+    </w:p>
+    <w:p>
+      <w:pPr>
+        <w:spacing w:after="120" w:line="276"/>
+      </w:pPr>
+      <w:r>
+        <w:rPr>
+          <w:rFonts w:ascii="Arial" w:cs="Arial" w:eastAsia="Arial" w:hAnsi="Arial"/>
+          <w:sz w:val="20"/>
+          <w:szCs w:val="20"/>
+        </w:rPr>
+        <w:t xml:space="preserve">Each gap is placed in a stage of the update plan in 13.4 (U1–U5), in Phase 2 or 3, or marked as not planned.</w:t>
+      </w:r>
+    </w:p>
+    <w:tbl>
+      <w:tblPr>
+        <w:tblW w:type="dxa" w:w="9638"/>
+        <w:tblBorders>
+          <w:top w:val="single" w:color="auto" w:sz="4"/>
+          <w:left w:val="single" w:color="auto" w:sz="4"/>
+          <w:bottom w:val="single" w:color="auto" w:sz="4"/>
+          <w:right w:val="single" w:color="auto" w:sz="4"/>
+          <w:insideH w:val="single" w:color="auto" w:sz="4"/>
+          <w:insideV w:val="single" w:color="auto" w:sz="4"/>
+        </w:tblBorders>
+      </w:tblPr>
+      <w:tblGrid>
+        <w:gridCol w:w="2100"/>
+        <w:gridCol w:w="2650"/>
+        <w:gridCol w:w="3038"/>
+        <w:gridCol w:w="1850"/>
+      </w:tblGrid>
+      <w:tr>
+        <w:trPr>
+          <w:tblHeader/>
+        </w:trPr>
+        <w:tc>
+          <w:tcPr>
+            <w:tcW w:type="dxa" w:w="2100"/>
+            <w:tcBorders>
+              <w:top w:val="single" w:color="C9D1DA" w:sz="4"/>
+              <w:left w:val="single" w:color="C9D1DA" w:sz="4"/>
+              <w:bottom w:val="single" w:color="C9D1DA" w:sz="4"/>
+              <w:right w:val="single" w:color="C9D1DA" w:sz="4"/>
+            </w:tcBorders>
+            <w:shd w:fill="1B3A5C" w:color="auto" w:val="clear"/>
+            <w:tcMar>
+              <w:top w:type="dxa" w:w="70"/>
+              <w:left w:type="dxa" w:w="110"/>
+              <w:bottom w:type="dxa" w:w="70"/>
+              <w:right w:type="dxa" w:w="110"/>
+            </w:tcMar>
+          </w:tcPr>
+          <w:p>
+            <w:pPr>
+              <w:spacing w:after="0"/>
+            </w:pPr>
+            <w:r>
+              <w:rPr>
+                <w:rFonts w:ascii="Arial" w:cs="Arial" w:eastAsia="Arial" w:hAnsi="Arial"/>
+                <w:b/>
+                <w:bCs/>
+                <w:color w:val="FFFFFF"/>
+                <w:sz w:val="18"/>
+                <w:szCs w:val="18"/>
+              </w:rPr>
+              <w:t xml:space="preserve">Gap</w:t>
+            </w:r>
+          </w:p>
+        </w:tc>
+        <w:tc>
+          <w:tcPr>
+            <w:tcW w:type="dxa" w:w="2650"/>
+            <w:tcBorders>
+              <w:top w:val="single" w:color="C9D1DA" w:sz="4"/>
+              <w:left w:val="single" w:color="C9D1DA" w:sz="4"/>
+              <w:bottom w:val="single" w:color="C9D1DA" w:sz="4"/>
+              <w:right w:val="single" w:color="C9D1DA" w:sz="4"/>
+            </w:tcBorders>
+            <w:shd w:fill="1B3A5C" w:color="auto" w:val="clear"/>
+            <w:tcMar>
+              <w:top w:type="dxa" w:w="70"/>
+              <w:left w:type="dxa" w:w="110"/>
+              <w:bottom w:type="dxa" w:w="70"/>
+              <w:right w:type="dxa" w:w="110"/>
+            </w:tcMar>
+          </w:tcPr>
+          <w:p>
+            <w:pPr>
+              <w:spacing w:after="0"/>
+            </w:pPr>
+            <w:r>
+              <w:rPr>
+                <w:rFonts w:ascii="Arial" w:cs="Arial" w:eastAsia="Arial" w:hAnsi="Arial"/>
+                <w:b/>
+                <w:bCs/>
+                <w:color w:val="FFFFFF"/>
+                <w:sz w:val="18"/>
+                <w:szCs w:val="18"/>
+              </w:rPr>
+              <w:t xml:space="preserve">What OWNA offers</w:t>
+            </w:r>
+          </w:p>
+        </w:tc>
+        <w:tc>
+          <w:tcPr>
+            <w:tcW w:type="dxa" w:w="3038"/>
+            <w:tcBorders>
+              <w:top w:val="single" w:color="C9D1DA" w:sz="4"/>
+              <w:left w:val="single" w:color="C9D1DA" w:sz="4"/>
+              <w:bottom w:val="single" w:color="C9D1DA" w:sz="4"/>
+              <w:right w:val="single" w:color="C9D1DA" w:sz="4"/>
+            </w:tcBorders>
+            <w:shd w:fill="1B3A5C" w:color="auto" w:val="clear"/>
+            <w:tcMar>
+              <w:top w:type="dxa" w:w="70"/>
+              <w:left w:type="dxa" w:w="110"/>
+              <w:bottom w:type="dxa" w:w="70"/>
+              <w:right w:type="dxa" w:w="110"/>
+            </w:tcMar>
+          </w:tcPr>
+          <w:p>
+            <w:pPr>
+              <w:spacing w:after="0"/>
+            </w:pPr>
+            <w:r>
+              <w:rPr>
+                <w:rFonts w:ascii="Arial" w:cs="Arial" w:eastAsia="Arial" w:hAnsi="Arial"/>
+                <w:b/>
+                <w:bCs/>
+                <w:color w:val="FFFFFF"/>
+                <w:sz w:val="18"/>
+                <w:szCs w:val="18"/>
+              </w:rPr>
+              <w:t xml:space="preserve">Our status</w:t>
+            </w:r>
+          </w:p>
+        </w:tc>
+        <w:tc>
+          <w:tcPr>
+            <w:tcW w:type="dxa" w:w="1850"/>
+            <w:tcBorders>
+              <w:top w:val="single" w:color="C9D1DA" w:sz="4"/>
+              <w:left w:val="single" w:color="C9D1DA" w:sz="4"/>
+              <w:bottom w:val="single" w:color="C9D1DA" w:sz="4"/>
+              <w:right w:val="single" w:color="C9D1DA" w:sz="4"/>
+            </w:tcBorders>
+            <w:shd w:fill="1B3A5C" w:color="auto" w:val="clear"/>
+            <w:tcMar>
+              <w:top w:type="dxa" w:w="70"/>
+              <w:left w:type="dxa" w:w="110"/>
+              <w:bottom w:type="dxa" w:w="70"/>
+              <w:right w:type="dxa" w:w="110"/>
+            </w:tcMar>
+          </w:tcPr>
+          <w:p>
+            <w:pPr>
+              <w:spacing w:after="0"/>
+            </w:pPr>
+            <w:r>
+              <w:rPr>
+                <w:rFonts w:ascii="Arial" w:cs="Arial" w:eastAsia="Arial" w:hAnsi="Arial"/>
+                <w:b/>
+                <w:bCs/>
+                <w:color w:val="FFFFFF"/>
+                <w:sz w:val="18"/>
+                <w:szCs w:val="18"/>
+              </w:rPr>
+              <w:t xml:space="preserve">Where it goes</w:t>
+            </w:r>
+          </w:p>
+        </w:tc>
+      </w:tr>
+      <w:tr>
+        <w:trPr>
+          <w:cantSplit/>
+        </w:trPr>
+        <w:tc>
+          <w:tcPr>
+            <w:tcW w:type="dxa" w:w="2100"/>
+            <w:tcBorders>
+              <w:top w:val="single" w:color="C9D1DA" w:sz="4"/>
+              <w:left w:val="single" w:color="C9D1DA" w:sz="4"/>
+              <w:bottom w:val="single" w:color="C9D1DA" w:sz="4"/>
+              <w:right w:val="single" w:color="C9D1DA" w:sz="4"/>
+            </w:tcBorders>
+            <w:shd w:fill="E3EEF9" w:color="auto" w:val="clear"/>
+            <w:tcMar>
+              <w:top w:type="dxa" w:w="70"/>
+              <w:left w:type="dxa" w:w="110"/>
+              <w:bottom w:type="dxa" w:w="70"/>
+              <w:right w:type="dxa" w:w="110"/>
+            </w:tcMar>
+          </w:tcPr>
+          <w:p>
+            <w:pPr>
+              <w:spacing w:after="0"/>
+            </w:pPr>
+            <w:r>
+              <w:rPr>
+                <w:rFonts w:ascii="Arial" w:cs="Arial" w:eastAsia="Arial" w:hAnsi="Arial"/>
+                <w:sz w:val="18"/>
+                <w:szCs w:val="18"/>
+              </w:rPr>
+              <w:t xml:space="preserve">Messaging, announcements and photo/video posts</w:t>
+            </w:r>
+          </w:p>
+        </w:tc>
+        <w:tc>
+          <w:tcPr>
+            <w:tcW w:type="dxa" w:w="2650"/>
+            <w:tcBorders>
+              <w:top w:val="single" w:color="C9D1DA" w:sz="4"/>
+              <w:left w:val="single" w:color="C9D1DA" w:sz="4"/>
+              <w:bottom w:val="single" w:color="C9D1DA" w:sz="4"/>
+              <w:right w:val="single" w:color="C9D1DA" w:sz="4"/>
+            </w:tcBorders>
+            <w:tcMar>
+              <w:top w:type="dxa" w:w="70"/>
+              <w:left w:type="dxa" w:w="110"/>
+              <w:bottom w:type="dxa" w:w="70"/>
+              <w:right w:type="dxa" w:w="110"/>
+            </w:tcMar>
+          </w:tcPr>
+          <w:p>
+            <w:pPr>
+              <w:spacing w:after="0"/>
+            </w:pPr>
+            <w:r>
+              <w:rPr>
+                <w:rFonts w:ascii="Arial" w:cs="Arial" w:eastAsia="Arial" w:hAnsi="Arial"/>
+                <w:sz w:val="18"/>
+                <w:szCs w:val="18"/>
+              </w:rPr>
+              <w:t xml:space="preserve">Family feed with photos, videos and direct messages</w:t>
+            </w:r>
+          </w:p>
+        </w:tc>
+        <w:tc>
+          <w:tcPr>
+            <w:tcW w:type="dxa" w:w="3038"/>
+            <w:tcBorders>
+              <w:top w:val="single" w:color="C9D1DA" w:sz="4"/>
+              <w:left w:val="single" w:color="C9D1DA" w:sz="4"/>
+              <w:bottom w:val="single" w:color="C9D1DA" w:sz="4"/>
+              <w:right w:val="single" w:color="C9D1DA" w:sz="4"/>
+            </w:tcBorders>
+            <w:tcMar>
+              <w:top w:type="dxa" w:w="70"/>
+              <w:left w:type="dxa" w:w="110"/>
+              <w:bottom w:type="dxa" w:w="70"/>
+              <w:right w:type="dxa" w:w="110"/>
+            </w:tcMar>
+          </w:tcPr>
+          <w:p>
+            <w:pPr>
+              <w:spacing w:after="0"/>
+            </w:pPr>
+            <w:r>
+              <w:rPr>
+                <w:rFonts w:ascii="Arial" w:cs="Arial" w:eastAsia="Arial" w:hAnsi="Arial"/>
+                <w:sz w:val="18"/>
+                <w:szCs w:val="18"/>
+              </w:rPr>
+              <w:t xml:space="preserve">API built (messaging, media visibility); no screens in portal or apps; real media storage missing (OI-09)</w:t>
+            </w:r>
+          </w:p>
+        </w:tc>
+        <w:tc>
+          <w:tcPr>
+            <w:tcW w:type="dxa" w:w="1850"/>
+            <w:tcBorders>
+              <w:top w:val="single" w:color="C9D1DA" w:sz="4"/>
+              <w:left w:val="single" w:color="C9D1DA" w:sz="4"/>
+              <w:bottom w:val="single" w:color="C9D1DA" w:sz="4"/>
+              <w:right w:val="single" w:color="C9D1DA" w:sz="4"/>
+            </w:tcBorders>
+            <w:tcMar>
+              <w:top w:type="dxa" w:w="70"/>
+              <w:left w:type="dxa" w:w="110"/>
+              <w:bottom w:type="dxa" w:w="70"/>
+              <w:right w:type="dxa" w:w="110"/>
+            </w:tcMar>
+          </w:tcPr>
+          <w:p>
+            <w:pPr>
+              <w:spacing w:after="0"/>
+            </w:pPr>
+            <w:r>
+              <w:rPr>
+                <w:rFonts w:ascii="Arial" w:cs="Arial" w:eastAsia="Arial" w:hAnsi="Arial"/>
+                <w:sz w:val="18"/>
+                <w:szCs w:val="18"/>
+              </w:rPr>
+              <w:t xml:space="preserve">U1</w:t>
+            </w:r>
+          </w:p>
+        </w:tc>
+      </w:tr>
+      <w:tr>
+        <w:trPr>
+          <w:cantSplit/>
+        </w:trPr>
+        <w:tc>
+          <w:tcPr>
+            <w:tcW w:type="dxa" w:w="2100"/>
+            <w:tcBorders>
+              <w:top w:val="single" w:color="C9D1DA" w:sz="4"/>
+              <w:left w:val="single" w:color="C9D1DA" w:sz="4"/>
+              <w:bottom w:val="single" w:color="C9D1DA" w:sz="4"/>
+              <w:right w:val="single" w:color="C9D1DA" w:sz="4"/>
+            </w:tcBorders>
+            <w:shd w:fill="E3EEF9" w:color="auto" w:val="clear"/>
+            <w:tcMar>
+              <w:top w:type="dxa" w:w="70"/>
+              <w:left w:type="dxa" w:w="110"/>
+              <w:bottom w:type="dxa" w:w="70"/>
+              <w:right w:type="dxa" w:w="110"/>
+            </w:tcMar>
+          </w:tcPr>
+          <w:p>
+            <w:pPr>
+              <w:spacing w:after="0"/>
+            </w:pPr>
+            <w:r>
+              <w:rPr>
+                <w:rFonts w:ascii="Arial" w:cs="Arial" w:eastAsia="Arial" w:hAnsi="Arial"/>
+                <w:sz w:val="18"/>
+                <w:szCs w:val="18"/>
+              </w:rPr>
+              <w:t xml:space="preserve">Parent mobile app</w:t>
+            </w:r>
+          </w:p>
+        </w:tc>
+        <w:tc>
+          <w:tcPr>
+            <w:tcW w:type="dxa" w:w="2650"/>
+            <w:tcBorders>
+              <w:top w:val="single" w:color="C9D1DA" w:sz="4"/>
+              <w:left w:val="single" w:color="C9D1DA" w:sz="4"/>
+              <w:bottom w:val="single" w:color="C9D1DA" w:sz="4"/>
+              <w:right w:val="single" w:color="C9D1DA" w:sz="4"/>
+            </w:tcBorders>
+            <w:tcMar>
+              <w:top w:type="dxa" w:w="70"/>
+              <w:left w:type="dxa" w:w="110"/>
+              <w:bottom w:type="dxa" w:w="70"/>
+              <w:right w:type="dxa" w:w="110"/>
+            </w:tcMar>
+          </w:tcPr>
+          <w:p>
+            <w:pPr>
+              <w:spacing w:after="0"/>
+            </w:pPr>
+            <w:r>
+              <w:rPr>
+                <w:rFonts w:ascii="Arial" w:cs="Arial" w:eastAsia="Arial" w:hAnsi="Arial"/>
+                <w:sz w:val="18"/>
+                <w:szCs w:val="18"/>
+              </w:rPr>
+              <w:t xml:space="preserve">Parent app with daily info, posts, forms, bookings and payments</w:t>
+            </w:r>
+          </w:p>
+        </w:tc>
+        <w:tc>
+          <w:tcPr>
+            <w:tcW w:type="dxa" w:w="3038"/>
+            <w:tcBorders>
+              <w:top w:val="single" w:color="C9D1DA" w:sz="4"/>
+              <w:left w:val="single" w:color="C9D1DA" w:sz="4"/>
+              <w:bottom w:val="single" w:color="C9D1DA" w:sz="4"/>
+              <w:right w:val="single" w:color="C9D1DA" w:sz="4"/>
+            </w:tcBorders>
+            <w:tcMar>
+              <w:top w:type="dxa" w:w="70"/>
+              <w:left w:type="dxa" w:w="110"/>
+              <w:bottom w:type="dxa" w:w="70"/>
+              <w:right w:type="dxa" w:w="110"/>
+            </w:tcMar>
+          </w:tcPr>
+          <w:p>
+            <w:pPr>
+              <w:spacing w:after="0"/>
+            </w:pPr>
+            <w:r>
+              <w:rPr>
+                <w:rFonts w:ascii="Arial" w:cs="Arial" w:eastAsia="Arial" w:hAnsi="Arial"/>
+                <w:sz w:val="18"/>
+                <w:szCs w:val="18"/>
+              </w:rPr>
+              <w:t xml:space="preserve">Not started</w:t>
+            </w:r>
+          </w:p>
+        </w:tc>
+        <w:tc>
+          <w:tcPr>
+            <w:tcW w:type="dxa" w:w="1850"/>
+            <w:tcBorders>
+              <w:top w:val="single" w:color="C9D1DA" w:sz="4"/>
+              <w:left w:val="single" w:color="C9D1DA" w:sz="4"/>
+              <w:bottom w:val="single" w:color="C9D1DA" w:sz="4"/>
+              <w:right w:val="single" w:color="C9D1DA" w:sz="4"/>
+            </w:tcBorders>
+            <w:tcMar>
+              <w:top w:type="dxa" w:w="70"/>
+              <w:left w:type="dxa" w:w="110"/>
+              <w:bottom w:type="dxa" w:w="70"/>
+              <w:right w:type="dxa" w:w="110"/>
+            </w:tcMar>
+          </w:tcPr>
+          <w:p>
+            <w:pPr>
+              <w:spacing w:after="0"/>
+            </w:pPr>
+            <w:r>
+              <w:rPr>
+                <w:rFonts w:ascii="Arial" w:cs="Arial" w:eastAsia="Arial" w:hAnsi="Arial"/>
+                <w:sz w:val="18"/>
+                <w:szCs w:val="18"/>
+              </w:rPr>
+              <w:t xml:space="preserve">U3</w:t>
+            </w:r>
+          </w:p>
+        </w:tc>
+      </w:tr>
+      <w:tr>
+        <w:trPr>
+          <w:cantSplit/>
+        </w:trPr>
+        <w:tc>
+          <w:tcPr>
+            <w:tcW w:type="dxa" w:w="2100"/>
+            <w:tcBorders>
+              <w:top w:val="single" w:color="C9D1DA" w:sz="4"/>
+              <w:left w:val="single" w:color="C9D1DA" w:sz="4"/>
+              <w:bottom w:val="single" w:color="C9D1DA" w:sz="4"/>
+              <w:right w:val="single" w:color="C9D1DA" w:sz="4"/>
+            </w:tcBorders>
+            <w:shd w:fill="FFF4E0" w:color="auto" w:val="clear"/>
+            <w:tcMar>
+              <w:top w:type="dxa" w:w="70"/>
+              <w:left w:type="dxa" w:w="110"/>
+              <w:bottom w:type="dxa" w:w="70"/>
+              <w:right w:type="dxa" w:w="110"/>
+            </w:tcMar>
+          </w:tcPr>
+          <w:p>
+            <w:pPr>
+              <w:spacing w:after="0"/>
+            </w:pPr>
+            <w:r>
+              <w:rPr>
+                <w:rFonts w:ascii="Arial" w:cs="Arial" w:eastAsia="Arial" w:hAnsi="Arial"/>
+                <w:sz w:val="18"/>
+                <w:szCs w:val="18"/>
+              </w:rPr>
+              <w:t xml:space="preserve">Parent self-service</w:t>
+            </w:r>
+          </w:p>
+        </w:tc>
+        <w:tc>
+          <w:tcPr>
+            <w:tcW w:type="dxa" w:w="2650"/>
+            <w:tcBorders>
+              <w:top w:val="single" w:color="C9D1DA" w:sz="4"/>
+              <w:left w:val="single" w:color="C9D1DA" w:sz="4"/>
+              <w:bottom w:val="single" w:color="C9D1DA" w:sz="4"/>
+              <w:right w:val="single" w:color="C9D1DA" w:sz="4"/>
+            </w:tcBorders>
+            <w:tcMar>
+              <w:top w:type="dxa" w:w="70"/>
+              <w:left w:type="dxa" w:w="110"/>
+              <w:bottom w:type="dxa" w:w="70"/>
+              <w:right w:type="dxa" w:w="110"/>
+            </w:tcMar>
+          </w:tcPr>
+          <w:p>
+            <w:pPr>
+              <w:spacing w:after="0"/>
+            </w:pPr>
+            <w:r>
+              <w:rPr>
+                <w:rFonts w:ascii="Arial" w:cs="Arial" w:eastAsia="Arial" w:hAnsi="Arial"/>
+                <w:sz w:val="18"/>
+                <w:szCs w:val="18"/>
+              </w:rPr>
+              <w:t xml:space="preserve">Book casual days, re-enrol, update details, pay and update card</w:t>
+            </w:r>
+          </w:p>
+        </w:tc>
+        <w:tc>
+          <w:tcPr>
+            <w:tcW w:type="dxa" w:w="3038"/>
+            <w:tcBorders>
+              <w:top w:val="single" w:color="C9D1DA" w:sz="4"/>
+              <w:left w:val="single" w:color="C9D1DA" w:sz="4"/>
+              <w:bottom w:val="single" w:color="C9D1DA" w:sz="4"/>
+              <w:right w:val="single" w:color="C9D1DA" w:sz="4"/>
+            </w:tcBorders>
+            <w:tcMar>
+              <w:top w:type="dxa" w:w="70"/>
+              <w:left w:type="dxa" w:w="110"/>
+              <w:bottom w:type="dxa" w:w="70"/>
+              <w:right w:type="dxa" w:w="110"/>
+            </w:tcMar>
+          </w:tcPr>
+          <w:p>
+            <w:pPr>
+              <w:spacing w:after="0"/>
+            </w:pPr>
+            <w:r>
+              <w:rPr>
+                <w:rFonts w:ascii="Arial" w:cs="Arial" w:eastAsia="Arial" w:hAnsi="Arial"/>
+                <w:sz w:val="18"/>
+                <w:szCs w:val="18"/>
+              </w:rPr>
+              <w:t xml:space="preserve">Bookings exist in billing; no parent-facing flow; payments mocked (OI-12)</w:t>
+            </w:r>
+          </w:p>
+        </w:tc>
+        <w:tc>
+          <w:tcPr>
+            <w:tcW w:type="dxa" w:w="1850"/>
+            <w:tcBorders>
+              <w:top w:val="single" w:color="C9D1DA" w:sz="4"/>
+              <w:left w:val="single" w:color="C9D1DA" w:sz="4"/>
+              <w:bottom w:val="single" w:color="C9D1DA" w:sz="4"/>
+              <w:right w:val="single" w:color="C9D1DA" w:sz="4"/>
+            </w:tcBorders>
+            <w:tcMar>
+              <w:top w:type="dxa" w:w="70"/>
+              <w:left w:type="dxa" w:w="110"/>
+              <w:bottom w:type="dxa" w:w="70"/>
+              <w:right w:type="dxa" w:w="110"/>
+            </w:tcMar>
+          </w:tcPr>
+          <w:p>
+            <w:pPr>
+              <w:spacing w:after="0"/>
+            </w:pPr>
+            <w:r>
+              <w:rPr>
+                <w:rFonts w:ascii="Arial" w:cs="Arial" w:eastAsia="Arial" w:hAnsi="Arial"/>
+                <w:sz w:val="18"/>
+                <w:szCs w:val="18"/>
+              </w:rPr>
+              <w:t xml:space="preserve">U3, U5</w:t>
+            </w:r>
+          </w:p>
+        </w:tc>
+      </w:tr>
+      <w:tr>
+        <w:trPr>
+          <w:cantSplit/>
+        </w:trPr>
+        <w:tc>
+          <w:tcPr>
+            <w:tcW w:type="dxa" w:w="2100"/>
+            <w:tcBorders>
+              <w:top w:val="single" w:color="C9D1DA" w:sz="4"/>
+              <w:left w:val="single" w:color="C9D1DA" w:sz="4"/>
+              <w:bottom w:val="single" w:color="C9D1DA" w:sz="4"/>
+              <w:right w:val="single" w:color="C9D1DA" w:sz="4"/>
+            </w:tcBorders>
+            <w:shd w:fill="E3EEF9" w:color="auto" w:val="clear"/>
+            <w:tcMar>
+              <w:top w:type="dxa" w:w="70"/>
+              <w:left w:type="dxa" w:w="110"/>
+              <w:bottom w:type="dxa" w:w="70"/>
+              <w:right w:type="dxa" w:w="110"/>
+            </w:tcMar>
+          </w:tcPr>
+          <w:p>
+            <w:pPr>
+              <w:spacing w:after="0"/>
+            </w:pPr>
+            <w:r>
+              <w:rPr>
+                <w:rFonts w:ascii="Arial" w:cs="Arial" w:eastAsia="Arial" w:hAnsi="Arial"/>
+                <w:sz w:val="18"/>
+                <w:szCs w:val="18"/>
+              </w:rPr>
+              <w:t xml:space="preserve">Extended routines</w:t>
+            </w:r>
+          </w:p>
+        </w:tc>
+        <w:tc>
+          <w:tcPr>
+            <w:tcW w:type="dxa" w:w="2650"/>
+            <w:tcBorders>
+              <w:top w:val="single" w:color="C9D1DA" w:sz="4"/>
+              <w:left w:val="single" w:color="C9D1DA" w:sz="4"/>
+              <w:bottom w:val="single" w:color="C9D1DA" w:sz="4"/>
+              <w:right w:val="single" w:color="C9D1DA" w:sz="4"/>
+            </w:tcBorders>
+            <w:tcMar>
+              <w:top w:type="dxa" w:w="70"/>
+              <w:left w:type="dxa" w:w="110"/>
+              <w:bottom w:type="dxa" w:w="70"/>
+              <w:right w:type="dxa" w:w="110"/>
+            </w:tcMar>
+          </w:tcPr>
+          <w:p>
+            <w:pPr>
+              <w:spacing w:after="0"/>
+            </w:pPr>
+            <w:r>
+              <w:rPr>
+                <w:rFonts w:ascii="Arial" w:cs="Arial" w:eastAsia="Arial" w:hAnsi="Arial"/>
+                <w:sz w:val="18"/>
+                <w:szCs w:val="18"/>
+              </w:rPr>
+              <w:t xml:space="preserve">Sleep checks, sunscreen, nappies, bottles, checklists</w:t>
+            </w:r>
+          </w:p>
+        </w:tc>
+        <w:tc>
+          <w:tcPr>
+            <w:tcW w:type="dxa" w:w="3038"/>
+            <w:tcBorders>
+              <w:top w:val="single" w:color="C9D1DA" w:sz="4"/>
+              <w:left w:val="single" w:color="C9D1DA" w:sz="4"/>
+              <w:bottom w:val="single" w:color="C9D1DA" w:sz="4"/>
+              <w:right w:val="single" w:color="C9D1DA" w:sz="4"/>
+            </w:tcBorders>
+            <w:tcMar>
+              <w:top w:type="dxa" w:w="70"/>
+              <w:left w:type="dxa" w:w="110"/>
+              <w:bottom w:type="dxa" w:w="70"/>
+              <w:right w:type="dxa" w:w="110"/>
+            </w:tcMar>
+          </w:tcPr>
+          <w:p>
+            <w:pPr>
+              <w:spacing w:after="0"/>
+            </w:pPr>
+            <w:r>
+              <w:rPr>
+                <w:rFonts w:ascii="Arial" w:cs="Arial" w:eastAsia="Arial" w:hAnsi="Arial"/>
+                <w:sz w:val="18"/>
+                <w:szCs w:val="18"/>
+              </w:rPr>
+              <w:t xml:space="preserve">Meal, sleep, toileting, bottle and activity only; no timed sleep checks, sunscreen or checklists</w:t>
+            </w:r>
+          </w:p>
+        </w:tc>
+        <w:tc>
+          <w:tcPr>
+            <w:tcW w:type="dxa" w:w="1850"/>
+            <w:tcBorders>
+              <w:top w:val="single" w:color="C9D1DA" w:sz="4"/>
+              <w:left w:val="single" w:color="C9D1DA" w:sz="4"/>
+              <w:bottom w:val="single" w:color="C9D1DA" w:sz="4"/>
+              <w:right w:val="single" w:color="C9D1DA" w:sz="4"/>
+            </w:tcBorders>
+            <w:tcMar>
+              <w:top w:type="dxa" w:w="70"/>
+              <w:left w:type="dxa" w:w="110"/>
+              <w:bottom w:type="dxa" w:w="70"/>
+              <w:right w:type="dxa" w:w="110"/>
+            </w:tcMar>
+          </w:tcPr>
+          <w:p>
+            <w:pPr>
+              <w:spacing w:after="0"/>
+            </w:pPr>
+            <w:r>
+              <w:rPr>
+                <w:rFonts w:ascii="Arial" w:cs="Arial" w:eastAsia="Arial" w:hAnsi="Arial"/>
+                <w:sz w:val="18"/>
+                <w:szCs w:val="18"/>
+              </w:rPr>
+              <w:t xml:space="preserve">U1</w:t>
+            </w:r>
+          </w:p>
+        </w:tc>
+      </w:tr>
+      <w:tr>
+        <w:trPr>
+          <w:cantSplit/>
+        </w:trPr>
+        <w:tc>
+          <w:tcPr>
+            <w:tcW w:type="dxa" w:w="2100"/>
+            <w:tcBorders>
+              <w:top w:val="single" w:color="C9D1DA" w:sz="4"/>
+              <w:left w:val="single" w:color="C9D1DA" w:sz="4"/>
+              <w:bottom w:val="single" w:color="C9D1DA" w:sz="4"/>
+              <w:right w:val="single" w:color="C9D1DA" w:sz="4"/>
+            </w:tcBorders>
+            <w:shd w:fill="E3EEF9" w:color="auto" w:val="clear"/>
+            <w:tcMar>
+              <w:top w:type="dxa" w:w="70"/>
+              <w:left w:type="dxa" w:w="110"/>
+              <w:bottom w:type="dxa" w:w="70"/>
+              <w:right w:type="dxa" w:w="110"/>
+            </w:tcMar>
+          </w:tcPr>
+          <w:p>
+            <w:pPr>
+              <w:spacing w:after="0"/>
+            </w:pPr>
+            <w:r>
+              <w:rPr>
+                <w:rFonts w:ascii="Arial" w:cs="Arial" w:eastAsia="Arial" w:hAnsi="Arial"/>
+                <w:sz w:val="18"/>
+                <w:szCs w:val="18"/>
+              </w:rPr>
+              <w:t xml:space="preserve">Digital forms and e-signatures</w:t>
+            </w:r>
+          </w:p>
+        </w:tc>
+        <w:tc>
+          <w:tcPr>
+            <w:tcW w:type="dxa" w:w="2650"/>
+            <w:tcBorders>
+              <w:top w:val="single" w:color="C9D1DA" w:sz="4"/>
+              <w:left w:val="single" w:color="C9D1DA" w:sz="4"/>
+              <w:bottom w:val="single" w:color="C9D1DA" w:sz="4"/>
+              <w:right w:val="single" w:color="C9D1DA" w:sz="4"/>
+            </w:tcBorders>
+            <w:tcMar>
+              <w:top w:type="dxa" w:w="70"/>
+              <w:left w:type="dxa" w:w="110"/>
+              <w:bottom w:type="dxa" w:w="70"/>
+              <w:right w:type="dxa" w:w="110"/>
+            </w:tcMar>
+          </w:tcPr>
+          <w:p>
+            <w:pPr>
+              <w:spacing w:after="0"/>
+            </w:pPr>
+            <w:r>
+              <w:rPr>
+                <w:rFonts w:ascii="Arial" w:cs="Arial" w:eastAsia="Arial" w:hAnsi="Arial"/>
+                <w:sz w:val="18"/>
+                <w:szCs w:val="18"/>
+              </w:rPr>
+              <w:t xml:space="preserve">Excursion, incident and custom forms with signatures</w:t>
+            </w:r>
+          </w:p>
+        </w:tc>
+        <w:tc>
+          <w:tcPr>
+            <w:tcW w:type="dxa" w:w="3038"/>
+            <w:tcBorders>
+              <w:top w:val="single" w:color="C9D1DA" w:sz="4"/>
+              <w:left w:val="single" w:color="C9D1DA" w:sz="4"/>
+              <w:bottom w:val="single" w:color="C9D1DA" w:sz="4"/>
+              <w:right w:val="single" w:color="C9D1DA" w:sz="4"/>
+            </w:tcBorders>
+            <w:tcMar>
+              <w:top w:type="dxa" w:w="70"/>
+              <w:left w:type="dxa" w:w="110"/>
+              <w:bottom w:type="dxa" w:w="70"/>
+              <w:right w:type="dxa" w:w="110"/>
+            </w:tcMar>
+          </w:tcPr>
+          <w:p>
+            <w:pPr>
+              <w:spacing w:after="0"/>
+            </w:pPr>
+            <w:r>
+              <w:rPr>
+                <w:rFonts w:ascii="Arial" w:cs="Arial" w:eastAsia="Arial" w:hAnsi="Arial"/>
+                <w:sz w:val="18"/>
+                <w:szCs w:val="18"/>
+              </w:rPr>
+              <w:t xml:space="preserve">Incident acknowledgement only (OI-11)</w:t>
+            </w:r>
+          </w:p>
+        </w:tc>
+        <w:tc>
+          <w:tcPr>
+            <w:tcW w:type="dxa" w:w="1850"/>
+            <w:tcBorders>
+              <w:top w:val="single" w:color="C9D1DA" w:sz="4"/>
+              <w:left w:val="single" w:color="C9D1DA" w:sz="4"/>
+              <w:bottom w:val="single" w:color="C9D1DA" w:sz="4"/>
+              <w:right w:val="single" w:color="C9D1DA" w:sz="4"/>
+            </w:tcBorders>
+            <w:tcMar>
+              <w:top w:type="dxa" w:w="70"/>
+              <w:left w:type="dxa" w:w="110"/>
+              <w:bottom w:type="dxa" w:w="70"/>
+              <w:right w:type="dxa" w:w="110"/>
+            </w:tcMar>
+          </w:tcPr>
+          <w:p>
+            <w:pPr>
+              <w:spacing w:after="0"/>
+            </w:pPr>
+            <w:r>
+              <w:rPr>
+                <w:rFonts w:ascii="Arial" w:cs="Arial" w:eastAsia="Arial" w:hAnsi="Arial"/>
+                <w:sz w:val="18"/>
+                <w:szCs w:val="18"/>
+              </w:rPr>
+              <w:t xml:space="preserve">U4</w:t>
+            </w:r>
+          </w:p>
+        </w:tc>
+      </w:tr>
+      <w:tr>
+        <w:trPr>
+          <w:cantSplit/>
+        </w:trPr>
+        <w:tc>
+          <w:tcPr>
+            <w:tcW w:type="dxa" w:w="2100"/>
+            <w:tcBorders>
+              <w:top w:val="single" w:color="C9D1DA" w:sz="4"/>
+              <w:left w:val="single" w:color="C9D1DA" w:sz="4"/>
+              <w:bottom w:val="single" w:color="C9D1DA" w:sz="4"/>
+              <w:right w:val="single" w:color="C9D1DA" w:sz="4"/>
+            </w:tcBorders>
+            <w:shd w:fill="E3EEF9" w:color="auto" w:val="clear"/>
+            <w:tcMar>
+              <w:top w:type="dxa" w:w="70"/>
+              <w:left w:type="dxa" w:w="110"/>
+              <w:bottom w:type="dxa" w:w="70"/>
+              <w:right w:type="dxa" w:w="110"/>
+            </w:tcMar>
+          </w:tcPr>
+          <w:p>
+            <w:pPr>
+              <w:spacing w:after="0"/>
+            </w:pPr>
+            <w:r>
+              <w:rPr>
+                <w:rFonts w:ascii="Arial" w:cs="Arial" w:eastAsia="Arial" w:hAnsi="Arial"/>
+                <w:sz w:val="18"/>
+                <w:szCs w:val="18"/>
+              </w:rPr>
+              <w:t xml:space="preserve">Immunisation and allergy records</w:t>
+            </w:r>
+          </w:p>
+        </w:tc>
+        <w:tc>
+          <w:tcPr>
+            <w:tcW w:type="dxa" w:w="2650"/>
+            <w:tcBorders>
+              <w:top w:val="single" w:color="C9D1DA" w:sz="4"/>
+              <w:left w:val="single" w:color="C9D1DA" w:sz="4"/>
+              <w:bottom w:val="single" w:color="C9D1DA" w:sz="4"/>
+              <w:right w:val="single" w:color="C9D1DA" w:sz="4"/>
+            </w:tcBorders>
+            <w:tcMar>
+              <w:top w:type="dxa" w:w="70"/>
+              <w:left w:type="dxa" w:w="110"/>
+              <w:bottom w:type="dxa" w:w="70"/>
+              <w:right w:type="dxa" w:w="110"/>
+            </w:tcMar>
+          </w:tcPr>
+          <w:p>
+            <w:pPr>
+              <w:spacing w:after="0"/>
+            </w:pPr>
+            <w:r>
+              <w:rPr>
+                <w:rFonts w:ascii="Arial" w:cs="Arial" w:eastAsia="Arial" w:hAnsi="Arial"/>
+                <w:sz w:val="18"/>
+                <w:szCs w:val="18"/>
+              </w:rPr>
+              <w:t xml:space="preserve">Parents upload immunisation records; allergy tracking</w:t>
+            </w:r>
+          </w:p>
+        </w:tc>
+        <w:tc>
+          <w:tcPr>
+            <w:tcW w:type="dxa" w:w="3038"/>
+            <w:tcBorders>
+              <w:top w:val="single" w:color="C9D1DA" w:sz="4"/>
+              <w:left w:val="single" w:color="C9D1DA" w:sz="4"/>
+              <w:bottom w:val="single" w:color="C9D1DA" w:sz="4"/>
+              <w:right w:val="single" w:color="C9D1DA" w:sz="4"/>
+            </w:tcBorders>
+            <w:tcMar>
+              <w:top w:type="dxa" w:w="70"/>
+              <w:left w:type="dxa" w:w="110"/>
+              <w:bottom w:type="dxa" w:w="70"/>
+              <w:right w:type="dxa" w:w="110"/>
+            </w:tcMar>
+          </w:tcPr>
+          <w:p>
+            <w:pPr>
+              <w:spacing w:after="0"/>
+            </w:pPr>
+            <w:r>
+              <w:rPr>
+                <w:rFonts w:ascii="Arial" w:cs="Arial" w:eastAsia="Arial" w:hAnsi="Arial"/>
+                <w:sz w:val="18"/>
+                <w:szCs w:val="18"/>
+              </w:rPr>
+              <w:t xml:space="preserve">Not built; no allergy data in the schema</w:t>
+            </w:r>
+          </w:p>
+        </w:tc>
+        <w:tc>
+          <w:tcPr>
+            <w:tcW w:type="dxa" w:w="1850"/>
+            <w:tcBorders>
+              <w:top w:val="single" w:color="C9D1DA" w:sz="4"/>
+              <w:left w:val="single" w:color="C9D1DA" w:sz="4"/>
+              <w:bottom w:val="single" w:color="C9D1DA" w:sz="4"/>
+              <w:right w:val="single" w:color="C9D1DA" w:sz="4"/>
+            </w:tcBorders>
+            <w:tcMar>
+              <w:top w:type="dxa" w:w="70"/>
+              <w:left w:type="dxa" w:w="110"/>
+              <w:bottom w:type="dxa" w:w="70"/>
+              <w:right w:type="dxa" w:w="110"/>
+            </w:tcMar>
+          </w:tcPr>
+          <w:p>
+            <w:pPr>
+              <w:spacing w:after="0"/>
+            </w:pPr>
+            <w:r>
+              <w:rPr>
+                <w:rFonts w:ascii="Arial" w:cs="Arial" w:eastAsia="Arial" w:hAnsi="Arial"/>
+                <w:sz w:val="18"/>
+                <w:szCs w:val="18"/>
+              </w:rPr>
+              <w:t xml:space="preserve">U4</w:t>
+            </w:r>
+          </w:p>
+        </w:tc>
+      </w:tr>
+      <w:tr>
+        <w:trPr>
+          <w:cantSplit/>
+        </w:trPr>
+        <w:tc>
+          <w:tcPr>
+            <w:tcW w:type="dxa" w:w="2100"/>
+            <w:tcBorders>
+              <w:top w:val="single" w:color="C9D1DA" w:sz="4"/>
+              <w:left w:val="single" w:color="C9D1DA" w:sz="4"/>
+              <w:bottom w:val="single" w:color="C9D1DA" w:sz="4"/>
+              <w:right w:val="single" w:color="C9D1DA" w:sz="4"/>
+            </w:tcBorders>
+            <w:shd w:fill="E3EEF9" w:color="auto" w:val="clear"/>
+            <w:tcMar>
+              <w:top w:type="dxa" w:w="70"/>
+              <w:left w:type="dxa" w:w="110"/>
+              <w:bottom w:type="dxa" w:w="70"/>
+              <w:right w:type="dxa" w:w="110"/>
+            </w:tcMar>
+          </w:tcPr>
+          <w:p>
+            <w:pPr>
+              <w:spacing w:after="0"/>
+            </w:pPr>
+            <w:r>
+              <w:rPr>
+                <w:rFonts w:ascii="Arial" w:cs="Arial" w:eastAsia="Arial" w:hAnsi="Arial"/>
+                <w:sz w:val="18"/>
+                <w:szCs w:val="18"/>
+              </w:rPr>
+              <w:t xml:space="preserve">Menus and events calendar</w:t>
+            </w:r>
+          </w:p>
+        </w:tc>
+        <w:tc>
+          <w:tcPr>
+            <w:tcW w:type="dxa" w:w="2650"/>
+            <w:tcBorders>
+              <w:top w:val="single" w:color="C9D1DA" w:sz="4"/>
+              <w:left w:val="single" w:color="C9D1DA" w:sz="4"/>
+              <w:bottom w:val="single" w:color="C9D1DA" w:sz="4"/>
+              <w:right w:val="single" w:color="C9D1DA" w:sz="4"/>
+            </w:tcBorders>
+            <w:tcMar>
+              <w:top w:type="dxa" w:w="70"/>
+              <w:left w:type="dxa" w:w="110"/>
+              <w:bottom w:type="dxa" w:w="70"/>
+              <w:right w:type="dxa" w:w="110"/>
+            </w:tcMar>
+          </w:tcPr>
+          <w:p>
+            <w:pPr>
+              <w:spacing w:after="0"/>
+            </w:pPr>
+            <w:r>
+              <w:rPr>
+                <w:rFonts w:ascii="Arial" w:cs="Arial" w:eastAsia="Arial" w:hAnsi="Arial"/>
+                <w:sz w:val="18"/>
+                <w:szCs w:val="18"/>
+              </w:rPr>
+              <w:t xml:space="preserve">Automated menu rotation; centre event calendar</w:t>
+            </w:r>
+          </w:p>
+        </w:tc>
+        <w:tc>
+          <w:tcPr>
+            <w:tcW w:type="dxa" w:w="3038"/>
+            <w:tcBorders>
+              <w:top w:val="single" w:color="C9D1DA" w:sz="4"/>
+              <w:left w:val="single" w:color="C9D1DA" w:sz="4"/>
+              <w:bottom w:val="single" w:color="C9D1DA" w:sz="4"/>
+              <w:right w:val="single" w:color="C9D1DA" w:sz="4"/>
+            </w:tcBorders>
+            <w:tcMar>
+              <w:top w:type="dxa" w:w="70"/>
+              <w:left w:type="dxa" w:w="110"/>
+              <w:bottom w:type="dxa" w:w="70"/>
+              <w:right w:type="dxa" w:w="110"/>
+            </w:tcMar>
+          </w:tcPr>
+          <w:p>
+            <w:pPr>
+              <w:spacing w:after="0"/>
+            </w:pPr>
+            <w:r>
+              <w:rPr>
+                <w:rFonts w:ascii="Arial" w:cs="Arial" w:eastAsia="Arial" w:hAnsi="Arial"/>
+                <w:sz w:val="18"/>
+                <w:szCs w:val="18"/>
+              </w:rPr>
+              <w:t xml:space="preserve">Not built</w:t>
+            </w:r>
+          </w:p>
+        </w:tc>
+        <w:tc>
+          <w:tcPr>
+            <w:tcW w:type="dxa" w:w="1850"/>
+            <w:tcBorders>
+              <w:top w:val="single" w:color="C9D1DA" w:sz="4"/>
+              <w:left w:val="single" w:color="C9D1DA" w:sz="4"/>
+              <w:bottom w:val="single" w:color="C9D1DA" w:sz="4"/>
+              <w:right w:val="single" w:color="C9D1DA" w:sz="4"/>
+            </w:tcBorders>
+            <w:tcMar>
+              <w:top w:type="dxa" w:w="70"/>
+              <w:left w:type="dxa" w:w="110"/>
+              <w:bottom w:type="dxa" w:w="70"/>
+              <w:right w:type="dxa" w:w="110"/>
+            </w:tcMar>
+          </w:tcPr>
+          <w:p>
+            <w:pPr>
+              <w:spacing w:after="0"/>
+            </w:pPr>
+            <w:r>
+              <w:rPr>
+                <w:rFonts w:ascii="Arial" w:cs="Arial" w:eastAsia="Arial" w:hAnsi="Arial"/>
+                <w:sz w:val="18"/>
+                <w:szCs w:val="18"/>
+              </w:rPr>
+              <w:t xml:space="preserve">U4</w:t>
+            </w:r>
+          </w:p>
+        </w:tc>
+      </w:tr>
+      <w:tr>
+        <w:trPr>
+          <w:cantSplit/>
+        </w:trPr>
+        <w:tc>
+          <w:tcPr>
+            <w:tcW w:type="dxa" w:w="2100"/>
+            <w:tcBorders>
+              <w:top w:val="single" w:color="C9D1DA" w:sz="4"/>
+              <w:left w:val="single" w:color="C9D1DA" w:sz="4"/>
+              <w:bottom w:val="single" w:color="C9D1DA" w:sz="4"/>
+              <w:right w:val="single" w:color="C9D1DA" w:sz="4"/>
+            </w:tcBorders>
+            <w:shd w:fill="FFF4E0" w:color="auto" w:val="clear"/>
+            <w:tcMar>
+              <w:top w:type="dxa" w:w="70"/>
+              <w:left w:type="dxa" w:w="110"/>
+              <w:bottom w:type="dxa" w:w="70"/>
+              <w:right w:type="dxa" w:w="110"/>
+            </w:tcMar>
+          </w:tcPr>
+          <w:p>
+            <w:pPr>
+              <w:spacing w:after="0"/>
+            </w:pPr>
+            <w:r>
+              <w:rPr>
+                <w:rFonts w:ascii="Arial" w:cs="Arial" w:eastAsia="Arial" w:hAnsi="Arial"/>
+                <w:sz w:val="18"/>
+                <w:szCs w:val="18"/>
+              </w:rPr>
+              <w:t xml:space="preserve">Owner analytics</w:t>
+            </w:r>
+          </w:p>
+        </w:tc>
+        <w:tc>
+          <w:tcPr>
+            <w:tcW w:type="dxa" w:w="2650"/>
+            <w:tcBorders>
+              <w:top w:val="single" w:color="C9D1DA" w:sz="4"/>
+              <w:left w:val="single" w:color="C9D1DA" w:sz="4"/>
+              <w:bottom w:val="single" w:color="C9D1DA" w:sz="4"/>
+              <w:right w:val="single" w:color="C9D1DA" w:sz="4"/>
+            </w:tcBorders>
+            <w:tcMar>
+              <w:top w:type="dxa" w:w="70"/>
+              <w:left w:type="dxa" w:w="110"/>
+              <w:bottom w:type="dxa" w:w="70"/>
+              <w:right w:type="dxa" w:w="110"/>
+            </w:tcMar>
+          </w:tcPr>
+          <w:p>
+            <w:pPr>
+              <w:spacing w:after="0"/>
+            </w:pPr>
+            <w:r>
+              <w:rPr>
+                <w:rFonts w:ascii="Arial" w:cs="Arial" w:eastAsia="Arial" w:hAnsi="Arial"/>
+                <w:sz w:val="18"/>
+                <w:szCs w:val="18"/>
+              </w:rPr>
+              <w:t xml:space="preserve">Cost, attendance and occupancy dashboards</w:t>
+            </w:r>
+          </w:p>
+        </w:tc>
+        <w:tc>
+          <w:tcPr>
+            <w:tcW w:type="dxa" w:w="3038"/>
+            <w:tcBorders>
+              <w:top w:val="single" w:color="C9D1DA" w:sz="4"/>
+              <w:left w:val="single" w:color="C9D1DA" w:sz="4"/>
+              <w:bottom w:val="single" w:color="C9D1DA" w:sz="4"/>
+              <w:right w:val="single" w:color="C9D1DA" w:sz="4"/>
+            </w:tcBorders>
+            <w:tcMar>
+              <w:top w:type="dxa" w:w="70"/>
+              <w:left w:type="dxa" w:w="110"/>
+              <w:bottom w:type="dxa" w:w="70"/>
+              <w:right w:type="dxa" w:w="110"/>
+            </w:tcMar>
+          </w:tcPr>
+          <w:p>
+            <w:pPr>
+              <w:spacing w:after="0"/>
+            </w:pPr>
+            <w:r>
+              <w:rPr>
+                <w:rFonts w:ascii="Arial" w:cs="Arial" w:eastAsia="Arial" w:hAnsi="Arial"/>
+                <w:sz w:val="18"/>
+                <w:szCs w:val="18"/>
+              </w:rPr>
+              <w:t xml:space="preserve">Basic dashboard only</w:t>
+            </w:r>
+          </w:p>
+        </w:tc>
+        <w:tc>
+          <w:tcPr>
+            <w:tcW w:type="dxa" w:w="1850"/>
+            <w:tcBorders>
+              <w:top w:val="single" w:color="C9D1DA" w:sz="4"/>
+              <w:left w:val="single" w:color="C9D1DA" w:sz="4"/>
+              <w:bottom w:val="single" w:color="C9D1DA" w:sz="4"/>
+              <w:right w:val="single" w:color="C9D1DA" w:sz="4"/>
+            </w:tcBorders>
+            <w:tcMar>
+              <w:top w:type="dxa" w:w="70"/>
+              <w:left w:type="dxa" w:w="110"/>
+              <w:bottom w:type="dxa" w:w="70"/>
+              <w:right w:type="dxa" w:w="110"/>
+            </w:tcMar>
+          </w:tcPr>
+          <w:p>
+            <w:pPr>
+              <w:spacing w:after="0"/>
+            </w:pPr>
+            <w:r>
+              <w:rPr>
+                <w:rFonts w:ascii="Arial" w:cs="Arial" w:eastAsia="Arial" w:hAnsi="Arial"/>
+                <w:sz w:val="18"/>
+                <w:szCs w:val="18"/>
+              </w:rPr>
+              <w:t xml:space="preserve">U5</w:t>
+            </w:r>
+          </w:p>
+        </w:tc>
+      </w:tr>
+      <w:tr>
+        <w:trPr>
+          <w:cantSplit/>
+        </w:trPr>
+        <w:tc>
+          <w:tcPr>
+            <w:tcW w:type="dxa" w:w="2100"/>
+            <w:tcBorders>
+              <w:top w:val="single" w:color="C9D1DA" w:sz="4"/>
+              <w:left w:val="single" w:color="C9D1DA" w:sz="4"/>
+              <w:bottom w:val="single" w:color="C9D1DA" w:sz="4"/>
+              <w:right w:val="single" w:color="C9D1DA" w:sz="4"/>
+            </w:tcBorders>
+            <w:shd w:fill="E3EEF9" w:color="auto" w:val="clear"/>
+            <w:tcMar>
+              <w:top w:type="dxa" w:w="70"/>
+              <w:left w:type="dxa" w:w="110"/>
+              <w:bottom w:type="dxa" w:w="70"/>
+              <w:right w:type="dxa" w:w="110"/>
+            </w:tcMar>
+          </w:tcPr>
+          <w:p>
+            <w:pPr>
+              <w:spacing w:after="0"/>
+            </w:pPr>
+            <w:r>
+              <w:rPr>
+                <w:rFonts w:ascii="Arial" w:cs="Arial" w:eastAsia="Arial" w:hAnsi="Arial"/>
+                <w:sz w:val="18"/>
+                <w:szCs w:val="18"/>
+              </w:rPr>
+              <w:t xml:space="preserve">Learning, programming, portfolios</w:t>
+            </w:r>
+          </w:p>
+        </w:tc>
+        <w:tc>
+          <w:tcPr>
+            <w:tcW w:type="dxa" w:w="2650"/>
+            <w:tcBorders>
+              <w:top w:val="single" w:color="C9D1DA" w:sz="4"/>
+              <w:left w:val="single" w:color="C9D1DA" w:sz="4"/>
+              <w:bottom w:val="single" w:color="C9D1DA" w:sz="4"/>
+              <w:right w:val="single" w:color="C9D1DA" w:sz="4"/>
+            </w:tcBorders>
+            <w:tcMar>
+              <w:top w:type="dxa" w:w="70"/>
+              <w:left w:type="dxa" w:w="110"/>
+              <w:bottom w:type="dxa" w:w="70"/>
+              <w:right w:type="dxa" w:w="110"/>
+            </w:tcMar>
+          </w:tcPr>
+          <w:p>
+            <w:pPr>
+              <w:spacing w:after="0"/>
+            </w:pPr>
+            <w:r>
+              <w:rPr>
+                <w:rFonts w:ascii="Arial" w:cs="Arial" w:eastAsia="Arial" w:hAnsi="Arial"/>
+                <w:sz w:val="18"/>
+                <w:szCs w:val="18"/>
+              </w:rPr>
+              <w:t xml:space="preserve">Curriculum planning, observations, learning stories, portfolios</w:t>
+            </w:r>
+          </w:p>
+        </w:tc>
+        <w:tc>
+          <w:tcPr>
+            <w:tcW w:type="dxa" w:w="3038"/>
+            <w:tcBorders>
+              <w:top w:val="single" w:color="C9D1DA" w:sz="4"/>
+              <w:left w:val="single" w:color="C9D1DA" w:sz="4"/>
+              <w:bottom w:val="single" w:color="C9D1DA" w:sz="4"/>
+              <w:right w:val="single" w:color="C9D1DA" w:sz="4"/>
+            </w:tcBorders>
+            <w:tcMar>
+              <w:top w:type="dxa" w:w="70"/>
+              <w:left w:type="dxa" w:w="110"/>
+              <w:bottom w:type="dxa" w:w="70"/>
+              <w:right w:type="dxa" w:w="110"/>
+            </w:tcMar>
+          </w:tcPr>
+          <w:p>
+            <w:pPr>
+              <w:spacing w:after="0"/>
+            </w:pPr>
+            <w:r>
+              <w:rPr>
+                <w:rFonts w:ascii="Arial" w:cs="Arial" w:eastAsia="Arial" w:hAnsi="Arial"/>
+                <w:sz w:val="18"/>
+                <w:szCs w:val="18"/>
+              </w:rPr>
+              <w:t xml:space="preserve">Was Phase 2A; moved into Phase 1 (decision 5 Oct 2026)</w:t>
+            </w:r>
+          </w:p>
+        </w:tc>
+        <w:tc>
+          <w:tcPr>
+            <w:tcW w:type="dxa" w:w="1850"/>
+            <w:tcBorders>
+              <w:top w:val="single" w:color="C9D1DA" w:sz="4"/>
+              <w:left w:val="single" w:color="C9D1DA" w:sz="4"/>
+              <w:bottom w:val="single" w:color="C9D1DA" w:sz="4"/>
+              <w:right w:val="single" w:color="C9D1DA" w:sz="4"/>
+            </w:tcBorders>
+            <w:tcMar>
+              <w:top w:type="dxa" w:w="70"/>
+              <w:left w:type="dxa" w:w="110"/>
+              <w:bottom w:type="dxa" w:w="70"/>
+              <w:right w:type="dxa" w:w="110"/>
+            </w:tcMar>
+          </w:tcPr>
+          <w:p>
+            <w:pPr>
+              <w:spacing w:after="0"/>
+            </w:pPr>
+            <w:r>
+              <w:rPr>
+                <w:rFonts w:ascii="Arial" w:cs="Arial" w:eastAsia="Arial" w:hAnsi="Arial"/>
+                <w:sz w:val="18"/>
+                <w:szCs w:val="18"/>
+              </w:rPr>
+              <w:t xml:space="preserve">U2</w:t>
+            </w:r>
+          </w:p>
+        </w:tc>
+      </w:tr>
+      <w:tr>
+        <w:trPr>
+          <w:cantSplit/>
+        </w:trPr>
+        <w:tc>
+          <w:tcPr>
+            <w:tcW w:type="dxa" w:w="2100"/>
+            <w:tcBorders>
+              <w:top w:val="single" w:color="C9D1DA" w:sz="4"/>
+              <w:left w:val="single" w:color="C9D1DA" w:sz="4"/>
+              <w:bottom w:val="single" w:color="C9D1DA" w:sz="4"/>
+              <w:right w:val="single" w:color="C9D1DA" w:sz="4"/>
+            </w:tcBorders>
+            <w:shd w:fill="EEF0F3" w:color="auto" w:val="clear"/>
+            <w:tcMar>
+              <w:top w:type="dxa" w:w="70"/>
+              <w:left w:type="dxa" w:w="110"/>
+              <w:bottom w:type="dxa" w:w="70"/>
+              <w:right w:type="dxa" w:w="110"/>
+            </w:tcMar>
+          </w:tcPr>
+          <w:p>
+            <w:pPr>
+              <w:spacing w:after="0"/>
+            </w:pPr>
+            <w:r>
+              <w:rPr>
+                <w:rFonts w:ascii="Arial" w:cs="Arial" w:eastAsia="Arial" w:hAnsi="Arial"/>
+                <w:sz w:val="18"/>
+                <w:szCs w:val="18"/>
+              </w:rPr>
+              <w:t xml:space="preserve">Enquiry CRM and waitlist</w:t>
+            </w:r>
+          </w:p>
+        </w:tc>
+        <w:tc>
+          <w:tcPr>
+            <w:tcW w:type="dxa" w:w="2650"/>
+            <w:tcBorders>
+              <w:top w:val="single" w:color="C9D1DA" w:sz="4"/>
+              <w:left w:val="single" w:color="C9D1DA" w:sz="4"/>
+              <w:bottom w:val="single" w:color="C9D1DA" w:sz="4"/>
+              <w:right w:val="single" w:color="C9D1DA" w:sz="4"/>
+            </w:tcBorders>
+            <w:tcMar>
+              <w:top w:type="dxa" w:w="70"/>
+              <w:left w:type="dxa" w:w="110"/>
+              <w:bottom w:type="dxa" w:w="70"/>
+              <w:right w:type="dxa" w:w="110"/>
+            </w:tcMar>
+          </w:tcPr>
+          <w:p>
+            <w:pPr>
+              <w:spacing w:after="0"/>
+            </w:pPr>
+            <w:r>
+              <w:rPr>
+                <w:rFonts w:ascii="Arial" w:cs="Arial" w:eastAsia="Arial" w:hAnsi="Arial"/>
+                <w:sz w:val="18"/>
+                <w:szCs w:val="18"/>
+              </w:rPr>
+              <w:t xml:space="preserve">Enquiry forms, waitlist, enrolment workflow</w:t>
+            </w:r>
+          </w:p>
+        </w:tc>
+        <w:tc>
+          <w:tcPr>
+            <w:tcW w:type="dxa" w:w="3038"/>
+            <w:tcBorders>
+              <w:top w:val="single" w:color="C9D1DA" w:sz="4"/>
+              <w:left w:val="single" w:color="C9D1DA" w:sz="4"/>
+              <w:bottom w:val="single" w:color="C9D1DA" w:sz="4"/>
+              <w:right w:val="single" w:color="C9D1DA" w:sz="4"/>
+            </w:tcBorders>
+            <w:tcMar>
+              <w:top w:type="dxa" w:w="70"/>
+              <w:left w:type="dxa" w:w="110"/>
+              <w:bottom w:type="dxa" w:w="70"/>
+              <w:right w:type="dxa" w:w="110"/>
+            </w:tcMar>
+          </w:tcPr>
+          <w:p>
+            <w:pPr>
+              <w:spacing w:after="0"/>
+            </w:pPr>
+            <w:r>
+              <w:rPr>
+                <w:rFonts w:ascii="Arial" w:cs="Arial" w:eastAsia="Arial" w:hAnsi="Arial"/>
+                <w:sz w:val="18"/>
+                <w:szCs w:val="18"/>
+              </w:rPr>
+              <w:t xml:space="preserve">Planned in Phase 2B</w:t>
+            </w:r>
+          </w:p>
+        </w:tc>
+        <w:tc>
+          <w:tcPr>
+            <w:tcW w:type="dxa" w:w="1850"/>
+            <w:tcBorders>
+              <w:top w:val="single" w:color="C9D1DA" w:sz="4"/>
+              <w:left w:val="single" w:color="C9D1DA" w:sz="4"/>
+              <w:bottom w:val="single" w:color="C9D1DA" w:sz="4"/>
+              <w:right w:val="single" w:color="C9D1DA" w:sz="4"/>
+            </w:tcBorders>
+            <w:tcMar>
+              <w:top w:type="dxa" w:w="70"/>
+              <w:left w:type="dxa" w:w="110"/>
+              <w:bottom w:type="dxa" w:w="70"/>
+              <w:right w:type="dxa" w:w="110"/>
+            </w:tcMar>
+          </w:tcPr>
+          <w:p>
+            <w:pPr>
+              <w:spacing w:after="0"/>
+            </w:pPr>
+            <w:r>
+              <w:rPr>
+                <w:rFonts w:ascii="Arial" w:cs="Arial" w:eastAsia="Arial" w:hAnsi="Arial"/>
+                <w:sz w:val="18"/>
+                <w:szCs w:val="18"/>
+              </w:rPr>
+              <w:t xml:space="preserve">Phase 2B</w:t>
+            </w:r>
+          </w:p>
+        </w:tc>
+      </w:tr>
+      <w:tr>
+        <w:trPr>
+          <w:cantSplit/>
+        </w:trPr>
+        <w:tc>
+          <w:tcPr>
+            <w:tcW w:type="dxa" w:w="2100"/>
+            <w:tcBorders>
+              <w:top w:val="single" w:color="C9D1DA" w:sz="4"/>
+              <w:left w:val="single" w:color="C9D1DA" w:sz="4"/>
+              <w:bottom w:val="single" w:color="C9D1DA" w:sz="4"/>
+              <w:right w:val="single" w:color="C9D1DA" w:sz="4"/>
+            </w:tcBorders>
+            <w:shd w:fill="EEF0F3" w:color="auto" w:val="clear"/>
+            <w:tcMar>
+              <w:top w:type="dxa" w:w="70"/>
+              <w:left w:type="dxa" w:w="110"/>
+              <w:bottom w:type="dxa" w:w="70"/>
+              <w:right w:type="dxa" w:w="110"/>
+            </w:tcMar>
+          </w:tcPr>
+          <w:p>
+            <w:pPr>
+              <w:spacing w:after="0"/>
+            </w:pPr>
+            <w:r>
+              <w:rPr>
+                <w:rFonts w:ascii="Arial" w:cs="Arial" w:eastAsia="Arial" w:hAnsi="Arial"/>
+                <w:sz w:val="18"/>
+                <w:szCs w:val="18"/>
+              </w:rPr>
+              <w:t xml:space="preserve">Staff timesheets, ratios, rostering</w:t>
+            </w:r>
+          </w:p>
+        </w:tc>
+        <w:tc>
+          <w:tcPr>
+            <w:tcW w:type="dxa" w:w="2650"/>
+            <w:tcBorders>
+              <w:top w:val="single" w:color="C9D1DA" w:sz="4"/>
+              <w:left w:val="single" w:color="C9D1DA" w:sz="4"/>
+              <w:bottom w:val="single" w:color="C9D1DA" w:sz="4"/>
+              <w:right w:val="single" w:color="C9D1DA" w:sz="4"/>
+            </w:tcBorders>
+            <w:tcMar>
+              <w:top w:type="dxa" w:w="70"/>
+              <w:left w:type="dxa" w:w="110"/>
+              <w:bottom w:type="dxa" w:w="70"/>
+              <w:right w:type="dxa" w:w="110"/>
+            </w:tcMar>
+          </w:tcPr>
+          <w:p>
+            <w:pPr>
+              <w:spacing w:after="0"/>
+            </w:pPr>
+            <w:r>
+              <w:rPr>
+                <w:rFonts w:ascii="Arial" w:cs="Arial" w:eastAsia="Arial" w:hAnsi="Arial"/>
+                <w:sz w:val="18"/>
+                <w:szCs w:val="18"/>
+              </w:rPr>
+              <w:t xml:space="preserve">Timesheets, ratio alerts, AI roster forecasting, vacant-shift bidding</w:t>
+            </w:r>
+          </w:p>
+        </w:tc>
+        <w:tc>
+          <w:tcPr>
+            <w:tcW w:type="dxa" w:w="3038"/>
+            <w:tcBorders>
+              <w:top w:val="single" w:color="C9D1DA" w:sz="4"/>
+              <w:left w:val="single" w:color="C9D1DA" w:sz="4"/>
+              <w:bottom w:val="single" w:color="C9D1DA" w:sz="4"/>
+              <w:right w:val="single" w:color="C9D1DA" w:sz="4"/>
+            </w:tcBorders>
+            <w:tcMar>
+              <w:top w:type="dxa" w:w="70"/>
+              <w:left w:type="dxa" w:w="110"/>
+              <w:bottom w:type="dxa" w:w="70"/>
+              <w:right w:type="dxa" w:w="110"/>
+            </w:tcMar>
+          </w:tcPr>
+          <w:p>
+            <w:pPr>
+              <w:spacing w:after="0"/>
+            </w:pPr>
+            <w:r>
+              <w:rPr>
+                <w:rFonts w:ascii="Arial" w:cs="Arial" w:eastAsia="Arial" w:hAnsi="Arial"/>
+                <w:sz w:val="18"/>
+                <w:szCs w:val="18"/>
+              </w:rPr>
+              <w:t xml:space="preserve">Ratios and rostering planned in 2C/2D; timesheets and shift bidding not in the BRD</w:t>
+            </w:r>
+          </w:p>
+        </w:tc>
+        <w:tc>
+          <w:tcPr>
+            <w:tcW w:type="dxa" w:w="1850"/>
+            <w:tcBorders>
+              <w:top w:val="single" w:color="C9D1DA" w:sz="4"/>
+              <w:left w:val="single" w:color="C9D1DA" w:sz="4"/>
+              <w:bottom w:val="single" w:color="C9D1DA" w:sz="4"/>
+              <w:right w:val="single" w:color="C9D1DA" w:sz="4"/>
+            </w:tcBorders>
+            <w:tcMar>
+              <w:top w:type="dxa" w:w="70"/>
+              <w:left w:type="dxa" w:w="110"/>
+              <w:bottom w:type="dxa" w:w="70"/>
+              <w:right w:type="dxa" w:w="110"/>
+            </w:tcMar>
+          </w:tcPr>
+          <w:p>
+            <w:pPr>
+              <w:spacing w:after="0"/>
+            </w:pPr>
+            <w:r>
+              <w:rPr>
+                <w:rFonts w:ascii="Arial" w:cs="Arial" w:eastAsia="Arial" w:hAnsi="Arial"/>
+                <w:sz w:val="18"/>
+                <w:szCs w:val="18"/>
+              </w:rPr>
+              <w:t xml:space="preserve">Phase 2C/2D</w:t>
+            </w:r>
+          </w:p>
+        </w:tc>
+      </w:tr>
+      <w:tr>
+        <w:trPr>
+          <w:cantSplit/>
+        </w:trPr>
+        <w:tc>
+          <w:tcPr>
+            <w:tcW w:type="dxa" w:w="2100"/>
+            <w:tcBorders>
+              <w:top w:val="single" w:color="C9D1DA" w:sz="4"/>
+              <w:left w:val="single" w:color="C9D1DA" w:sz="4"/>
+              <w:bottom w:val="single" w:color="C9D1DA" w:sz="4"/>
+              <w:right w:val="single" w:color="C9D1DA" w:sz="4"/>
+            </w:tcBorders>
+            <w:shd w:fill="EEF0F3" w:color="auto" w:val="clear"/>
+            <w:tcMar>
+              <w:top w:type="dxa" w:w="70"/>
+              <w:left w:type="dxa" w:w="110"/>
+              <w:bottom w:type="dxa" w:w="70"/>
+              <w:right w:type="dxa" w:w="110"/>
+            </w:tcMar>
+          </w:tcPr>
+          <w:p>
+            <w:pPr>
+              <w:spacing w:after="0"/>
+            </w:pPr>
+            <w:r>
+              <w:rPr>
+                <w:rFonts w:ascii="Arial" w:cs="Arial" w:eastAsia="Arial" w:hAnsi="Arial"/>
+                <w:sz w:val="18"/>
+                <w:szCs w:val="18"/>
+              </w:rPr>
+              <w:t xml:space="preserve">Compliance tools</w:t>
+            </w:r>
+          </w:p>
+        </w:tc>
+        <w:tc>
+          <w:tcPr>
+            <w:tcW w:type="dxa" w:w="2650"/>
+            <w:tcBorders>
+              <w:top w:val="single" w:color="C9D1DA" w:sz="4"/>
+              <w:left w:val="single" w:color="C9D1DA" w:sz="4"/>
+              <w:bottom w:val="single" w:color="C9D1DA" w:sz="4"/>
+              <w:right w:val="single" w:color="C9D1DA" w:sz="4"/>
+            </w:tcBorders>
+            <w:tcMar>
+              <w:top w:type="dxa" w:w="70"/>
+              <w:left w:type="dxa" w:w="110"/>
+              <w:bottom w:type="dxa" w:w="70"/>
+              <w:right w:type="dxa" w:w="110"/>
+            </w:tcMar>
+          </w:tcPr>
+          <w:p>
+            <w:pPr>
+              <w:spacing w:after="0"/>
+            </w:pPr>
+            <w:r>
+              <w:rPr>
+                <w:rFonts w:ascii="Arial" w:cs="Arial" w:eastAsia="Arial" w:hAnsi="Arial"/>
+                <w:sz w:val="18"/>
+                <w:szCs w:val="18"/>
+              </w:rPr>
+              <w:t xml:space="preserve">Hazards, maintenance, QIP, daily checklists, responsible-person log</w:t>
+            </w:r>
+          </w:p>
+        </w:tc>
+        <w:tc>
+          <w:tcPr>
+            <w:tcW w:type="dxa" w:w="3038"/>
+            <w:tcBorders>
+              <w:top w:val="single" w:color="C9D1DA" w:sz="4"/>
+              <w:left w:val="single" w:color="C9D1DA" w:sz="4"/>
+              <w:bottom w:val="single" w:color="C9D1DA" w:sz="4"/>
+              <w:right w:val="single" w:color="C9D1DA" w:sz="4"/>
+            </w:tcBorders>
+            <w:tcMar>
+              <w:top w:type="dxa" w:w="70"/>
+              <w:left w:type="dxa" w:w="110"/>
+              <w:bottom w:type="dxa" w:w="70"/>
+              <w:right w:type="dxa" w:w="110"/>
+            </w:tcMar>
+          </w:tcPr>
+          <w:p>
+            <w:pPr>
+              <w:spacing w:after="0"/>
+            </w:pPr>
+            <w:r>
+              <w:rPr>
+                <w:rFonts w:ascii="Arial" w:cs="Arial" w:eastAsia="Arial" w:hAnsi="Arial"/>
+                <w:sz w:val="18"/>
+                <w:szCs w:val="18"/>
+              </w:rPr>
+              <w:t xml:space="preserve">Added as BRD v2.2 §13B (approved)</w:t>
+            </w:r>
+          </w:p>
+        </w:tc>
+        <w:tc>
+          <w:tcPr>
+            <w:tcW w:type="dxa" w:w="1850"/>
+            <w:tcBorders>
+              <w:top w:val="single" w:color="C9D1DA" w:sz="4"/>
+              <w:left w:val="single" w:color="C9D1DA" w:sz="4"/>
+              <w:bottom w:val="single" w:color="C9D1DA" w:sz="4"/>
+              <w:right w:val="single" w:color="C9D1DA" w:sz="4"/>
+            </w:tcBorders>
+            <w:tcMar>
+              <w:top w:type="dxa" w:w="70"/>
+              <w:left w:type="dxa" w:w="110"/>
+              <w:bottom w:type="dxa" w:w="70"/>
+              <w:right w:type="dxa" w:w="110"/>
+            </w:tcMar>
+          </w:tcPr>
+          <w:p>
+            <w:pPr>
+              <w:spacing w:after="0"/>
+            </w:pPr>
+            <w:r>
+              <w:rPr>
+                <w:rFonts w:ascii="Arial" w:cs="Arial" w:eastAsia="Arial" w:hAnsi="Arial"/>
+                <w:sz w:val="18"/>
+                <w:szCs w:val="18"/>
+              </w:rPr>
+              <w:t xml:space="preserve">Phase 2E</w:t>
+            </w:r>
+          </w:p>
+        </w:tc>
+      </w:tr>
+      <w:tr>
+        <w:trPr>
+          <w:cantSplit/>
+        </w:trPr>
+        <w:tc>
+          <w:tcPr>
+            <w:tcW w:type="dxa" w:w="2100"/>
+            <w:tcBorders>
+              <w:top w:val="single" w:color="C9D1DA" w:sz="4"/>
+              <w:left w:val="single" w:color="C9D1DA" w:sz="4"/>
+              <w:bottom w:val="single" w:color="C9D1DA" w:sz="4"/>
+              <w:right w:val="single" w:color="C9D1DA" w:sz="4"/>
+            </w:tcBorders>
+            <w:shd w:fill="EEF0F3" w:color="auto" w:val="clear"/>
+            <w:tcMar>
+              <w:top w:type="dxa" w:w="70"/>
+              <w:left w:type="dxa" w:w="110"/>
+              <w:bottom w:type="dxa" w:w="70"/>
+              <w:right w:type="dxa" w:w="110"/>
+            </w:tcMar>
+          </w:tcPr>
+          <w:p>
+            <w:pPr>
+              <w:spacing w:after="0"/>
+            </w:pPr>
+            <w:r>
+              <w:rPr>
+                <w:rFonts w:ascii="Arial" w:cs="Arial" w:eastAsia="Arial" w:hAnsi="Arial"/>
+                <w:sz w:val="18"/>
+                <w:szCs w:val="18"/>
+              </w:rPr>
+              <w:t xml:space="preserve">HR and payroll</w:t>
+            </w:r>
+          </w:p>
+        </w:tc>
+        <w:tc>
+          <w:tcPr>
+            <w:tcW w:type="dxa" w:w="2650"/>
+            <w:tcBorders>
+              <w:top w:val="single" w:color="C9D1DA" w:sz="4"/>
+              <w:left w:val="single" w:color="C9D1DA" w:sz="4"/>
+              <w:bottom w:val="single" w:color="C9D1DA" w:sz="4"/>
+              <w:right w:val="single" w:color="C9D1DA" w:sz="4"/>
+            </w:tcBorders>
+            <w:tcMar>
+              <w:top w:type="dxa" w:w="70"/>
+              <w:left w:type="dxa" w:w="110"/>
+              <w:bottom w:type="dxa" w:w="70"/>
+              <w:right w:type="dxa" w:w="110"/>
+            </w:tcMar>
+          </w:tcPr>
+          <w:p>
+            <w:pPr>
+              <w:spacing w:after="0"/>
+            </w:pPr>
+            <w:r>
+              <w:rPr>
+                <w:rFonts w:ascii="Arial" w:cs="Arial" w:eastAsia="Arial" w:hAnsi="Arial"/>
+                <w:sz w:val="18"/>
+                <w:szCs w:val="18"/>
+              </w:rPr>
+              <w:t xml:space="preserve">Recruitment (SEEK), contracts, leave, payroll</w:t>
+            </w:r>
+          </w:p>
+        </w:tc>
+        <w:tc>
+          <w:tcPr>
+            <w:tcW w:type="dxa" w:w="3038"/>
+            <w:tcBorders>
+              <w:top w:val="single" w:color="C9D1DA" w:sz="4"/>
+              <w:left w:val="single" w:color="C9D1DA" w:sz="4"/>
+              <w:bottom w:val="single" w:color="C9D1DA" w:sz="4"/>
+              <w:right w:val="single" w:color="C9D1DA" w:sz="4"/>
+            </w:tcBorders>
+            <w:tcMar>
+              <w:top w:type="dxa" w:w="70"/>
+              <w:left w:type="dxa" w:w="110"/>
+              <w:bottom w:type="dxa" w:w="70"/>
+              <w:right w:type="dxa" w:w="110"/>
+            </w:tcMar>
+          </w:tcPr>
+          <w:p>
+            <w:pPr>
+              <w:spacing w:after="0"/>
+            </w:pPr>
+            <w:r>
+              <w:rPr>
+                <w:rFonts w:ascii="Arial" w:cs="Arial" w:eastAsia="Arial" w:hAnsi="Arial"/>
+                <w:sz w:val="18"/>
+                <w:szCs w:val="18"/>
+              </w:rPr>
+              <w:t xml:space="preserve">Integrate, don’t build (approved; BRD v2.2 §13B.4)</w:t>
+            </w:r>
+          </w:p>
+        </w:tc>
+        <w:tc>
+          <w:tcPr>
+            <w:tcW w:type="dxa" w:w="1850"/>
+            <w:tcBorders>
+              <w:top w:val="single" w:color="C9D1DA" w:sz="4"/>
+              <w:left w:val="single" w:color="C9D1DA" w:sz="4"/>
+              <w:bottom w:val="single" w:color="C9D1DA" w:sz="4"/>
+              <w:right w:val="single" w:color="C9D1DA" w:sz="4"/>
+            </w:tcBorders>
+            <w:tcMar>
+              <w:top w:type="dxa" w:w="70"/>
+              <w:left w:type="dxa" w:w="110"/>
+              <w:bottom w:type="dxa" w:w="70"/>
+              <w:right w:type="dxa" w:w="110"/>
+            </w:tcMar>
+          </w:tcPr>
+          <w:p>
+            <w:pPr>
+              <w:spacing w:after="0"/>
+            </w:pPr>
+            <w:r>
+              <w:rPr>
+                <w:rFonts w:ascii="Arial" w:cs="Arial" w:eastAsia="Arial" w:hAnsi="Arial"/>
+                <w:sz w:val="18"/>
+                <w:szCs w:val="18"/>
+              </w:rPr>
+              <w:t xml:space="preserve">Phase 3</w:t>
+            </w:r>
+          </w:p>
+        </w:tc>
+      </w:tr>
+      <w:tr>
+        <w:trPr>
+          <w:cantSplit/>
+        </w:trPr>
+        <w:tc>
+          <w:tcPr>
+            <w:tcW w:type="dxa" w:w="2100"/>
+            <w:tcBorders>
+              <w:top w:val="single" w:color="C9D1DA" w:sz="4"/>
+              <w:left w:val="single" w:color="C9D1DA" w:sz="4"/>
+              <w:bottom w:val="single" w:color="C9D1DA" w:sz="4"/>
+              <w:right w:val="single" w:color="C9D1DA" w:sz="4"/>
+            </w:tcBorders>
+            <w:shd w:fill="EEF0F3" w:color="auto" w:val="clear"/>
+            <w:tcMar>
+              <w:top w:type="dxa" w:w="70"/>
+              <w:left w:type="dxa" w:w="110"/>
+              <w:bottom w:type="dxa" w:w="70"/>
+              <w:right w:type="dxa" w:w="110"/>
+            </w:tcMar>
+          </w:tcPr>
+          <w:p>
+            <w:pPr>
+              <w:spacing w:after="0"/>
+            </w:pPr>
+            <w:r>
+              <w:rPr>
+                <w:rFonts w:ascii="Arial" w:cs="Arial" w:eastAsia="Arial" w:hAnsi="Arial"/>
+                <w:sz w:val="18"/>
+                <w:szCs w:val="18"/>
+              </w:rPr>
+              <w:t xml:space="preserve">Multi-centre head-office view</w:t>
+            </w:r>
+          </w:p>
+        </w:tc>
+        <w:tc>
+          <w:tcPr>
+            <w:tcW w:type="dxa" w:w="2650"/>
+            <w:tcBorders>
+              <w:top w:val="single" w:color="C9D1DA" w:sz="4"/>
+              <w:left w:val="single" w:color="C9D1DA" w:sz="4"/>
+              <w:bottom w:val="single" w:color="C9D1DA" w:sz="4"/>
+              <w:right w:val="single" w:color="C9D1DA" w:sz="4"/>
+            </w:tcBorders>
+            <w:tcMar>
+              <w:top w:type="dxa" w:w="70"/>
+              <w:left w:type="dxa" w:w="110"/>
+              <w:bottom w:type="dxa" w:w="70"/>
+              <w:right w:type="dxa" w:w="110"/>
+            </w:tcMar>
+          </w:tcPr>
+          <w:p>
+            <w:pPr>
+              <w:spacing w:after="0"/>
+            </w:pPr>
+            <w:r>
+              <w:rPr>
+                <w:rFonts w:ascii="Arial" w:cs="Arial" w:eastAsia="Arial" w:hAnsi="Arial"/>
+                <w:sz w:val="18"/>
+                <w:szCs w:val="18"/>
+              </w:rPr>
+              <w:t xml:space="preserve">OWNA HQ: cross-centre reporting and bulk billing</w:t>
+            </w:r>
+          </w:p>
+        </w:tc>
+        <w:tc>
+          <w:tcPr>
+            <w:tcW w:type="dxa" w:w="3038"/>
+            <w:tcBorders>
+              <w:top w:val="single" w:color="C9D1DA" w:sz="4"/>
+              <w:left w:val="single" w:color="C9D1DA" w:sz="4"/>
+              <w:bottom w:val="single" w:color="C9D1DA" w:sz="4"/>
+              <w:right w:val="single" w:color="C9D1DA" w:sz="4"/>
+            </w:tcBorders>
+            <w:tcMar>
+              <w:top w:type="dxa" w:w="70"/>
+              <w:left w:type="dxa" w:w="110"/>
+              <w:bottom w:type="dxa" w:w="70"/>
+              <w:right w:type="dxa" w:w="110"/>
+            </w:tcMar>
+          </w:tcPr>
+          <w:p>
+            <w:pPr>
+              <w:spacing w:after="0"/>
+            </w:pPr>
+            <w:r>
+              <w:rPr>
+                <w:rFonts w:ascii="Arial" w:cs="Arial" w:eastAsia="Arial" w:hAnsi="Arial"/>
+                <w:sz w:val="18"/>
+                <w:szCs w:val="18"/>
+              </w:rPr>
+              <w:t xml:space="preserve">Data model supports it; no UI</w:t>
+            </w:r>
+          </w:p>
+        </w:tc>
+        <w:tc>
+          <w:tcPr>
+            <w:tcW w:type="dxa" w:w="1850"/>
+            <w:tcBorders>
+              <w:top w:val="single" w:color="C9D1DA" w:sz="4"/>
+              <w:left w:val="single" w:color="C9D1DA" w:sz="4"/>
+              <w:bottom w:val="single" w:color="C9D1DA" w:sz="4"/>
+              <w:right w:val="single" w:color="C9D1DA" w:sz="4"/>
+            </w:tcBorders>
+            <w:tcMar>
+              <w:top w:type="dxa" w:w="70"/>
+              <w:left w:type="dxa" w:w="110"/>
+              <w:bottom w:type="dxa" w:w="70"/>
+              <w:right w:type="dxa" w:w="110"/>
+            </w:tcMar>
+          </w:tcPr>
+          <w:p>
+            <w:pPr>
+              <w:spacing w:after="0"/>
+            </w:pPr>
+            <w:r>
+              <w:rPr>
+                <w:rFonts w:ascii="Arial" w:cs="Arial" w:eastAsia="Arial" w:hAnsi="Arial"/>
+                <w:sz w:val="18"/>
+                <w:szCs w:val="18"/>
+              </w:rPr>
+              <w:t xml:space="preserve">Phase 3</w:t>
+            </w:r>
+          </w:p>
+        </w:tc>
+      </w:tr>
+      <w:tr>
+        <w:trPr>
+          <w:cantSplit/>
+        </w:trPr>
+        <w:tc>
+          <w:tcPr>
+            <w:tcW w:type="dxa" w:w="2100"/>
+            <w:tcBorders>
+              <w:top w:val="single" w:color="C9D1DA" w:sz="4"/>
+              <w:left w:val="single" w:color="C9D1DA" w:sz="4"/>
+              <w:bottom w:val="single" w:color="C9D1DA" w:sz="4"/>
+              <w:right w:val="single" w:color="C9D1DA" w:sz="4"/>
+            </w:tcBorders>
+            <w:shd w:fill="EEF0F3" w:color="auto" w:val="clear"/>
+            <w:tcMar>
+              <w:top w:type="dxa" w:w="70"/>
+              <w:left w:type="dxa" w:w="110"/>
+              <w:bottom w:type="dxa" w:w="70"/>
+              <w:right w:type="dxa" w:w="110"/>
+            </w:tcMar>
+          </w:tcPr>
+          <w:p>
+            <w:pPr>
+              <w:spacing w:after="0"/>
+            </w:pPr>
+            <w:r>
+              <w:rPr>
+                <w:rFonts w:ascii="Arial" w:cs="Arial" w:eastAsia="Arial" w:hAnsi="Arial"/>
+                <w:sz w:val="18"/>
+                <w:szCs w:val="18"/>
+              </w:rPr>
+              <w:t xml:space="preserve">Multilingual</w:t>
+            </w:r>
+          </w:p>
+        </w:tc>
+        <w:tc>
+          <w:tcPr>
+            <w:tcW w:type="dxa" w:w="2650"/>
+            <w:tcBorders>
+              <w:top w:val="single" w:color="C9D1DA" w:sz="4"/>
+              <w:left w:val="single" w:color="C9D1DA" w:sz="4"/>
+              <w:bottom w:val="single" w:color="C9D1DA" w:sz="4"/>
+              <w:right w:val="single" w:color="C9D1DA" w:sz="4"/>
+            </w:tcBorders>
+            <w:tcMar>
+              <w:top w:type="dxa" w:w="70"/>
+              <w:left w:type="dxa" w:w="110"/>
+              <w:bottom w:type="dxa" w:w="70"/>
+              <w:right w:type="dxa" w:w="110"/>
+            </w:tcMar>
+          </w:tcPr>
+          <w:p>
+            <w:pPr>
+              <w:spacing w:after="0"/>
+            </w:pPr>
+            <w:r>
+              <w:rPr>
+                <w:rFonts w:ascii="Arial" w:cs="Arial" w:eastAsia="Arial" w:hAnsi="Arial"/>
+                <w:sz w:val="18"/>
+                <w:szCs w:val="18"/>
+              </w:rPr>
+              <w:t xml:space="preserve">Six languages</w:t>
+            </w:r>
+          </w:p>
+        </w:tc>
+        <w:tc>
+          <w:tcPr>
+            <w:tcW w:type="dxa" w:w="3038"/>
+            <w:tcBorders>
+              <w:top w:val="single" w:color="C9D1DA" w:sz="4"/>
+              <w:left w:val="single" w:color="C9D1DA" w:sz="4"/>
+              <w:bottom w:val="single" w:color="C9D1DA" w:sz="4"/>
+              <w:right w:val="single" w:color="C9D1DA" w:sz="4"/>
+            </w:tcBorders>
+            <w:tcMar>
+              <w:top w:type="dxa" w:w="70"/>
+              <w:left w:type="dxa" w:w="110"/>
+              <w:bottom w:type="dxa" w:w="70"/>
+              <w:right w:type="dxa" w:w="110"/>
+            </w:tcMar>
+          </w:tcPr>
+          <w:p>
+            <w:pPr>
+              <w:spacing w:after="0"/>
+            </w:pPr>
+            <w:r>
+              <w:rPr>
+                <w:rFonts w:ascii="Arial" w:cs="Arial" w:eastAsia="Arial" w:hAnsi="Arial"/>
+                <w:sz w:val="18"/>
+                <w:szCs w:val="18"/>
+              </w:rPr>
+              <w:t xml:space="preserve">English only</w:t>
+            </w:r>
+          </w:p>
+        </w:tc>
+        <w:tc>
+          <w:tcPr>
+            <w:tcW w:type="dxa" w:w="1850"/>
+            <w:tcBorders>
+              <w:top w:val="single" w:color="C9D1DA" w:sz="4"/>
+              <w:left w:val="single" w:color="C9D1DA" w:sz="4"/>
+              <w:bottom w:val="single" w:color="C9D1DA" w:sz="4"/>
+              <w:right w:val="single" w:color="C9D1DA" w:sz="4"/>
+            </w:tcBorders>
+            <w:tcMar>
+              <w:top w:type="dxa" w:w="70"/>
+              <w:left w:type="dxa" w:w="110"/>
+              <w:bottom w:type="dxa" w:w="70"/>
+              <w:right w:type="dxa" w:w="110"/>
+            </w:tcMar>
+          </w:tcPr>
+          <w:p>
+            <w:pPr>
+              <w:spacing w:after="0"/>
+            </w:pPr>
+            <w:r>
+              <w:rPr>
+                <w:rFonts w:ascii="Arial" w:cs="Arial" w:eastAsia="Arial" w:hAnsi="Arial"/>
+                <w:sz w:val="18"/>
+                <w:szCs w:val="18"/>
+              </w:rPr>
+              <w:t xml:space="preserve">Phase 3</w:t>
+            </w:r>
+          </w:p>
+        </w:tc>
+      </w:tr>
+      <w:tr>
+        <w:trPr>
+          <w:cantSplit/>
+        </w:trPr>
+        <w:tc>
+          <w:tcPr>
+            <w:tcW w:type="dxa" w:w="2100"/>
+            <w:tcBorders>
+              <w:top w:val="single" w:color="C9D1DA" w:sz="4"/>
+              <w:left w:val="single" w:color="C9D1DA" w:sz="4"/>
+              <w:bottom w:val="single" w:color="C9D1DA" w:sz="4"/>
+              <w:right w:val="single" w:color="C9D1DA" w:sz="4"/>
+            </w:tcBorders>
+            <w:shd w:fill="EEF0F3" w:color="auto" w:val="clear"/>
+            <w:tcMar>
+              <w:top w:type="dxa" w:w="70"/>
+              <w:left w:type="dxa" w:w="110"/>
+              <w:bottom w:type="dxa" w:w="70"/>
+              <w:right w:type="dxa" w:w="110"/>
+            </w:tcMar>
+          </w:tcPr>
+          <w:p>
+            <w:pPr>
+              <w:spacing w:after="0"/>
+            </w:pPr>
+            <w:r>
+              <w:rPr>
+                <w:rFonts w:ascii="Arial" w:cs="Arial" w:eastAsia="Arial" w:hAnsi="Arial"/>
+                <w:sz w:val="18"/>
+                <w:szCs w:val="18"/>
+              </w:rPr>
+              <w:t xml:space="preserve">Public API</w:t>
+            </w:r>
+          </w:p>
+        </w:tc>
+        <w:tc>
+          <w:tcPr>
+            <w:tcW w:type="dxa" w:w="2650"/>
+            <w:tcBorders>
+              <w:top w:val="single" w:color="C9D1DA" w:sz="4"/>
+              <w:left w:val="single" w:color="C9D1DA" w:sz="4"/>
+              <w:bottom w:val="single" w:color="C9D1DA" w:sz="4"/>
+              <w:right w:val="single" w:color="C9D1DA" w:sz="4"/>
+            </w:tcBorders>
+            <w:tcMar>
+              <w:top w:type="dxa" w:w="70"/>
+              <w:left w:type="dxa" w:w="110"/>
+              <w:bottom w:type="dxa" w:w="70"/>
+              <w:right w:type="dxa" w:w="110"/>
+            </w:tcMar>
+          </w:tcPr>
+          <w:p>
+            <w:pPr>
+              <w:spacing w:after="0"/>
+            </w:pPr>
+            <w:r>
+              <w:rPr>
+                <w:rFonts w:ascii="Arial" w:cs="Arial" w:eastAsia="Arial" w:hAnsi="Arial"/>
+                <w:sz w:val="18"/>
+                <w:szCs w:val="18"/>
+              </w:rPr>
+              <w:t xml:space="preserve">Available</w:t>
+            </w:r>
+          </w:p>
+        </w:tc>
+        <w:tc>
+          <w:tcPr>
+            <w:tcW w:type="dxa" w:w="3038"/>
+            <w:tcBorders>
+              <w:top w:val="single" w:color="C9D1DA" w:sz="4"/>
+              <w:left w:val="single" w:color="C9D1DA" w:sz="4"/>
+              <w:bottom w:val="single" w:color="C9D1DA" w:sz="4"/>
+              <w:right w:val="single" w:color="C9D1DA" w:sz="4"/>
+            </w:tcBorders>
+            <w:tcMar>
+              <w:top w:type="dxa" w:w="70"/>
+              <w:left w:type="dxa" w:w="110"/>
+              <w:bottom w:type="dxa" w:w="70"/>
+              <w:right w:type="dxa" w:w="110"/>
+            </w:tcMar>
+          </w:tcPr>
+          <w:p>
+            <w:pPr>
+              <w:spacing w:after="0"/>
+            </w:pPr>
+            <w:r>
+              <w:rPr>
+                <w:rFonts w:ascii="Arial" w:cs="Arial" w:eastAsia="Arial" w:hAnsi="Arial"/>
+                <w:sz w:val="18"/>
+                <w:szCs w:val="18"/>
+              </w:rPr>
+              <w:t xml:space="preserve">Not built</w:t>
+            </w:r>
+          </w:p>
+        </w:tc>
+        <w:tc>
+          <w:tcPr>
+            <w:tcW w:type="dxa" w:w="1850"/>
+            <w:tcBorders>
+              <w:top w:val="single" w:color="C9D1DA" w:sz="4"/>
+              <w:left w:val="single" w:color="C9D1DA" w:sz="4"/>
+              <w:bottom w:val="single" w:color="C9D1DA" w:sz="4"/>
+              <w:right w:val="single" w:color="C9D1DA" w:sz="4"/>
+            </w:tcBorders>
+            <w:tcMar>
+              <w:top w:type="dxa" w:w="70"/>
+              <w:left w:type="dxa" w:w="110"/>
+              <w:bottom w:type="dxa" w:w="70"/>
+              <w:right w:type="dxa" w:w="110"/>
+            </w:tcMar>
+          </w:tcPr>
+          <w:p>
+            <w:pPr>
+              <w:spacing w:after="0"/>
+            </w:pPr>
+            <w:r>
+              <w:rPr>
+                <w:rFonts w:ascii="Arial" w:cs="Arial" w:eastAsia="Arial" w:hAnsi="Arial"/>
+                <w:sz w:val="18"/>
+                <w:szCs w:val="18"/>
+              </w:rPr>
+              <w:t xml:space="preserve">Phase 3</w:t>
+            </w:r>
+          </w:p>
+        </w:tc>
+      </w:tr>
+      <w:tr>
+        <w:trPr>
+          <w:cantSplit/>
+        </w:trPr>
+        <w:tc>
+          <w:tcPr>
+            <w:tcW w:type="dxa" w:w="2100"/>
+            <w:tcBorders>
+              <w:top w:val="single" w:color="C9D1DA" w:sz="4"/>
+              <w:left w:val="single" w:color="C9D1DA" w:sz="4"/>
+              <w:bottom w:val="single" w:color="C9D1DA" w:sz="4"/>
+              <w:right w:val="single" w:color="C9D1DA" w:sz="4"/>
+            </w:tcBorders>
+            <w:shd w:fill="E6F4EA" w:color="auto" w:val="clear"/>
+            <w:tcMar>
+              <w:top w:type="dxa" w:w="70"/>
+              <w:left w:type="dxa" w:w="110"/>
+              <w:bottom w:type="dxa" w:w="70"/>
+              <w:right w:type="dxa" w:w="110"/>
+            </w:tcMar>
+          </w:tcPr>
+          <w:p>
+            <w:pPr>
+              <w:spacing w:after="0"/>
+            </w:pPr>
+            <w:r>
+              <w:rPr>
+                <w:rFonts w:ascii="Arial" w:cs="Arial" w:eastAsia="Arial" w:hAnsi="Arial"/>
+                <w:sz w:val="18"/>
+                <w:szCs w:val="18"/>
+              </w:rPr>
+              <w:t xml:space="preserve">Marketplace</w:t>
+            </w:r>
+          </w:p>
+        </w:tc>
+        <w:tc>
+          <w:tcPr>
+            <w:tcW w:type="dxa" w:w="2650"/>
+            <w:tcBorders>
+              <w:top w:val="single" w:color="C9D1DA" w:sz="4"/>
+              <w:left w:val="single" w:color="C9D1DA" w:sz="4"/>
+              <w:bottom w:val="single" w:color="C9D1DA" w:sz="4"/>
+              <w:right w:val="single" w:color="C9D1DA" w:sz="4"/>
+            </w:tcBorders>
+            <w:tcMar>
+              <w:top w:type="dxa" w:w="70"/>
+              <w:left w:type="dxa" w:w="110"/>
+              <w:bottom w:type="dxa" w:w="70"/>
+              <w:right w:type="dxa" w:w="110"/>
+            </w:tcMar>
+          </w:tcPr>
+          <w:p>
+            <w:pPr>
+              <w:spacing w:after="0"/>
+            </w:pPr>
+            <w:r>
+              <w:rPr>
+                <w:rFonts w:ascii="Arial" w:cs="Arial" w:eastAsia="Arial" w:hAnsi="Arial"/>
+                <w:sz w:val="18"/>
+                <w:szCs w:val="18"/>
+              </w:rPr>
+              <w:t xml:space="preserve">Promoted on the home screen</w:t>
+            </w:r>
+          </w:p>
+        </w:tc>
+        <w:tc>
+          <w:tcPr>
+            <w:tcW w:type="dxa" w:w="3038"/>
+            <w:tcBorders>
+              <w:top w:val="single" w:color="C9D1DA" w:sz="4"/>
+              <w:left w:val="single" w:color="C9D1DA" w:sz="4"/>
+              <w:bottom w:val="single" w:color="C9D1DA" w:sz="4"/>
+              <w:right w:val="single" w:color="C9D1DA" w:sz="4"/>
+            </w:tcBorders>
+            <w:tcMar>
+              <w:top w:type="dxa" w:w="70"/>
+              <w:left w:type="dxa" w:w="110"/>
+              <w:bottom w:type="dxa" w:w="70"/>
+              <w:right w:type="dxa" w:w="110"/>
+            </w:tcMar>
+          </w:tcPr>
+          <w:p>
+            <w:pPr>
+              <w:spacing w:after="0"/>
+            </w:pPr>
+            <w:r>
+              <w:rPr>
+                <w:rFonts w:ascii="Arial" w:cs="Arial" w:eastAsia="Arial" w:hAnsi="Arial"/>
+                <w:sz w:val="18"/>
+                <w:szCs w:val="18"/>
+              </w:rPr>
+              <w:t xml:space="preserve">Not built</w:t>
+            </w:r>
+          </w:p>
+        </w:tc>
+        <w:tc>
+          <w:tcPr>
+            <w:tcW w:type="dxa" w:w="1850"/>
+            <w:tcBorders>
+              <w:top w:val="single" w:color="C9D1DA" w:sz="4"/>
+              <w:left w:val="single" w:color="C9D1DA" w:sz="4"/>
+              <w:bottom w:val="single" w:color="C9D1DA" w:sz="4"/>
+              <w:right w:val="single" w:color="C9D1DA" w:sz="4"/>
+            </w:tcBorders>
+            <w:tcMar>
+              <w:top w:type="dxa" w:w="70"/>
+              <w:left w:type="dxa" w:w="110"/>
+              <w:bottom w:type="dxa" w:w="70"/>
+              <w:right w:type="dxa" w:w="110"/>
+            </w:tcMar>
+          </w:tcPr>
+          <w:p>
+            <w:pPr>
+              <w:spacing w:after="0"/>
+            </w:pPr>
+            <w:r>
+              <w:rPr>
+                <w:rFonts w:ascii="Arial" w:cs="Arial" w:eastAsia="Arial" w:hAnsi="Arial"/>
+                <w:sz w:val="18"/>
+                <w:szCs w:val="18"/>
+              </w:rPr>
+              <w:t xml:space="preserve">Not planned</w:t>
+            </w:r>
+          </w:p>
+        </w:tc>
+      </w:tr>
+    </w:tbl>
+    <w:p>
+      <w:pPr>
+        <w:spacing w:after="60"/>
+      </w:pPr>
+    </w:p>
+    <w:p>
+      <w:pPr>
+        <w:pStyle w:val="Heading2"/>
+        <w:spacing w:after="100" w:before="220"/>
+      </w:pPr>
+      <w:r>
+        <w:rPr>
+          <w:rFonts w:ascii="Arial" w:cs="Arial" w:eastAsia="Arial" w:hAnsi="Arial"/>
+          <w:b/>
+          <w:bCs/>
+          <w:color w:val="1B3A5C"/>
+          <w:sz w:val="24"/>
+          <w:szCs w:val="24"/>
+        </w:rPr>
+        <w:t xml:space="preserve">13.3 Design and usability findings</w:t>
+      </w:r>
+    </w:p>
+    <w:p>
+      <w:pPr>
+        <w:spacing w:after="120" w:line="276"/>
+      </w:pPr>
+      <w:r>
+        <w:rPr>
+          <w:rFonts w:ascii="Arial" w:cs="Arial" w:eastAsia="Arial" w:hAnsi="Arial"/>
+          <w:sz w:val="20"/>
+          <w:szCs w:val="20"/>
+        </w:rPr>
+        <w:t xml:space="preserve">OWNA is rated 3.9 out of 5 from 571 App Store ratings. Most complaints are about the interface rather than missing features, so usability is where this product can stand out.</w:t>
+      </w:r>
+    </w:p>
+    <w:p>
+      <w:pPr>
+        <w:spacing w:after="120" w:line="276"/>
+      </w:pPr>
+      <w:r>
+        <w:rPr>
+          <w:rFonts w:ascii="Arial" w:cs="Arial" w:eastAsia="Arial" w:hAnsi="Arial"/>
+          <w:b/>
+          <w:bCs/>
+          <w:sz w:val="20"/>
+          <w:szCs w:val="20"/>
+        </w:rPr>
+        <w:t xml:space="preserve">What reviewers dislike</w:t>
+      </w:r>
+      <w:r>
+        <w:rPr>
+          <w:rFonts w:ascii="Arial" w:cs="Arial" w:eastAsia="Arial" w:hAnsi="Arial"/>
+          <w:sz w:val="20"/>
+          <w:szCs w:val="20"/>
+        </w:rPr>
+        <w:t xml:space="preserve"/>
       </w:r>
     </w:p>
     <w:p>
@@ -15208,7 +17658,2026 @@
           <w:sz w:val="20"/>
           <w:szCs w:val="20"/>
         </w:rPr>
-        <w:t xml:space="preserve">BRD v2.1 (Next_Gen_Childcare_BRD_v2.1.docx), including Section 13A and Appendix C.</w:t>
+        <w:t xml:space="preserve">Too many folders and small buttons that lead to further menus.</w:t>
+      </w:r>
+    </w:p>
+    <w:p>
+      <w:pPr>
+        <w:pStyle w:val="ListParagraph"/>
+        <w:numPr>
+          <w:ilvl w:val="0"/>
+          <w:numId w:val="2"/>
+        </w:numPr>
+        <w:spacing w:after="60" w:line="264"/>
+      </w:pPr>
+      <w:r>
+        <w:rPr>
+          <w:rFonts w:ascii="Arial" w:cs="Arial" w:eastAsia="Arial" w:hAnsi="Arial"/>
+          <w:sz w:val="20"/>
+          <w:szCs w:val="20"/>
+        </w:rPr>
+        <w:t xml:space="preserve">Parents struggle to find information about their own child.</w:t>
+      </w:r>
+    </w:p>
+    <w:p>
+      <w:pPr>
+        <w:pStyle w:val="ListParagraph"/>
+        <w:numPr>
+          <w:ilvl w:val="0"/>
+          <w:numId w:val="2"/>
+        </w:numPr>
+        <w:spacing w:after="60" w:line="264"/>
+      </w:pPr>
+      <w:r>
+        <w:rPr>
+          <w:rFonts w:ascii="Arial" w:cs="Arial" w:eastAsia="Arial" w:hAnsi="Arial"/>
+          <w:sz w:val="20"/>
+          <w:szCs w:val="20"/>
+        </w:rPr>
+        <w:t xml:space="preserve">The home screen promotes marketplace content ahead of the child.</w:t>
+      </w:r>
+    </w:p>
+    <w:p>
+      <w:pPr>
+        <w:pStyle w:val="ListParagraph"/>
+        <w:numPr>
+          <w:ilvl w:val="0"/>
+          <w:numId w:val="2"/>
+        </w:numPr>
+        <w:spacing w:after="60" w:line="264"/>
+      </w:pPr>
+      <w:r>
+        <w:rPr>
+          <w:rFonts w:ascii="Arial" w:cs="Arial" w:eastAsia="Arial" w:hAnsi="Arial"/>
+          <w:sz w:val="20"/>
+          <w:szCs w:val="20"/>
+        </w:rPr>
+        <w:t xml:space="preserve">It is unclear whether a message goes to one educator or to the whole feed.</w:t>
+      </w:r>
+    </w:p>
+    <w:p>
+      <w:pPr>
+        <w:pStyle w:val="ListParagraph"/>
+        <w:numPr>
+          <w:ilvl w:val="0"/>
+          <w:numId w:val="2"/>
+        </w:numPr>
+        <w:spacing w:after="60" w:line="264"/>
+      </w:pPr>
+      <w:r>
+        <w:rPr>
+          <w:rFonts w:ascii="Arial" w:cs="Arial" w:eastAsia="Arial" w:hAnsi="Arial"/>
+          <w:sz w:val="20"/>
+          <w:szCs w:val="20"/>
+        </w:rPr>
+        <w:t xml:space="preserve">iPad crashes and landscape/portrait layout problems; a photo gallery that does not refresh.</w:t>
+      </w:r>
+    </w:p>
+    <w:p>
+      <w:pPr>
+        <w:pStyle w:val="ListParagraph"/>
+        <w:numPr>
+          <w:ilvl w:val="0"/>
+          <w:numId w:val="2"/>
+        </w:numPr>
+        <w:spacing w:after="60" w:line="264"/>
+      </w:pPr>
+      <w:r>
+        <w:rPr>
+          <w:rFonts w:ascii="Arial" w:cs="Arial" w:eastAsia="Arial" w:hAnsi="Arial"/>
+          <w:sz w:val="20"/>
+          <w:szCs w:val="20"/>
+        </w:rPr>
+        <w:t xml:space="preserve">Observations are not saved as drafts, so educators lose work when the app glitches.</w:t>
+      </w:r>
+    </w:p>
+    <w:p>
+      <w:pPr>
+        <w:spacing w:after="120" w:line="276"/>
+      </w:pPr>
+      <w:r>
+        <w:rPr>
+          <w:rFonts w:ascii="Arial" w:cs="Arial" w:eastAsia="Arial" w:hAnsi="Arial"/>
+          <w:b/>
+          <w:bCs/>
+          <w:sz w:val="20"/>
+          <w:szCs w:val="20"/>
+        </w:rPr>
+        <w:t xml:space="preserve">What to borrow</w:t>
+      </w:r>
+      <w:r>
+        <w:rPr>
+          <w:rFonts w:ascii="Arial" w:cs="Arial" w:eastAsia="Arial" w:hAnsi="Arial"/>
+          <w:sz w:val="20"/>
+          <w:szCs w:val="20"/>
+        </w:rPr>
+        <w:t xml:space="preserve"/>
+      </w:r>
+    </w:p>
+    <w:p>
+      <w:pPr>
+        <w:pStyle w:val="ListParagraph"/>
+        <w:numPr>
+          <w:ilvl w:val="0"/>
+          <w:numId w:val="2"/>
+        </w:numPr>
+        <w:spacing w:after="60" w:line="264"/>
+      </w:pPr>
+      <w:r>
+        <w:rPr>
+          <w:rFonts w:ascii="Arial" w:cs="Arial" w:eastAsia="Arial" w:hAnsi="Arial"/>
+          <w:sz w:val="20"/>
+          <w:szCs w:val="20"/>
+        </w:rPr>
+        <w:t xml:space="preserve">A live daily timeline of meals, sleep, nappies and bottles; this is what parents praise most.</w:t>
+      </w:r>
+    </w:p>
+    <w:p>
+      <w:pPr>
+        <w:pStyle w:val="ListParagraph"/>
+        <w:numPr>
+          <w:ilvl w:val="0"/>
+          <w:numId w:val="2"/>
+        </w:numPr>
+        <w:spacing w:after="60" w:line="264"/>
+      </w:pPr>
+      <w:r>
+        <w:rPr>
+          <w:rFonts w:ascii="Arial" w:cs="Arial" w:eastAsia="Arial" w:hAnsi="Arial"/>
+          <w:sz w:val="20"/>
+          <w:szCs w:val="20"/>
+        </w:rPr>
+        <w:t xml:space="preserve">Charts for occupancy, attendance and staff cost on the owner dashboard.</w:t>
+      </w:r>
+    </w:p>
+    <w:p>
+      <w:pPr>
+        <w:pStyle w:val="ListParagraph"/>
+        <w:numPr>
+          <w:ilvl w:val="0"/>
+          <w:numId w:val="2"/>
+        </w:numPr>
+        <w:spacing w:after="60" w:line="264"/>
+      </w:pPr>
+      <w:r>
+        <w:rPr>
+          <w:rFonts w:ascii="Arial" w:cs="Arial" w:eastAsia="Arial" w:hAnsi="Arial"/>
+          <w:sz w:val="20"/>
+          <w:szCs w:val="20"/>
+        </w:rPr>
+        <w:t xml:space="preserve">Filtering by room and by child throughout.</w:t>
+      </w:r>
+    </w:p>
+    <w:p>
+      <w:pPr>
+        <w:pStyle w:val="ListParagraph"/>
+        <w:numPr>
+          <w:ilvl w:val="0"/>
+          <w:numId w:val="2"/>
+        </w:numPr>
+        <w:spacing w:after="60" w:line="264"/>
+      </w:pPr>
+      <w:r>
+        <w:rPr>
+          <w:rFonts w:ascii="Arial" w:cs="Arial" w:eastAsia="Arial" w:hAnsi="Arial"/>
+          <w:sz w:val="20"/>
+          <w:szCs w:val="20"/>
+        </w:rPr>
+        <w:t xml:space="preserve">Pre-filled pickup times, which reviewers ask for.</w:t>
+      </w:r>
+    </w:p>
+    <w:p>
+      <w:pPr>
+        <w:spacing w:after="120" w:line="276"/>
+      </w:pPr>
+      <w:r>
+        <w:rPr>
+          <w:rFonts w:ascii="Arial" w:cs="Arial" w:eastAsia="Arial" w:hAnsi="Arial"/>
+          <w:b/>
+          <w:bCs/>
+          <w:sz w:val="20"/>
+          <w:szCs w:val="20"/>
+        </w:rPr>
+        <w:t xml:space="preserve">Where to do better</w:t>
+      </w:r>
+      <w:r>
+        <w:rPr>
+          <w:rFonts w:ascii="Arial" w:cs="Arial" w:eastAsia="Arial" w:hAnsi="Arial"/>
+          <w:sz w:val="20"/>
+          <w:szCs w:val="20"/>
+        </w:rPr>
+        <w:t xml:space="preserve"/>
+      </w:r>
+    </w:p>
+    <w:p>
+      <w:pPr>
+        <w:pStyle w:val="ListParagraph"/>
+        <w:numPr>
+          <w:ilvl w:val="0"/>
+          <w:numId w:val="2"/>
+        </w:numPr>
+        <w:spacing w:after="60" w:line="264"/>
+      </w:pPr>
+      <w:r>
+        <w:rPr>
+          <w:rFonts w:ascii="Arial" w:cs="Arial" w:eastAsia="Arial" w:hAnsi="Arial"/>
+          <w:sz w:val="20"/>
+          <w:szCs w:val="20"/>
+        </w:rPr>
+        <w:t xml:space="preserve">Child-first parent home: one card per child that opens today’s timeline. No marketplace and no nested menus.</w:t>
+      </w:r>
+    </w:p>
+    <w:p>
+      <w:pPr>
+        <w:pStyle w:val="ListParagraph"/>
+        <w:numPr>
+          <w:ilvl w:val="0"/>
+          <w:numId w:val="2"/>
+        </w:numPr>
+        <w:spacing w:after="60" w:line="264"/>
+      </w:pPr>
+      <w:r>
+        <w:rPr>
+          <w:rFonts w:ascii="Arial" w:cs="Arial" w:eastAsia="Arial" w:hAnsi="Arial"/>
+          <w:sz w:val="20"/>
+          <w:szCs w:val="20"/>
+        </w:rPr>
+        <w:t xml:space="preserve">Auto-saved drafts wherever an educator writes, building on the offline-first sync engine.</w:t>
+      </w:r>
+    </w:p>
+    <w:p>
+      <w:pPr>
+        <w:pStyle w:val="ListParagraph"/>
+        <w:numPr>
+          <w:ilvl w:val="0"/>
+          <w:numId w:val="2"/>
+        </w:numPr>
+        <w:spacing w:after="60" w:line="264"/>
+      </w:pPr>
+      <w:r>
+        <w:rPr>
+          <w:rFonts w:ascii="Arial" w:cs="Arial" w:eastAsia="Arial" w:hAnsi="Arial"/>
+          <w:sz w:val="20"/>
+          <w:szCs w:val="20"/>
+        </w:rPr>
+        <w:t xml:space="preserve">Every message shows clearly who will receive it: a direct message to an educator or a centre-wide notice.</w:t>
+      </w:r>
+    </w:p>
+    <w:p>
+      <w:pPr>
+        <w:pStyle w:val="ListParagraph"/>
+        <w:numPr>
+          <w:ilvl w:val="0"/>
+          <w:numId w:val="2"/>
+        </w:numPr>
+        <w:spacing w:after="60" w:line="264"/>
+      </w:pPr>
+      <w:r>
+        <w:rPr>
+          <w:rFonts w:ascii="Arial" w:cs="Arial" w:eastAsia="Arial" w:hAnsi="Arial"/>
+          <w:sz w:val="20"/>
+          <w:szCs w:val="20"/>
+        </w:rPr>
+        <w:t xml:space="preserve">Tablet layouts designed and tested as a primary target, since many rooms run on iPads.</w:t>
+      </w:r>
+    </w:p>
+    <w:p>
+      <w:pPr>
+        <w:pStyle w:val="Heading2"/>
+        <w:spacing w:after="100" w:before="220"/>
+      </w:pPr>
+      <w:r>
+        <w:rPr>
+          <w:rFonts w:ascii="Arial" w:cs="Arial" w:eastAsia="Arial" w:hAnsi="Arial"/>
+          <w:b/>
+          <w:bCs/>
+          <w:color w:val="1B3A5C"/>
+          <w:sz w:val="24"/>
+          <w:szCs w:val="24"/>
+        </w:rPr>
+        <w:t xml:space="preserve">13.4 Plan to update the solution</w:t>
+      </w:r>
+    </w:p>
+    <w:p>
+      <w:pPr>
+        <w:spacing w:after="120" w:line="276"/>
+      </w:pPr>
+      <w:r>
+        <w:rPr>
+          <w:rFonts w:ascii="Arial" w:cs="Arial" w:eastAsia="Arial" w:hAnsi="Arial"/>
+          <w:sz w:val="20"/>
+          <w:szCs w:val="20"/>
+        </w:rPr>
+        <w:t xml:space="preserve">The work follows the repo’s execution model: sequential stages, tests written before features (TDD), structured logging and audit on every new endpoint, and a security review of touched modules. Sizes are relative (S, M, L) rather than months, because the team-based estimates in section 11 do not apply to the solo/small-team build.</w:t>
+      </w:r>
+    </w:p>
+    <w:tbl>
+      <w:tblPr>
+        <w:tblW w:type="dxa" w:w="9638"/>
+        <w:tblBorders>
+          <w:top w:val="single" w:color="auto" w:sz="4"/>
+          <w:left w:val="single" w:color="auto" w:sz="4"/>
+          <w:bottom w:val="single" w:color="auto" w:sz="4"/>
+          <w:right w:val="single" w:color="auto" w:sz="4"/>
+          <w:insideH w:val="single" w:color="auto" w:sz="4"/>
+          <w:insideV w:val="single" w:color="auto" w:sz="4"/>
+        </w:tblBorders>
+      </w:tblPr>
+      <w:tblGrid>
+        <w:gridCol w:w="1700"/>
+        <w:gridCol w:w="3600"/>
+        <w:gridCol w:w="1100"/>
+        <w:gridCol w:w="2700"/>
+        <w:gridCol w:w="538"/>
+      </w:tblGrid>
+      <w:tr>
+        <w:trPr>
+          <w:tblHeader/>
+        </w:trPr>
+        <w:tc>
+          <w:tcPr>
+            <w:tcW w:type="dxa" w:w="1700"/>
+            <w:tcBorders>
+              <w:top w:val="single" w:color="C9D1DA" w:sz="4"/>
+              <w:left w:val="single" w:color="C9D1DA" w:sz="4"/>
+              <w:bottom w:val="single" w:color="C9D1DA" w:sz="4"/>
+              <w:right w:val="single" w:color="C9D1DA" w:sz="4"/>
+            </w:tcBorders>
+            <w:shd w:fill="1B3A5C" w:color="auto" w:val="clear"/>
+            <w:tcMar>
+              <w:top w:type="dxa" w:w="70"/>
+              <w:left w:type="dxa" w:w="110"/>
+              <w:bottom w:type="dxa" w:w="70"/>
+              <w:right w:type="dxa" w:w="110"/>
+            </w:tcMar>
+          </w:tcPr>
+          <w:p>
+            <w:pPr>
+              <w:spacing w:after="0"/>
+            </w:pPr>
+            <w:r>
+              <w:rPr>
+                <w:rFonts w:ascii="Arial" w:cs="Arial" w:eastAsia="Arial" w:hAnsi="Arial"/>
+                <w:b/>
+                <w:bCs/>
+                <w:color w:val="FFFFFF"/>
+                <w:sz w:val="18"/>
+                <w:szCs w:val="18"/>
+              </w:rPr>
+              <w:t xml:space="preserve">Stream</w:t>
+            </w:r>
+          </w:p>
+        </w:tc>
+        <w:tc>
+          <w:tcPr>
+            <w:tcW w:type="dxa" w:w="3600"/>
+            <w:tcBorders>
+              <w:top w:val="single" w:color="C9D1DA" w:sz="4"/>
+              <w:left w:val="single" w:color="C9D1DA" w:sz="4"/>
+              <w:bottom w:val="single" w:color="C9D1DA" w:sz="4"/>
+              <w:right w:val="single" w:color="C9D1DA" w:sz="4"/>
+            </w:tcBorders>
+            <w:shd w:fill="1B3A5C" w:color="auto" w:val="clear"/>
+            <w:tcMar>
+              <w:top w:type="dxa" w:w="70"/>
+              <w:left w:type="dxa" w:w="110"/>
+              <w:bottom w:type="dxa" w:w="70"/>
+              <w:right w:type="dxa" w:w="110"/>
+            </w:tcMar>
+          </w:tcPr>
+          <w:p>
+            <w:pPr>
+              <w:spacing w:after="0"/>
+            </w:pPr>
+            <w:r>
+              <w:rPr>
+                <w:rFonts w:ascii="Arial" w:cs="Arial" w:eastAsia="Arial" w:hAnsi="Arial"/>
+                <w:b/>
+                <w:bCs/>
+                <w:color w:val="FFFFFF"/>
+                <w:sz w:val="18"/>
+                <w:szCs w:val="18"/>
+              </w:rPr>
+              <w:t xml:space="preserve">Scope</w:t>
+            </w:r>
+          </w:p>
+        </w:tc>
+        <w:tc>
+          <w:tcPr>
+            <w:tcW w:type="dxa" w:w="1100"/>
+            <w:tcBorders>
+              <w:top w:val="single" w:color="C9D1DA" w:sz="4"/>
+              <w:left w:val="single" w:color="C9D1DA" w:sz="4"/>
+              <w:bottom w:val="single" w:color="C9D1DA" w:sz="4"/>
+              <w:right w:val="single" w:color="C9D1DA" w:sz="4"/>
+            </w:tcBorders>
+            <w:shd w:fill="1B3A5C" w:color="auto" w:val="clear"/>
+            <w:tcMar>
+              <w:top w:type="dxa" w:w="70"/>
+              <w:left w:type="dxa" w:w="110"/>
+              <w:bottom w:type="dxa" w:w="70"/>
+              <w:right w:type="dxa" w:w="110"/>
+            </w:tcMar>
+          </w:tcPr>
+          <w:p>
+            <w:pPr>
+              <w:spacing w:after="0"/>
+            </w:pPr>
+            <w:r>
+              <w:rPr>
+                <w:rFonts w:ascii="Arial" w:cs="Arial" w:eastAsia="Arial" w:hAnsi="Arial"/>
+                <w:b/>
+                <w:bCs/>
+                <w:color w:val="FFFFFF"/>
+                <w:sz w:val="18"/>
+                <w:szCs w:val="18"/>
+              </w:rPr>
+              <w:t xml:space="preserve">Depends on</w:t>
+            </w:r>
+          </w:p>
+        </w:tc>
+        <w:tc>
+          <w:tcPr>
+            <w:tcW w:type="dxa" w:w="2700"/>
+            <w:tcBorders>
+              <w:top w:val="single" w:color="C9D1DA" w:sz="4"/>
+              <w:left w:val="single" w:color="C9D1DA" w:sz="4"/>
+              <w:bottom w:val="single" w:color="C9D1DA" w:sz="4"/>
+              <w:right w:val="single" w:color="C9D1DA" w:sz="4"/>
+            </w:tcBorders>
+            <w:shd w:fill="1B3A5C" w:color="auto" w:val="clear"/>
+            <w:tcMar>
+              <w:top w:type="dxa" w:w="70"/>
+              <w:left w:type="dxa" w:w="110"/>
+              <w:bottom w:type="dxa" w:w="70"/>
+              <w:right w:type="dxa" w:w="110"/>
+            </w:tcMar>
+          </w:tcPr>
+          <w:p>
+            <w:pPr>
+              <w:spacing w:after="0"/>
+            </w:pPr>
+            <w:r>
+              <w:rPr>
+                <w:rFonts w:ascii="Arial" w:cs="Arial" w:eastAsia="Arial" w:hAnsi="Arial"/>
+                <w:b/>
+                <w:bCs/>
+                <w:color w:val="FFFFFF"/>
+                <w:sz w:val="18"/>
+                <w:szCs w:val="18"/>
+              </w:rPr>
+              <w:t xml:space="preserve">Exit criteria</w:t>
+            </w:r>
+          </w:p>
+        </w:tc>
+        <w:tc>
+          <w:tcPr>
+            <w:tcW w:type="dxa" w:w="538"/>
+            <w:tcBorders>
+              <w:top w:val="single" w:color="C9D1DA" w:sz="4"/>
+              <w:left w:val="single" w:color="C9D1DA" w:sz="4"/>
+              <w:bottom w:val="single" w:color="C9D1DA" w:sz="4"/>
+              <w:right w:val="single" w:color="C9D1DA" w:sz="4"/>
+            </w:tcBorders>
+            <w:shd w:fill="1B3A5C" w:color="auto" w:val="clear"/>
+            <w:tcMar>
+              <w:top w:type="dxa" w:w="70"/>
+              <w:left w:type="dxa" w:w="110"/>
+              <w:bottom w:type="dxa" w:w="70"/>
+              <w:right w:type="dxa" w:w="110"/>
+            </w:tcMar>
+          </w:tcPr>
+          <w:p>
+            <w:pPr>
+              <w:spacing w:after="0"/>
+            </w:pPr>
+            <w:r>
+              <w:rPr>
+                <w:rFonts w:ascii="Arial" w:cs="Arial" w:eastAsia="Arial" w:hAnsi="Arial"/>
+                <w:b/>
+                <w:bCs/>
+                <w:color w:val="FFFFFF"/>
+                <w:sz w:val="18"/>
+                <w:szCs w:val="18"/>
+              </w:rPr>
+              <w:t xml:space="preserve">Size</w:t>
+            </w:r>
+          </w:p>
+        </w:tc>
+      </w:tr>
+      <w:tr>
+        <w:trPr>
+          <w:cantSplit/>
+        </w:trPr>
+        <w:tc>
+          <w:tcPr>
+            <w:tcW w:type="dxa" w:w="1700"/>
+            <w:tcBorders>
+              <w:top w:val="single" w:color="C9D1DA" w:sz="4"/>
+              <w:left w:val="single" w:color="C9D1DA" w:sz="4"/>
+              <w:bottom w:val="single" w:color="C9D1DA" w:sz="4"/>
+              <w:right w:val="single" w:color="C9D1DA" w:sz="4"/>
+            </w:tcBorders>
+            <w:shd w:fill="E3EEF9" w:color="auto" w:val="clear"/>
+            <w:tcMar>
+              <w:top w:type="dxa" w:w="70"/>
+              <w:left w:type="dxa" w:w="110"/>
+              <w:bottom w:type="dxa" w:w="70"/>
+              <w:right w:type="dxa" w:w="110"/>
+            </w:tcMar>
+          </w:tcPr>
+          <w:p>
+            <w:pPr>
+              <w:spacing w:after="0"/>
+            </w:pPr>
+            <w:r>
+              <w:rPr>
+                <w:rFonts w:ascii="Arial" w:cs="Arial" w:eastAsia="Arial" w:hAnsi="Arial"/>
+                <w:sz w:val="18"/>
+                <w:szCs w:val="18"/>
+              </w:rPr>
+              <w:t xml:space="preserve">U0 UX foundation</w:t>
+            </w:r>
+          </w:p>
+        </w:tc>
+        <w:tc>
+          <w:tcPr>
+            <w:tcW w:type="dxa" w:w="3600"/>
+            <w:tcBorders>
+              <w:top w:val="single" w:color="C9D1DA" w:sz="4"/>
+              <w:left w:val="single" w:color="C9D1DA" w:sz="4"/>
+              <w:bottom w:val="single" w:color="C9D1DA" w:sz="4"/>
+              <w:right w:val="single" w:color="C9D1DA" w:sz="4"/>
+            </w:tcBorders>
+            <w:tcMar>
+              <w:top w:type="dxa" w:w="70"/>
+              <w:left w:type="dxa" w:w="110"/>
+              <w:bottom w:type="dxa" w:w="70"/>
+              <w:right w:type="dxa" w:w="110"/>
+            </w:tcMar>
+          </w:tcPr>
+          <w:p>
+            <w:pPr>
+              <w:spacing w:after="0"/>
+            </w:pPr>
+            <w:r>
+              <w:rPr>
+                <w:rFonts w:ascii="Arial" w:cs="Arial" w:eastAsia="Arial" w:hAnsi="Arial"/>
+                <w:sz w:val="18"/>
+                <w:szCs w:val="18"/>
+              </w:rPr>
+              <w:t xml:space="preserve">Refresh the shared design system; child-first navigation; tablet layouts; a visual click-through of every existing portal and educator screen (not done yet); WCAG 2.2 AA spot checks.</w:t>
+            </w:r>
+          </w:p>
+        </w:tc>
+        <w:tc>
+          <w:tcPr>
+            <w:tcW w:type="dxa" w:w="1100"/>
+            <w:tcBorders>
+              <w:top w:val="single" w:color="C9D1DA" w:sz="4"/>
+              <w:left w:val="single" w:color="C9D1DA" w:sz="4"/>
+              <w:bottom w:val="single" w:color="C9D1DA" w:sz="4"/>
+              <w:right w:val="single" w:color="C9D1DA" w:sz="4"/>
+            </w:tcBorders>
+            <w:tcMar>
+              <w:top w:type="dxa" w:w="70"/>
+              <w:left w:type="dxa" w:w="110"/>
+              <w:bottom w:type="dxa" w:w="70"/>
+              <w:right w:type="dxa" w:w="110"/>
+            </w:tcMar>
+          </w:tcPr>
+          <w:p>
+            <w:pPr>
+              <w:spacing w:after="0"/>
+            </w:pPr>
+            <w:r>
+              <w:rPr>
+                <w:rFonts w:ascii="Arial" w:cs="Arial" w:eastAsia="Arial" w:hAnsi="Arial"/>
+                <w:sz w:val="18"/>
+                <w:szCs w:val="18"/>
+              </w:rPr>
+              <w:t xml:space="preserve">—</w:t>
+            </w:r>
+          </w:p>
+        </w:tc>
+        <w:tc>
+          <w:tcPr>
+            <w:tcW w:type="dxa" w:w="2700"/>
+            <w:tcBorders>
+              <w:top w:val="single" w:color="C9D1DA" w:sz="4"/>
+              <w:left w:val="single" w:color="C9D1DA" w:sz="4"/>
+              <w:bottom w:val="single" w:color="C9D1DA" w:sz="4"/>
+              <w:right w:val="single" w:color="C9D1DA" w:sz="4"/>
+            </w:tcBorders>
+            <w:tcMar>
+              <w:top w:type="dxa" w:w="70"/>
+              <w:left w:type="dxa" w:w="110"/>
+              <w:bottom w:type="dxa" w:w="70"/>
+              <w:right w:type="dxa" w:w="110"/>
+            </w:tcMar>
+          </w:tcPr>
+          <w:p>
+            <w:pPr>
+              <w:spacing w:after="0"/>
+            </w:pPr>
+            <w:r>
+              <w:rPr>
+                <w:rFonts w:ascii="Arial" w:cs="Arial" w:eastAsia="Arial" w:hAnsi="Arial"/>
+                <w:sz w:val="18"/>
+                <w:szCs w:val="18"/>
+              </w:rPr>
+              <w:t xml:space="preserve">Every existing screen reviewed in a browser at phone, tablet and desktop sizes; layout defects fixed.</w:t>
+            </w:r>
+          </w:p>
+        </w:tc>
+        <w:tc>
+          <w:tcPr>
+            <w:tcW w:type="dxa" w:w="538"/>
+            <w:tcBorders>
+              <w:top w:val="single" w:color="C9D1DA" w:sz="4"/>
+              <w:left w:val="single" w:color="C9D1DA" w:sz="4"/>
+              <w:bottom w:val="single" w:color="C9D1DA" w:sz="4"/>
+              <w:right w:val="single" w:color="C9D1DA" w:sz="4"/>
+            </w:tcBorders>
+            <w:tcMar>
+              <w:top w:type="dxa" w:w="70"/>
+              <w:left w:type="dxa" w:w="110"/>
+              <w:bottom w:type="dxa" w:w="70"/>
+              <w:right w:type="dxa" w:w="110"/>
+            </w:tcMar>
+          </w:tcPr>
+          <w:p>
+            <w:pPr>
+              <w:spacing w:after="0"/>
+            </w:pPr>
+            <w:r>
+              <w:rPr>
+                <w:rFonts w:ascii="Arial" w:cs="Arial" w:eastAsia="Arial" w:hAnsi="Arial"/>
+                <w:sz w:val="18"/>
+                <w:szCs w:val="18"/>
+              </w:rPr>
+              <w:t xml:space="preserve">S</w:t>
+            </w:r>
+          </w:p>
+        </w:tc>
+      </w:tr>
+      <w:tr>
+        <w:trPr>
+          <w:cantSplit/>
+        </w:trPr>
+        <w:tc>
+          <w:tcPr>
+            <w:tcW w:type="dxa" w:w="1700"/>
+            <w:tcBorders>
+              <w:top w:val="single" w:color="C9D1DA" w:sz="4"/>
+              <w:left w:val="single" w:color="C9D1DA" w:sz="4"/>
+              <w:bottom w:val="single" w:color="C9D1DA" w:sz="4"/>
+              <w:right w:val="single" w:color="C9D1DA" w:sz="4"/>
+            </w:tcBorders>
+            <w:shd w:fill="E3EEF9" w:color="auto" w:val="clear"/>
+            <w:tcMar>
+              <w:top w:type="dxa" w:w="70"/>
+              <w:left w:type="dxa" w:w="110"/>
+              <w:bottom w:type="dxa" w:w="70"/>
+              <w:right w:type="dxa" w:w="110"/>
+            </w:tcMar>
+          </w:tcPr>
+          <w:p>
+            <w:pPr>
+              <w:spacing w:after="0"/>
+            </w:pPr>
+            <w:r>
+              <w:rPr>
+                <w:rFonts w:ascii="Arial" w:cs="Arial" w:eastAsia="Arial" w:hAnsi="Arial"/>
+                <w:sz w:val="18"/>
+                <w:szCs w:val="18"/>
+              </w:rPr>
+              <w:t xml:space="preserve">U1 Family feed and routines</w:t>
+            </w:r>
+          </w:p>
+        </w:tc>
+        <w:tc>
+          <w:tcPr>
+            <w:tcW w:type="dxa" w:w="3600"/>
+            <w:tcBorders>
+              <w:top w:val="single" w:color="C9D1DA" w:sz="4"/>
+              <w:left w:val="single" w:color="C9D1DA" w:sz="4"/>
+              <w:bottom w:val="single" w:color="C9D1DA" w:sz="4"/>
+              <w:right w:val="single" w:color="C9D1DA" w:sz="4"/>
+            </w:tcBorders>
+            <w:tcMar>
+              <w:top w:type="dxa" w:w="70"/>
+              <w:left w:type="dxa" w:w="110"/>
+              <w:bottom w:type="dxa" w:w="70"/>
+              <w:right w:type="dxa" w:w="110"/>
+            </w:tcMar>
+          </w:tcPr>
+          <w:p>
+            <w:pPr>
+              <w:spacing w:after="0"/>
+            </w:pPr>
+            <w:r>
+              <w:rPr>
+                <w:rFonts w:ascii="Arial" w:cs="Arial" w:eastAsia="Arial" w:hAnsi="Arial"/>
+                <w:sz w:val="18"/>
+                <w:szCs w:val="18"/>
+              </w:rPr>
+              <w:t xml:space="preserve">Real media storage (OI-09, resolved); messaging and announcement screens with clear recipients; photo/video posts; parent live daily timeline; new routine types (sleep checks with interval reminders, sunscreen, nappy, room checklists); auto-saved drafts.</w:t>
+            </w:r>
+          </w:p>
+        </w:tc>
+        <w:tc>
+          <w:tcPr>
+            <w:tcW w:type="dxa" w:w="1100"/>
+            <w:tcBorders>
+              <w:top w:val="single" w:color="C9D1DA" w:sz="4"/>
+              <w:left w:val="single" w:color="C9D1DA" w:sz="4"/>
+              <w:bottom w:val="single" w:color="C9D1DA" w:sz="4"/>
+              <w:right w:val="single" w:color="C9D1DA" w:sz="4"/>
+            </w:tcBorders>
+            <w:tcMar>
+              <w:top w:type="dxa" w:w="70"/>
+              <w:left w:type="dxa" w:w="110"/>
+              <w:bottom w:type="dxa" w:w="70"/>
+              <w:right w:type="dxa" w:w="110"/>
+            </w:tcMar>
+          </w:tcPr>
+          <w:p>
+            <w:pPr>
+              <w:spacing w:after="0"/>
+            </w:pPr>
+            <w:r>
+              <w:rPr>
+                <w:rFonts w:ascii="Arial" w:cs="Arial" w:eastAsia="Arial" w:hAnsi="Arial"/>
+                <w:sz w:val="18"/>
+                <w:szCs w:val="18"/>
+              </w:rPr>
+              <w:t xml:space="preserve">U0</w:t>
+            </w:r>
+          </w:p>
+        </w:tc>
+        <w:tc>
+          <w:tcPr>
+            <w:tcW w:type="dxa" w:w="2700"/>
+            <w:tcBorders>
+              <w:top w:val="single" w:color="C9D1DA" w:sz="4"/>
+              <w:left w:val="single" w:color="C9D1DA" w:sz="4"/>
+              <w:bottom w:val="single" w:color="C9D1DA" w:sz="4"/>
+              <w:right w:val="single" w:color="C9D1DA" w:sz="4"/>
+            </w:tcBorders>
+            <w:tcMar>
+              <w:top w:type="dxa" w:w="70"/>
+              <w:left w:type="dxa" w:w="110"/>
+              <w:bottom w:type="dxa" w:w="70"/>
+              <w:right w:type="dxa" w:w="110"/>
+            </w:tcMar>
+          </w:tcPr>
+          <w:p>
+            <w:pPr>
+              <w:spacing w:after="0"/>
+            </w:pPr>
+            <w:r>
+              <w:rPr>
+                <w:rFonts w:ascii="Arial" w:cs="Arial" w:eastAsia="Arial" w:hAnsi="Arial"/>
+                <w:sz w:val="18"/>
+                <w:szCs w:val="18"/>
+              </w:rPr>
+              <w:t xml:space="preserve">Educator posts a tagged photo and logs a sleep check offline; the parent sees both in the timeline after sync; media rules pass the cross-family access suite.</w:t>
+            </w:r>
+          </w:p>
+        </w:tc>
+        <w:tc>
+          <w:tcPr>
+            <w:tcW w:type="dxa" w:w="538"/>
+            <w:tcBorders>
+              <w:top w:val="single" w:color="C9D1DA" w:sz="4"/>
+              <w:left w:val="single" w:color="C9D1DA" w:sz="4"/>
+              <w:bottom w:val="single" w:color="C9D1DA" w:sz="4"/>
+              <w:right w:val="single" w:color="C9D1DA" w:sz="4"/>
+            </w:tcBorders>
+            <w:tcMar>
+              <w:top w:type="dxa" w:w="70"/>
+              <w:left w:type="dxa" w:w="110"/>
+              <w:bottom w:type="dxa" w:w="70"/>
+              <w:right w:type="dxa" w:w="110"/>
+            </w:tcMar>
+          </w:tcPr>
+          <w:p>
+            <w:pPr>
+              <w:spacing w:after="0"/>
+            </w:pPr>
+            <w:r>
+              <w:rPr>
+                <w:rFonts w:ascii="Arial" w:cs="Arial" w:eastAsia="Arial" w:hAnsi="Arial"/>
+                <w:sz w:val="18"/>
+                <w:szCs w:val="18"/>
+              </w:rPr>
+              <w:t xml:space="preserve">L</w:t>
+            </w:r>
+          </w:p>
+        </w:tc>
+      </w:tr>
+      <w:tr>
+        <w:trPr>
+          <w:cantSplit/>
+        </w:trPr>
+        <w:tc>
+          <w:tcPr>
+            <w:tcW w:type="dxa" w:w="1700"/>
+            <w:tcBorders>
+              <w:top w:val="single" w:color="C9D1DA" w:sz="4"/>
+              <w:left w:val="single" w:color="C9D1DA" w:sz="4"/>
+              <w:bottom w:val="single" w:color="C9D1DA" w:sz="4"/>
+              <w:right w:val="single" w:color="C9D1DA" w:sz="4"/>
+            </w:tcBorders>
+            <w:shd w:fill="E3EEF9" w:color="auto" w:val="clear"/>
+            <w:tcMar>
+              <w:top w:type="dxa" w:w="70"/>
+              <w:left w:type="dxa" w:w="110"/>
+              <w:bottom w:type="dxa" w:w="70"/>
+              <w:right w:type="dxa" w:w="110"/>
+            </w:tcMar>
+          </w:tcPr>
+          <w:p>
+            <w:pPr>
+              <w:spacing w:after="0"/>
+            </w:pPr>
+            <w:r>
+              <w:rPr>
+                <w:rFonts w:ascii="Arial" w:cs="Arial" w:eastAsia="Arial" w:hAnsi="Arial"/>
+                <w:sz w:val="18"/>
+                <w:szCs w:val="18"/>
+              </w:rPr>
+              <w:t xml:space="preserve">U2 Learning in the feed</w:t>
+            </w:r>
+          </w:p>
+        </w:tc>
+        <w:tc>
+          <w:tcPr>
+            <w:tcW w:type="dxa" w:w="3600"/>
+            <w:tcBorders>
+              <w:top w:val="single" w:color="C9D1DA" w:sz="4"/>
+              <w:left w:val="single" w:color="C9D1DA" w:sz="4"/>
+              <w:bottom w:val="single" w:color="C9D1DA" w:sz="4"/>
+              <w:right w:val="single" w:color="C9D1DA" w:sz="4"/>
+            </w:tcBorders>
+            <w:tcMar>
+              <w:top w:type="dxa" w:w="70"/>
+              <w:left w:type="dxa" w:w="110"/>
+              <w:bottom w:type="dxa" w:w="70"/>
+              <w:right w:type="dxa" w:w="110"/>
+            </w:tcMar>
+          </w:tcPr>
+          <w:p>
+            <w:pPr>
+              <w:spacing w:after="0"/>
+            </w:pPr>
+            <w:r>
+              <w:rPr>
+                <w:rFonts w:ascii="Arial" w:cs="Arial" w:eastAsia="Arial" w:hAnsi="Arial"/>
+                <w:sz w:val="18"/>
+                <w:szCs w:val="18"/>
+              </w:rPr>
+              <w:t xml:space="preserve">Moved from Phase 2A. Observations and learning stories linked to EYLF V2.0 outcomes, published to the family feed after review; child portfolios with PDF export; room programs and weekly plans; guardian responses visible only to that child’s family and educators.</w:t>
+            </w:r>
+          </w:p>
+        </w:tc>
+        <w:tc>
+          <w:tcPr>
+            <w:tcW w:type="dxa" w:w="1100"/>
+            <w:tcBorders>
+              <w:top w:val="single" w:color="C9D1DA" w:sz="4"/>
+              <w:left w:val="single" w:color="C9D1DA" w:sz="4"/>
+              <w:bottom w:val="single" w:color="C9D1DA" w:sz="4"/>
+              <w:right w:val="single" w:color="C9D1DA" w:sz="4"/>
+            </w:tcBorders>
+            <w:tcMar>
+              <w:top w:type="dxa" w:w="70"/>
+              <w:left w:type="dxa" w:w="110"/>
+              <w:bottom w:type="dxa" w:w="70"/>
+              <w:right w:type="dxa" w:w="110"/>
+            </w:tcMar>
+          </w:tcPr>
+          <w:p>
+            <w:pPr>
+              <w:spacing w:after="0"/>
+            </w:pPr>
+            <w:r>
+              <w:rPr>
+                <w:rFonts w:ascii="Arial" w:cs="Arial" w:eastAsia="Arial" w:hAnsi="Arial"/>
+                <w:sz w:val="18"/>
+                <w:szCs w:val="18"/>
+              </w:rPr>
+              <w:t xml:space="preserve">U1</w:t>
+            </w:r>
+          </w:p>
+        </w:tc>
+        <w:tc>
+          <w:tcPr>
+            <w:tcW w:type="dxa" w:w="2700"/>
+            <w:tcBorders>
+              <w:top w:val="single" w:color="C9D1DA" w:sz="4"/>
+              <w:left w:val="single" w:color="C9D1DA" w:sz="4"/>
+              <w:bottom w:val="single" w:color="C9D1DA" w:sz="4"/>
+              <w:right w:val="single" w:color="C9D1DA" w:sz="4"/>
+            </w:tcBorders>
+            <w:tcMar>
+              <w:top w:type="dxa" w:w="70"/>
+              <w:left w:type="dxa" w:w="110"/>
+              <w:bottom w:type="dxa" w:w="70"/>
+              <w:right w:type="dxa" w:w="110"/>
+            </w:tcMar>
+          </w:tcPr>
+          <w:p>
+            <w:pPr>
+              <w:spacing w:after="0"/>
+            </w:pPr>
+            <w:r>
+              <w:rPr>
+                <w:rFonts w:ascii="Arial" w:cs="Arial" w:eastAsia="Arial" w:hAnsi="Arial"/>
+                <w:sz w:val="18"/>
+                <w:szCs w:val="18"/>
+              </w:rPr>
+              <w:t xml:space="preserve">An educator writes a learning story offline, links outcomes and photos, and publishes it; the parent sees it in the feed and the portfolio; another family cannot see it.</w:t>
+            </w:r>
+          </w:p>
+        </w:tc>
+        <w:tc>
+          <w:tcPr>
+            <w:tcW w:type="dxa" w:w="538"/>
+            <w:tcBorders>
+              <w:top w:val="single" w:color="C9D1DA" w:sz="4"/>
+              <w:left w:val="single" w:color="C9D1DA" w:sz="4"/>
+              <w:bottom w:val="single" w:color="C9D1DA" w:sz="4"/>
+              <w:right w:val="single" w:color="C9D1DA" w:sz="4"/>
+            </w:tcBorders>
+            <w:tcMar>
+              <w:top w:type="dxa" w:w="70"/>
+              <w:left w:type="dxa" w:w="110"/>
+              <w:bottom w:type="dxa" w:w="70"/>
+              <w:right w:type="dxa" w:w="110"/>
+            </w:tcMar>
+          </w:tcPr>
+          <w:p>
+            <w:pPr>
+              <w:spacing w:after="0"/>
+            </w:pPr>
+            <w:r>
+              <w:rPr>
+                <w:rFonts w:ascii="Arial" w:cs="Arial" w:eastAsia="Arial" w:hAnsi="Arial"/>
+                <w:sz w:val="18"/>
+                <w:szCs w:val="18"/>
+              </w:rPr>
+              <w:t xml:space="preserve">L</w:t>
+            </w:r>
+          </w:p>
+        </w:tc>
+      </w:tr>
+      <w:tr>
+        <w:trPr>
+          <w:cantSplit/>
+        </w:trPr>
+        <w:tc>
+          <w:tcPr>
+            <w:tcW w:type="dxa" w:w="1700"/>
+            <w:tcBorders>
+              <w:top w:val="single" w:color="C9D1DA" w:sz="4"/>
+              <w:left w:val="single" w:color="C9D1DA" w:sz="4"/>
+              <w:bottom w:val="single" w:color="C9D1DA" w:sz="4"/>
+              <w:right w:val="single" w:color="C9D1DA" w:sz="4"/>
+            </w:tcBorders>
+            <w:shd w:fill="E3EEF9" w:color="auto" w:val="clear"/>
+            <w:tcMar>
+              <w:top w:type="dxa" w:w="70"/>
+              <w:left w:type="dxa" w:w="110"/>
+              <w:bottom w:type="dxa" w:w="70"/>
+              <w:right w:type="dxa" w:w="110"/>
+            </w:tcMar>
+          </w:tcPr>
+          <w:p>
+            <w:pPr>
+              <w:spacing w:after="0"/>
+            </w:pPr>
+            <w:r>
+              <w:rPr>
+                <w:rFonts w:ascii="Arial" w:cs="Arial" w:eastAsia="Arial" w:hAnsi="Arial"/>
+                <w:sz w:val="18"/>
+                <w:szCs w:val="18"/>
+              </w:rPr>
+              <w:t xml:space="preserve">U3 Parent mobile app</w:t>
+            </w:r>
+          </w:p>
+        </w:tc>
+        <w:tc>
+          <w:tcPr>
+            <w:tcW w:type="dxa" w:w="3600"/>
+            <w:tcBorders>
+              <w:top w:val="single" w:color="C9D1DA" w:sz="4"/>
+              <w:left w:val="single" w:color="C9D1DA" w:sz="4"/>
+              <w:bottom w:val="single" w:color="C9D1DA" w:sz="4"/>
+              <w:right w:val="single" w:color="C9D1DA" w:sz="4"/>
+            </w:tcBorders>
+            <w:tcMar>
+              <w:top w:type="dxa" w:w="70"/>
+              <w:left w:type="dxa" w:w="110"/>
+              <w:bottom w:type="dxa" w:w="70"/>
+              <w:right w:type="dxa" w:w="110"/>
+            </w:tcMar>
+          </w:tcPr>
+          <w:p>
+            <w:pPr>
+              <w:spacing w:after="0"/>
+            </w:pPr>
+            <w:r>
+              <w:rPr>
+                <w:rFonts w:ascii="Arial" w:cs="Arial" w:eastAsia="Arial" w:hAnsi="Arial"/>
+                <w:sz w:val="18"/>
+                <w:szCs w:val="18"/>
+              </w:rPr>
+              <w:t xml:space="preserve">Expo app sharing the educator app’s components: child-first home, timeline and learning feed, messages, invoices and explainable bill, casual-day requests, absence notices, pickup with pre-filled times, categorised push.</w:t>
+            </w:r>
+          </w:p>
+        </w:tc>
+        <w:tc>
+          <w:tcPr>
+            <w:tcW w:type="dxa" w:w="1100"/>
+            <w:tcBorders>
+              <w:top w:val="single" w:color="C9D1DA" w:sz="4"/>
+              <w:left w:val="single" w:color="C9D1DA" w:sz="4"/>
+              <w:bottom w:val="single" w:color="C9D1DA" w:sz="4"/>
+              <w:right w:val="single" w:color="C9D1DA" w:sz="4"/>
+            </w:tcBorders>
+            <w:tcMar>
+              <w:top w:type="dxa" w:w="70"/>
+              <w:left w:type="dxa" w:w="110"/>
+              <w:bottom w:type="dxa" w:w="70"/>
+              <w:right w:type="dxa" w:w="110"/>
+            </w:tcMar>
+          </w:tcPr>
+          <w:p>
+            <w:pPr>
+              <w:spacing w:after="0"/>
+            </w:pPr>
+            <w:r>
+              <w:rPr>
+                <w:rFonts w:ascii="Arial" w:cs="Arial" w:eastAsia="Arial" w:hAnsi="Arial"/>
+                <w:sz w:val="18"/>
+                <w:szCs w:val="18"/>
+              </w:rPr>
+              <w:t xml:space="preserve">U2</w:t>
+            </w:r>
+          </w:p>
+        </w:tc>
+        <w:tc>
+          <w:tcPr>
+            <w:tcW w:type="dxa" w:w="2700"/>
+            <w:tcBorders>
+              <w:top w:val="single" w:color="C9D1DA" w:sz="4"/>
+              <w:left w:val="single" w:color="C9D1DA" w:sz="4"/>
+              <w:bottom w:val="single" w:color="C9D1DA" w:sz="4"/>
+              <w:right w:val="single" w:color="C9D1DA" w:sz="4"/>
+            </w:tcBorders>
+            <w:tcMar>
+              <w:top w:type="dxa" w:w="70"/>
+              <w:left w:type="dxa" w:w="110"/>
+              <w:bottom w:type="dxa" w:w="70"/>
+              <w:right w:type="dxa" w:w="110"/>
+            </w:tcMar>
+          </w:tcPr>
+          <w:p>
+            <w:pPr>
+              <w:spacing w:after="0"/>
+            </w:pPr>
+            <w:r>
+              <w:rPr>
+                <w:rFonts w:ascii="Arial" w:cs="Arial" w:eastAsia="Arial" w:hAnsi="Arial"/>
+                <w:sz w:val="18"/>
+                <w:szCs w:val="18"/>
+              </w:rPr>
+              <w:t xml:space="preserve">A parent completes the core tasks (PAR-001 to PAR-011) on a phone without support; key child info visible within 10 seconds.</w:t>
+            </w:r>
+          </w:p>
+        </w:tc>
+        <w:tc>
+          <w:tcPr>
+            <w:tcW w:type="dxa" w:w="538"/>
+            <w:tcBorders>
+              <w:top w:val="single" w:color="C9D1DA" w:sz="4"/>
+              <w:left w:val="single" w:color="C9D1DA" w:sz="4"/>
+              <w:bottom w:val="single" w:color="C9D1DA" w:sz="4"/>
+              <w:right w:val="single" w:color="C9D1DA" w:sz="4"/>
+            </w:tcBorders>
+            <w:tcMar>
+              <w:top w:type="dxa" w:w="70"/>
+              <w:left w:type="dxa" w:w="110"/>
+              <w:bottom w:type="dxa" w:w="70"/>
+              <w:right w:type="dxa" w:w="110"/>
+            </w:tcMar>
+          </w:tcPr>
+          <w:p>
+            <w:pPr>
+              <w:spacing w:after="0"/>
+            </w:pPr>
+            <w:r>
+              <w:rPr>
+                <w:rFonts w:ascii="Arial" w:cs="Arial" w:eastAsia="Arial" w:hAnsi="Arial"/>
+                <w:sz w:val="18"/>
+                <w:szCs w:val="18"/>
+              </w:rPr>
+              <w:t xml:space="preserve">L</w:t>
+            </w:r>
+          </w:p>
+        </w:tc>
+      </w:tr>
+      <w:tr>
+        <w:trPr>
+          <w:cantSplit/>
+        </w:trPr>
+        <w:tc>
+          <w:tcPr>
+            <w:tcW w:type="dxa" w:w="1700"/>
+            <w:tcBorders>
+              <w:top w:val="single" w:color="C9D1DA" w:sz="4"/>
+              <w:left w:val="single" w:color="C9D1DA" w:sz="4"/>
+              <w:bottom w:val="single" w:color="C9D1DA" w:sz="4"/>
+              <w:right w:val="single" w:color="C9D1DA" w:sz="4"/>
+            </w:tcBorders>
+            <w:shd w:fill="E3EEF9" w:color="auto" w:val="clear"/>
+            <w:tcMar>
+              <w:top w:type="dxa" w:w="70"/>
+              <w:left w:type="dxa" w:w="110"/>
+              <w:bottom w:type="dxa" w:w="70"/>
+              <w:right w:type="dxa" w:w="110"/>
+            </w:tcMar>
+          </w:tcPr>
+          <w:p>
+            <w:pPr>
+              <w:spacing w:after="0"/>
+            </w:pPr>
+            <w:r>
+              <w:rPr>
+                <w:rFonts w:ascii="Arial" w:cs="Arial" w:eastAsia="Arial" w:hAnsi="Arial"/>
+                <w:sz w:val="18"/>
+                <w:szCs w:val="18"/>
+              </w:rPr>
+              <w:t xml:space="preserve">U4 Forms, health and calendar</w:t>
+            </w:r>
+          </w:p>
+        </w:tc>
+        <w:tc>
+          <w:tcPr>
+            <w:tcW w:type="dxa" w:w="3600"/>
+            <w:tcBorders>
+              <w:top w:val="single" w:color="C9D1DA" w:sz="4"/>
+              <w:left w:val="single" w:color="C9D1DA" w:sz="4"/>
+              <w:bottom w:val="single" w:color="C9D1DA" w:sz="4"/>
+              <w:right w:val="single" w:color="C9D1DA" w:sz="4"/>
+            </w:tcBorders>
+            <w:tcMar>
+              <w:top w:type="dxa" w:w="70"/>
+              <w:left w:type="dxa" w:w="110"/>
+              <w:bottom w:type="dxa" w:w="70"/>
+              <w:right w:type="dxa" w:w="110"/>
+            </w:tcMar>
+          </w:tcPr>
+          <w:p>
+            <w:pPr>
+              <w:spacing w:after="0"/>
+            </w:pPr>
+            <w:r>
+              <w:rPr>
+                <w:rFonts w:ascii="Arial" w:cs="Arial" w:eastAsia="Arial" w:hAnsi="Arial"/>
+                <w:sz w:val="18"/>
+                <w:szCs w:val="18"/>
+              </w:rPr>
+              <w:t xml:space="preserve">In-house forms engine with e-signature (OI-11, resolved): excursion, consent and custom forms; immunisation upload and allergy records that appear on the educator roster and are checked during medication and meal logging; menus and events calendar.</w:t>
+            </w:r>
+          </w:p>
+        </w:tc>
+        <w:tc>
+          <w:tcPr>
+            <w:tcW w:type="dxa" w:w="1100"/>
+            <w:tcBorders>
+              <w:top w:val="single" w:color="C9D1DA" w:sz="4"/>
+              <w:left w:val="single" w:color="C9D1DA" w:sz="4"/>
+              <w:bottom w:val="single" w:color="C9D1DA" w:sz="4"/>
+              <w:right w:val="single" w:color="C9D1DA" w:sz="4"/>
+            </w:tcBorders>
+            <w:tcMar>
+              <w:top w:type="dxa" w:w="70"/>
+              <w:left w:type="dxa" w:w="110"/>
+              <w:bottom w:type="dxa" w:w="70"/>
+              <w:right w:type="dxa" w:w="110"/>
+            </w:tcMar>
+          </w:tcPr>
+          <w:p>
+            <w:pPr>
+              <w:spacing w:after="0"/>
+            </w:pPr>
+            <w:r>
+              <w:rPr>
+                <w:rFonts w:ascii="Arial" w:cs="Arial" w:eastAsia="Arial" w:hAnsi="Arial"/>
+                <w:sz w:val="18"/>
+                <w:szCs w:val="18"/>
+              </w:rPr>
+              <w:t xml:space="preserve">U3</w:t>
+            </w:r>
+          </w:p>
+        </w:tc>
+        <w:tc>
+          <w:tcPr>
+            <w:tcW w:type="dxa" w:w="2700"/>
+            <w:tcBorders>
+              <w:top w:val="single" w:color="C9D1DA" w:sz="4"/>
+              <w:left w:val="single" w:color="C9D1DA" w:sz="4"/>
+              <w:bottom w:val="single" w:color="C9D1DA" w:sz="4"/>
+              <w:right w:val="single" w:color="C9D1DA" w:sz="4"/>
+            </w:tcBorders>
+            <w:tcMar>
+              <w:top w:type="dxa" w:w="70"/>
+              <w:left w:type="dxa" w:w="110"/>
+              <w:bottom w:type="dxa" w:w="70"/>
+              <w:right w:type="dxa" w:w="110"/>
+            </w:tcMar>
+          </w:tcPr>
+          <w:p>
+            <w:pPr>
+              <w:spacing w:after="0"/>
+            </w:pPr>
+            <w:r>
+              <w:rPr>
+                <w:rFonts w:ascii="Arial" w:cs="Arial" w:eastAsia="Arial" w:hAnsi="Arial"/>
+                <w:sz w:val="18"/>
+                <w:szCs w:val="18"/>
+              </w:rPr>
+              <w:t xml:space="preserve">A parent signs an excursion form in the app; an allergy shows on the roster and flags a conflicting meal entry until it is acknowledged.</w:t>
+            </w:r>
+          </w:p>
+        </w:tc>
+        <w:tc>
+          <w:tcPr>
+            <w:tcW w:type="dxa" w:w="538"/>
+            <w:tcBorders>
+              <w:top w:val="single" w:color="C9D1DA" w:sz="4"/>
+              <w:left w:val="single" w:color="C9D1DA" w:sz="4"/>
+              <w:bottom w:val="single" w:color="C9D1DA" w:sz="4"/>
+              <w:right w:val="single" w:color="C9D1DA" w:sz="4"/>
+            </w:tcBorders>
+            <w:tcMar>
+              <w:top w:type="dxa" w:w="70"/>
+              <w:left w:type="dxa" w:w="110"/>
+              <w:bottom w:type="dxa" w:w="70"/>
+              <w:right w:type="dxa" w:w="110"/>
+            </w:tcMar>
+          </w:tcPr>
+          <w:p>
+            <w:pPr>
+              <w:spacing w:after="0"/>
+            </w:pPr>
+            <w:r>
+              <w:rPr>
+                <w:rFonts w:ascii="Arial" w:cs="Arial" w:eastAsia="Arial" w:hAnsi="Arial"/>
+                <w:sz w:val="18"/>
+                <w:szCs w:val="18"/>
+              </w:rPr>
+              <w:t xml:space="preserve">M</w:t>
+            </w:r>
+          </w:p>
+        </w:tc>
+      </w:tr>
+      <w:tr>
+        <w:trPr>
+          <w:cantSplit/>
+        </w:trPr>
+        <w:tc>
+          <w:tcPr>
+            <w:tcW w:type="dxa" w:w="1700"/>
+            <w:tcBorders>
+              <w:top w:val="single" w:color="C9D1DA" w:sz="4"/>
+              <w:left w:val="single" w:color="C9D1DA" w:sz="4"/>
+              <w:bottom w:val="single" w:color="C9D1DA" w:sz="4"/>
+              <w:right w:val="single" w:color="C9D1DA" w:sz="4"/>
+            </w:tcBorders>
+            <w:shd w:fill="FFF4E0" w:color="auto" w:val="clear"/>
+            <w:tcMar>
+              <w:top w:type="dxa" w:w="70"/>
+              <w:left w:type="dxa" w:w="110"/>
+              <w:bottom w:type="dxa" w:w="70"/>
+              <w:right w:type="dxa" w:w="110"/>
+            </w:tcMar>
+          </w:tcPr>
+          <w:p>
+            <w:pPr>
+              <w:spacing w:after="0"/>
+            </w:pPr>
+            <w:r>
+              <w:rPr>
+                <w:rFonts w:ascii="Arial" w:cs="Arial" w:eastAsia="Arial" w:hAnsi="Arial"/>
+                <w:sz w:val="18"/>
+                <w:szCs w:val="18"/>
+              </w:rPr>
+              <w:t xml:space="preserve">U5 Money and insight</w:t>
+            </w:r>
+          </w:p>
+        </w:tc>
+        <w:tc>
+          <w:tcPr>
+            <w:tcW w:type="dxa" w:w="3600"/>
+            <w:tcBorders>
+              <w:top w:val="single" w:color="C9D1DA" w:sz="4"/>
+              <w:left w:val="single" w:color="C9D1DA" w:sz="4"/>
+              <w:bottom w:val="single" w:color="C9D1DA" w:sz="4"/>
+              <w:right w:val="single" w:color="C9D1DA" w:sz="4"/>
+            </w:tcBorders>
+            <w:tcMar>
+              <w:top w:type="dxa" w:w="70"/>
+              <w:left w:type="dxa" w:w="110"/>
+              <w:bottom w:type="dxa" w:w="70"/>
+              <w:right w:type="dxa" w:w="110"/>
+            </w:tcMar>
+          </w:tcPr>
+          <w:p>
+            <w:pPr>
+              <w:spacing w:after="0"/>
+            </w:pPr>
+            <w:r>
+              <w:rPr>
+                <w:rFonts w:ascii="Arial" w:cs="Arial" w:eastAsia="Arial" w:hAnsi="Arial"/>
+                <w:sz w:val="18"/>
+                <w:szCs w:val="18"/>
+              </w:rPr>
+              <w:t xml:space="preserve">Fat Zebra gateway adapter (OI-12, resolved) with in-app payment and card update; owner analytics dashboard (occupancy, attendance trends, fees vs collections).</w:t>
+            </w:r>
+          </w:p>
+        </w:tc>
+        <w:tc>
+          <w:tcPr>
+            <w:tcW w:type="dxa" w:w="1100"/>
+            <w:tcBorders>
+              <w:top w:val="single" w:color="C9D1DA" w:sz="4"/>
+              <w:left w:val="single" w:color="C9D1DA" w:sz="4"/>
+              <w:bottom w:val="single" w:color="C9D1DA" w:sz="4"/>
+              <w:right w:val="single" w:color="C9D1DA" w:sz="4"/>
+            </w:tcBorders>
+            <w:tcMar>
+              <w:top w:type="dxa" w:w="70"/>
+              <w:left w:type="dxa" w:w="110"/>
+              <w:bottom w:type="dxa" w:w="70"/>
+              <w:right w:type="dxa" w:w="110"/>
+            </w:tcMar>
+          </w:tcPr>
+          <w:p>
+            <w:pPr>
+              <w:spacing w:after="0"/>
+            </w:pPr>
+            <w:r>
+              <w:rPr>
+                <w:rFonts w:ascii="Arial" w:cs="Arial" w:eastAsia="Arial" w:hAnsi="Arial"/>
+                <w:sz w:val="18"/>
+                <w:szCs w:val="18"/>
+              </w:rPr>
+              <w:t xml:space="preserve">U3; merchant account</w:t>
+            </w:r>
+          </w:p>
+        </w:tc>
+        <w:tc>
+          <w:tcPr>
+            <w:tcW w:type="dxa" w:w="2700"/>
+            <w:tcBorders>
+              <w:top w:val="single" w:color="C9D1DA" w:sz="4"/>
+              <w:left w:val="single" w:color="C9D1DA" w:sz="4"/>
+              <w:bottom w:val="single" w:color="C9D1DA" w:sz="4"/>
+              <w:right w:val="single" w:color="C9D1DA" w:sz="4"/>
+            </w:tcBorders>
+            <w:tcMar>
+              <w:top w:type="dxa" w:w="70"/>
+              <w:left w:type="dxa" w:w="110"/>
+              <w:bottom w:type="dxa" w:w="70"/>
+              <w:right w:type="dxa" w:w="110"/>
+            </w:tcMar>
+          </w:tcPr>
+          <w:p>
+            <w:pPr>
+              <w:spacing w:after="0"/>
+            </w:pPr>
+            <w:r>
+              <w:rPr>
+                <w:rFonts w:ascii="Arial" w:cs="Arial" w:eastAsia="Arial" w:hAnsi="Arial"/>
+                <w:sz w:val="18"/>
+                <w:szCs w:val="18"/>
+              </w:rPr>
+              <w:t xml:space="preserve">A sandbox payment from the parent app reconciles to the ledger; dashboard figures match the underlying reports.</w:t>
+            </w:r>
+          </w:p>
+        </w:tc>
+        <w:tc>
+          <w:tcPr>
+            <w:tcW w:type="dxa" w:w="538"/>
+            <w:tcBorders>
+              <w:top w:val="single" w:color="C9D1DA" w:sz="4"/>
+              <w:left w:val="single" w:color="C9D1DA" w:sz="4"/>
+              <w:bottom w:val="single" w:color="C9D1DA" w:sz="4"/>
+              <w:right w:val="single" w:color="C9D1DA" w:sz="4"/>
+            </w:tcBorders>
+            <w:tcMar>
+              <w:top w:type="dxa" w:w="70"/>
+              <w:left w:type="dxa" w:w="110"/>
+              <w:bottom w:type="dxa" w:w="70"/>
+              <w:right w:type="dxa" w:w="110"/>
+            </w:tcMar>
+          </w:tcPr>
+          <w:p>
+            <w:pPr>
+              <w:spacing w:after="0"/>
+            </w:pPr>
+            <w:r>
+              <w:rPr>
+                <w:rFonts w:ascii="Arial" w:cs="Arial" w:eastAsia="Arial" w:hAnsi="Arial"/>
+                <w:sz w:val="18"/>
+                <w:szCs w:val="18"/>
+              </w:rPr>
+              <w:t xml:space="preserve">M</w:t>
+            </w:r>
+          </w:p>
+        </w:tc>
+      </w:tr>
+    </w:tbl>
+    <w:p>
+      <w:pPr>
+        <w:spacing w:after="60"/>
+      </w:pPr>
+    </w:p>
+    <w:p>
+      <w:pPr>
+        <w:spacing w:after="120" w:line="276"/>
+      </w:pPr>
+      <w:r>
+        <w:rPr>
+          <w:rFonts w:ascii="Arial" w:cs="Arial" w:eastAsia="Arial" w:hAnsi="Arial"/>
+          <w:b/>
+          <w:bCs/>
+          <w:sz w:val="20"/>
+          <w:szCs w:val="20"/>
+        </w:rPr>
+        <w:t xml:space="preserve">Phase 2 changes: </w:t>
+      </w:r>
+      <w:r>
+        <w:rPr>
+          <w:rFonts w:ascii="Arial" w:cs="Arial" w:eastAsia="Arial" w:hAnsi="Arial"/>
+          <w:sz w:val="20"/>
+          <w:szCs w:val="20"/>
+        </w:rPr>
+        <w:t xml:space="preserve">keep the order in section 7 and widen each stream to cover the gaps above.</w:t>
+      </w:r>
+    </w:p>
+    <w:p>
+      <w:pPr>
+        <w:pStyle w:val="ListParagraph"/>
+        <w:numPr>
+          <w:ilvl w:val="0"/>
+          <w:numId w:val="2"/>
+        </w:numPr>
+        <w:spacing w:after="60" w:line="264"/>
+      </w:pPr>
+      <w:r>
+        <w:rPr>
+          <w:rFonts w:ascii="Arial" w:cs="Arial" w:eastAsia="Arial" w:hAnsi="Arial"/>
+          <w:b/>
+          <w:bCs/>
+          <w:sz w:val="20"/>
+          <w:szCs w:val="20"/>
+        </w:rPr>
+        <w:t xml:space="preserve">2A Learning: </w:t>
+      </w:r>
+      <w:r>
+        <w:rPr>
+          <w:rFonts w:ascii="Arial" w:cs="Arial" w:eastAsia="Arial" w:hAnsi="Arial"/>
+          <w:sz w:val="20"/>
+          <w:szCs w:val="20"/>
+        </w:rPr>
+        <w:t xml:space="preserve">moved into Phase 1 as U2, including programming/planning and child portfolios.</w:t>
+      </w:r>
+    </w:p>
+    <w:p>
+      <w:pPr>
+        <w:pStyle w:val="ListParagraph"/>
+        <w:numPr>
+          <w:ilvl w:val="0"/>
+          <w:numId w:val="2"/>
+        </w:numPr>
+        <w:spacing w:after="60" w:line="264"/>
+      </w:pPr>
+      <w:r>
+        <w:rPr>
+          <w:rFonts w:ascii="Arial" w:cs="Arial" w:eastAsia="Arial" w:hAnsi="Arial"/>
+          <w:b/>
+          <w:bCs/>
+          <w:sz w:val="20"/>
+          <w:szCs w:val="20"/>
+        </w:rPr>
+        <w:t xml:space="preserve">2B Enrolment: </w:t>
+      </w:r>
+      <w:r>
+        <w:rPr>
+          <w:rFonts w:ascii="Arial" w:cs="Arial" w:eastAsia="Arial" w:hAnsi="Arial"/>
+          <w:sz w:val="20"/>
+          <w:szCs w:val="20"/>
+        </w:rPr>
+        <w:t xml:space="preserve">add an enquiry CRM (enquiry forms, follow-ups) ahead of the waitlist and offer flow.</w:t>
+      </w:r>
+    </w:p>
+    <w:p>
+      <w:pPr>
+        <w:pStyle w:val="ListParagraph"/>
+        <w:numPr>
+          <w:ilvl w:val="0"/>
+          <w:numId w:val="2"/>
+        </w:numPr>
+        <w:spacing w:after="60" w:line="264"/>
+      </w:pPr>
+      <w:r>
+        <w:rPr>
+          <w:rFonts w:ascii="Arial" w:cs="Arial" w:eastAsia="Arial" w:hAnsi="Arial"/>
+          <w:b/>
+          <w:bCs/>
+          <w:sz w:val="20"/>
+          <w:szCs w:val="20"/>
+        </w:rPr>
+        <w:t xml:space="preserve">2C Staff and ratios: </w:t>
+      </w:r>
+      <w:r>
+        <w:rPr>
+          <w:rFonts w:ascii="Arial" w:cs="Arial" w:eastAsia="Arial" w:hAnsi="Arial"/>
+          <w:sz w:val="20"/>
+          <w:szCs w:val="20"/>
+        </w:rPr>
+        <w:t xml:space="preserve">add staff sign-in/out timesheets, which the ratio engine needs anyway.</w:t>
+      </w:r>
+    </w:p>
+    <w:p>
+      <w:pPr>
+        <w:pStyle w:val="ListParagraph"/>
+        <w:numPr>
+          <w:ilvl w:val="0"/>
+          <w:numId w:val="2"/>
+        </w:numPr>
+        <w:spacing w:after="60" w:line="264"/>
+      </w:pPr>
+      <w:r>
+        <w:rPr>
+          <w:rFonts w:ascii="Arial" w:cs="Arial" w:eastAsia="Arial" w:hAnsi="Arial"/>
+          <w:b/>
+          <w:bCs/>
+          <w:sz w:val="20"/>
+          <w:szCs w:val="20"/>
+        </w:rPr>
+        <w:t xml:space="preserve">2D Rostering: </w:t>
+      </w:r>
+      <w:r>
+        <w:rPr>
+          <w:rFonts w:ascii="Arial" w:cs="Arial" w:eastAsia="Arial" w:hAnsi="Arial"/>
+          <w:sz w:val="20"/>
+          <w:szCs w:val="20"/>
+        </w:rPr>
+        <w:t xml:space="preserve">add vacant-shift bidding. Defer AI roster forecasting until real attendance history exists.</w:t>
+      </w:r>
+    </w:p>
+    <w:p>
+      <w:pPr>
+        <w:pStyle w:val="ListParagraph"/>
+        <w:numPr>
+          <w:ilvl w:val="0"/>
+          <w:numId w:val="2"/>
+        </w:numPr>
+        <w:spacing w:after="60" w:line="264"/>
+      </w:pPr>
+      <w:r>
+        <w:rPr>
+          <w:rFonts w:ascii="Arial" w:cs="Arial" w:eastAsia="Arial" w:hAnsi="Arial"/>
+          <w:b/>
+          <w:bCs/>
+          <w:sz w:val="20"/>
+          <w:szCs w:val="20"/>
+        </w:rPr>
+        <w:t xml:space="preserve">2E Compliance (new, approved): </w:t>
+      </w:r>
+      <w:r>
+        <w:rPr>
+          <w:rFonts w:ascii="Arial" w:cs="Arial" w:eastAsia="Arial" w:hAnsi="Arial"/>
+          <w:sz w:val="20"/>
+          <w:szCs w:val="20"/>
+        </w:rPr>
+        <w:t xml:space="preserve">hazard and maintenance logs, daily checklists, responsible-person log, drills, policies and QIP, as specified in BRD v2.2 §13B (CMP-001 to CMP-009).</w:t>
+      </w:r>
+    </w:p>
+    <w:p>
+      <w:pPr>
+        <w:spacing w:after="120" w:line="276"/>
+      </w:pPr>
+      <w:r>
+        <w:rPr>
+          <w:rFonts w:ascii="Arial" w:cs="Arial" w:eastAsia="Arial" w:hAnsi="Arial"/>
+          <w:b/>
+          <w:bCs/>
+          <w:sz w:val="20"/>
+          <w:szCs w:val="20"/>
+        </w:rPr>
+        <w:t xml:space="preserve">Phase 3 additions: </w:t>
+      </w:r>
+      <w:r>
+        <w:rPr>
+          <w:rFonts w:ascii="Arial" w:cs="Arial" w:eastAsia="Arial" w:hAnsi="Arial"/>
+          <w:sz w:val="20"/>
+          <w:szCs w:val="20"/>
+        </w:rPr>
+        <w:t xml:space="preserve">multi-centre head-office view, multilingual support (at least the six languages OWNA offers), a public API, and HR/payroll through integration with existing payroll providers rather than building payroll (providers to be chosen: OI-19). The marketplace is not planned; reviews suggest it hurts usability.</w:t>
+      </w:r>
+    </w:p>
+    <w:tbl>
+      <w:tblPr>
+        <w:tblW w:type="dxa" w:w="9638"/>
+        <w:tblBorders>
+          <w:left w:val="single" w:color="1B3A5C" w:sz="24"/>
+        </w:tblBorders>
+      </w:tblPr>
+      <w:tblGrid>
+        <w:gridCol w:w="9638"/>
+      </w:tblGrid>
+      <w:tr>
+        <w:tc>
+          <w:tcPr>
+            <w:tcW w:type="dxa" w:w="9638"/>
+            <w:tcBorders>
+              <w:top w:val="single" w:color="C9D1DA" w:sz="4"/>
+              <w:left w:val="single" w:color="C9D1DA" w:sz="4"/>
+              <w:bottom w:val="single" w:color="C9D1DA" w:sz="4"/>
+              <w:right w:val="single" w:color="C9D1DA" w:sz="4"/>
+            </w:tcBorders>
+            <w:shd w:fill="EAF1F8" w:color="auto" w:val="clear"/>
+            <w:tcMar>
+              <w:top w:type="dxa" w:w="70"/>
+              <w:left w:type="dxa" w:w="110"/>
+              <w:bottom w:type="dxa" w:w="70"/>
+              <w:right w:type="dxa" w:w="110"/>
+            </w:tcMar>
+          </w:tcPr>
+          <w:p>
+            <w:pPr>
+              <w:spacing w:after="0" w:line="264"/>
+            </w:pPr>
+            <w:r>
+              <w:rPr>
+                <w:rFonts w:ascii="Arial" w:cs="Arial" w:eastAsia="Arial" w:hAnsi="Arial"/>
+                <w:b/>
+                <w:bCs/>
+                <w:sz w:val="20"/>
+                <w:szCs w:val="20"/>
+              </w:rPr>
+              <w:t xml:space="preserve">Recommended order: </w:t>
+            </w:r>
+            <w:r>
+              <w:rPr>
+                <w:rFonts w:ascii="Arial" w:cs="Arial" w:eastAsia="Arial" w:hAnsi="Arial"/>
+                <w:sz w:val="20"/>
+                <w:szCs w:val="20"/>
+              </w:rPr>
+              <w:t xml:space="preserve">U0 → U1 → U2 → U3 → U4 → U5, then Phase 2 (2B, 2C, 2D, 2E). Learning sits inside the family feed, as OWNA does it, so it follows the feed and comes before the parent app. Re-run the security review and performance tests (against docs/performance-slas.md) at the end of U3 and U5.</w:t>
+            </w:r>
+          </w:p>
+        </w:tc>
+      </w:tr>
+    </w:tbl>
+    <w:p>
+      <w:pPr>
+        <w:spacing w:after="60"/>
+      </w:pPr>
+    </w:p>
+    <w:p>
+      <w:pPr>
+        <w:pStyle w:val="Heading2"/>
+        <w:spacing w:after="100" w:before="220"/>
+      </w:pPr>
+      <w:r>
+        <w:rPr>
+          <w:rFonts w:ascii="Arial" w:cs="Arial" w:eastAsia="Arial" w:hAnsi="Arial"/>
+          <w:b/>
+          <w:bCs/>
+          <w:color w:val="1B3A5C"/>
+          <w:sz w:val="24"/>
+          <w:szCs w:val="24"/>
+        </w:rPr>
+        <w:t xml:space="preserve">13.5 Decisions made (5 October 2026)</w:t>
+      </w:r>
+    </w:p>
+    <w:p>
+      <w:pPr>
+        <w:pStyle w:val="ListParagraph"/>
+        <w:numPr>
+          <w:ilvl w:val="0"/>
+          <w:numId w:val="2"/>
+        </w:numPr>
+        <w:spacing w:after="60" w:line="264"/>
+      </w:pPr>
+      <w:r>
+        <w:rPr>
+          <w:rFonts w:ascii="Arial" w:cs="Arial" w:eastAsia="Arial" w:hAnsi="Arial"/>
+          <w:b/>
+          <w:bCs/>
+          <w:sz w:val="20"/>
+          <w:szCs w:val="20"/>
+        </w:rPr>
+        <w:t xml:space="preserve">Compliance: </w:t>
+      </w:r>
+      <w:r>
+        <w:rPr>
+          <w:rFonts w:ascii="Arial" w:cs="Arial" w:eastAsia="Arial" w:hAnsi="Arial"/>
+          <w:sz w:val="20"/>
+          <w:szCs w:val="20"/>
+        </w:rPr>
+        <w:t xml:space="preserve">approved as Phase 2E; BRD updated to v2.2 with new §13B.</w:t>
+      </w:r>
+    </w:p>
+    <w:p>
+      <w:pPr>
+        <w:pStyle w:val="ListParagraph"/>
+        <w:numPr>
+          <w:ilvl w:val="0"/>
+          <w:numId w:val="2"/>
+        </w:numPr>
+        <w:spacing w:after="60" w:line="264"/>
+      </w:pPr>
+      <w:r>
+        <w:rPr>
+          <w:rFonts w:ascii="Arial" w:cs="Arial" w:eastAsia="Arial" w:hAnsi="Arial"/>
+          <w:b/>
+          <w:bCs/>
+          <w:sz w:val="20"/>
+          <w:szCs w:val="20"/>
+        </w:rPr>
+        <w:t xml:space="preserve">HR and payroll: </w:t>
+      </w:r>
+      <w:r>
+        <w:rPr>
+          <w:rFonts w:ascii="Arial" w:cs="Arial" w:eastAsia="Arial" w:hAnsi="Arial"/>
+          <w:sz w:val="20"/>
+          <w:szCs w:val="20"/>
+        </w:rPr>
+        <w:t xml:space="preserve">integrate with existing payroll providers rather than build (BRD v2.2 §13B.4). Which providers is open item OI-19.</w:t>
+      </w:r>
+    </w:p>
+    <w:p>
+      <w:pPr>
+        <w:pStyle w:val="ListParagraph"/>
+        <w:numPr>
+          <w:ilvl w:val="0"/>
+          <w:numId w:val="2"/>
+        </w:numPr>
+        <w:spacing w:after="60" w:line="264"/>
+      </w:pPr>
+      <w:r>
+        <w:rPr>
+          <w:rFonts w:ascii="Arial" w:cs="Arial" w:eastAsia="Arial" w:hAnsi="Arial"/>
+          <w:b/>
+          <w:bCs/>
+          <w:sz w:val="20"/>
+          <w:szCs w:val="20"/>
+        </w:rPr>
+        <w:t xml:space="preserve">Learning: </w:t>
+      </w:r>
+      <w:r>
+        <w:rPr>
+          <w:rFonts w:ascii="Arial" w:cs="Arial" w:eastAsia="Arial" w:hAnsi="Arial"/>
+          <w:sz w:val="20"/>
+          <w:szCs w:val="20"/>
+        </w:rPr>
+        <w:t xml:space="preserve">follow OWNA’s approach. Learning moves into Phase 1 and is delivered through the family feed (stage U2), resolving OI-04.</w:t>
+      </w:r>
+    </w:p>
+    <w:p>
+      <w:pPr>
+        <w:pStyle w:val="ListParagraph"/>
+        <w:numPr>
+          <w:ilvl w:val="0"/>
+          <w:numId w:val="2"/>
+        </w:numPr>
+        <w:spacing w:after="60" w:line="264"/>
+      </w:pPr>
+      <w:r>
+        <w:rPr>
+          <w:rFonts w:ascii="Arial" w:cs="Arial" w:eastAsia="Arial" w:hAnsi="Arial"/>
+          <w:b/>
+          <w:bCs/>
+          <w:sz w:val="20"/>
+          <w:szCs w:val="20"/>
+        </w:rPr>
+        <w:t xml:space="preserve">Media storage (OI-09): </w:t>
+      </w:r>
+      <w:r>
+        <w:rPr>
+          <w:rFonts w:ascii="Arial" w:cs="Arial" w:eastAsia="Arial" w:hAnsi="Arial"/>
+          <w:sz w:val="20"/>
+          <w:szCs w:val="20"/>
+        </w:rPr>
+        <w:t xml:space="preserve">S3-compatible object storage behind a storage interface: AWS S3 in Sydney for deployed environments, MinIO locally. Images are re-encoded on upload to strip EXIF and GPS data; buckets are private and read through short-lived signed URLs. See ADR 0004.</w:t>
+      </w:r>
+    </w:p>
+    <w:p>
+      <w:pPr>
+        <w:pStyle w:val="ListParagraph"/>
+        <w:numPr>
+          <w:ilvl w:val="0"/>
+          <w:numId w:val="2"/>
+        </w:numPr>
+        <w:spacing w:after="60" w:line="264"/>
+      </w:pPr>
+      <w:r>
+        <w:rPr>
+          <w:rFonts w:ascii="Arial" w:cs="Arial" w:eastAsia="Arial" w:hAnsi="Arial"/>
+          <w:b/>
+          <w:bCs/>
+          <w:sz w:val="20"/>
+          <w:szCs w:val="20"/>
+        </w:rPr>
+        <w:t xml:space="preserve">Digital forms (OI-11): </w:t>
+      </w:r>
+      <w:r>
+        <w:rPr>
+          <w:rFonts w:ascii="Arial" w:cs="Arial" w:eastAsia="Arial" w:hAnsi="Arial"/>
+          <w:sz w:val="20"/>
+          <w:szCs w:val="20"/>
+        </w:rPr>
+        <w:t xml:space="preserve">built in-house rather than using a third-party e-signature service, so form data stays in Australia. Versioned templates, immutable signed submissions, drawn or typed signature with identity, time and device evidence, all audit-logged. Legal review of the signing method before pilot. See ADR 0005.</w:t>
+      </w:r>
+    </w:p>
+    <w:p>
+      <w:pPr>
+        <w:pStyle w:val="ListParagraph"/>
+        <w:numPr>
+          <w:ilvl w:val="0"/>
+          <w:numId w:val="2"/>
+        </w:numPr>
+        <w:spacing w:after="60" w:line="264"/>
+      </w:pPr>
+      <w:r>
+        <w:rPr>
+          <w:rFonts w:ascii="Arial" w:cs="Arial" w:eastAsia="Arial" w:hAnsi="Arial"/>
+          <w:b/>
+          <w:bCs/>
+          <w:sz w:val="20"/>
+          <w:szCs w:val="20"/>
+        </w:rPr>
+        <w:t xml:space="preserve">Payment gateway (OI-06, OI-12): </w:t>
+      </w:r>
+      <w:r>
+        <w:rPr>
+          <w:rFonts w:ascii="Arial" w:cs="Arial" w:eastAsia="Arial" w:hAnsi="Arial"/>
+          <w:sz w:val="20"/>
+          <w:szCs w:val="20"/>
+        </w:rPr>
+        <w:t xml:space="preserve">Fat Zebra (Australian; hosted card fields keep card data off our servers). Ezidebit is the fallback. Stripe was ruled out because its Australian direct-debit terms transfer personal information to the United States. To confirm during merchant onboarding: BECS direct debit support, Australian data hosting and webhook signing. A merchant account and sandbox credentials are needed from the business; until then the mocked gateway stays the default. See ADR 0006.</w:t>
+      </w:r>
+    </w:p>
+    <w:p>
+      <w:pPr>
+        <w:pStyle w:val="Heading1"/>
+        <w:spacing w:after="140" w:before="320"/>
+      </w:pPr>
+      <w:r>
+        <w:rPr>
+          <w:rFonts w:ascii="Arial" w:cs="Arial" w:eastAsia="Arial" w:hAnsi="Arial"/>
+          <w:b/>
+          <w:bCs/>
+          <w:color w:val="1B3A5C"/>
+          <w:sz w:val="30"/>
+          <w:szCs w:val="30"/>
+        </w:rPr>
+        <w:t xml:space="preserve">Sources and starting points</w:t>
+      </w:r>
+    </w:p>
+    <w:p>
+      <w:pPr>
+        <w:pStyle w:val="ListParagraph"/>
+        <w:numPr>
+          <w:ilvl w:val="0"/>
+          <w:numId w:val="2"/>
+        </w:numPr>
+        <w:spacing w:after="60" w:line="264"/>
+      </w:pPr>
+      <w:r>
+        <w:rPr>
+          <w:rFonts w:ascii="Arial" w:cs="Arial" w:eastAsia="Arial" w:hAnsi="Arial"/>
+          <w:sz w:val="20"/>
+          <w:szCs w:val="20"/>
+        </w:rPr>
+        <w:t xml:space="preserve">Australian Government Department of Education – registered child care software and the Child Care Subsidy system pages (education.gov.au/early-childhood/providers). Not read in detail for this plan; confirm directly.</w:t>
+      </w:r>
+    </w:p>
+    <w:p>
+      <w:pPr>
+        <w:pStyle w:val="ListParagraph"/>
+        <w:numPr>
+          <w:ilvl w:val="0"/>
+          <w:numId w:val="2"/>
+        </w:numPr>
+        <w:spacing w:after="60" w:line="264"/>
+      </w:pPr>
+      <w:r>
+        <w:rPr>
+          <w:rFonts w:ascii="Arial" w:cs="Arial" w:eastAsia="Arial" w:hAnsi="Arial"/>
+          <w:sz w:val="20"/>
+          <w:szCs w:val="20"/>
+        </w:rPr>
+        <w:t xml:space="preserve">Services Australia – child care providers, PRODA information.</w:t>
+      </w:r>
+    </w:p>
+    <w:p>
+      <w:pPr>
+        <w:pStyle w:val="ListParagraph"/>
+        <w:numPr>
+          <w:ilvl w:val="0"/>
+          <w:numId w:val="2"/>
+        </w:numPr>
+        <w:spacing w:after="60" w:line="264"/>
+      </w:pPr>
+      <w:r>
+        <w:rPr>
+          <w:rFonts w:ascii="Arial" w:cs="Arial" w:eastAsia="Arial" w:hAnsi="Arial"/>
+          <w:sz w:val="20"/>
+          <w:szCs w:val="20"/>
+        </w:rPr>
+        <w:t xml:space="preserve">ACECQA – educator-to-child ratios and the ratio calculator (acecqa.gov.au/nqf/educator-to-child-ratios).</w:t>
+      </w:r>
+    </w:p>
+    <w:p>
+      <w:pPr>
+        <w:pStyle w:val="ListParagraph"/>
+        <w:numPr>
+          <w:ilvl w:val="0"/>
+          <w:numId w:val="2"/>
+        </w:numPr>
+        <w:spacing w:after="60" w:line="264"/>
+      </w:pPr>
+      <w:r>
+        <w:rPr>
+          <w:rFonts w:ascii="Arial" w:cs="Arial" w:eastAsia="Arial" w:hAnsi="Arial"/>
+          <w:sz w:val="20"/>
+          <w:szCs w:val="20"/>
+        </w:rPr>
+        <w:t xml:space="preserve">BRD v2.2 (Next_Gen_Childcare_BRD_v2.2.docx), including Sections 13A and 13B and Appendix C. Supersedes v2.1.</w:t>
+      </w:r>
+    </w:p>
+    <w:p>
+      <w:pPr>
+        <w:pStyle w:val="ListParagraph"/>
+        <w:numPr>
+          <w:ilvl w:val="0"/>
+          <w:numId w:val="2"/>
+        </w:numPr>
+        <w:spacing w:after="60" w:line="264"/>
+      </w:pPr>
+      <w:r>
+        <w:rPr>
+          <w:rFonts w:ascii="Arial" w:cs="Arial" w:eastAsia="Arial" w:hAnsi="Arial"/>
+          <w:sz w:val="20"/>
+          <w:szCs w:val="20"/>
+        </w:rPr>
+        <w:t xml:space="preserve">OWNA website (owna.com.au) and parent app feature page (owna.app/features/childcare-app-for-parents). Viewed 4 October 2026.</w:t>
+      </w:r>
+    </w:p>
+    <w:p>
+      <w:pPr>
+        <w:pStyle w:val="ListParagraph"/>
+        <w:numPr>
+          <w:ilvl w:val="0"/>
+          <w:numId w:val="2"/>
+        </w:numPr>
+        <w:spacing w:after="60" w:line="264"/>
+      </w:pPr>
+      <w:r>
+        <w:rPr>
+          <w:rFonts w:ascii="Arial" w:cs="Arial" w:eastAsia="Arial" w:hAnsi="Arial"/>
+          <w:sz w:val="20"/>
+          <w:szCs w:val="20"/>
+        </w:rPr>
+        <w:t xml:space="preserve">OWNA Childcare App on the Apple App Store, Australia (apps.apple.com/au/app/owna-childcare-app/id1318604128): description, rating and reviews. Viewed 4 October 2026.</w:t>
+      </w:r>
+    </w:p>
+    <w:p>
+      <w:pPr>
+        <w:pStyle w:val="ListParagraph"/>
+        <w:numPr>
+          <w:ilvl w:val="0"/>
+          <w:numId w:val="2"/>
+        </w:numPr>
+        <w:spacing w:after="60" w:line="264"/>
+      </w:pPr>
+      <w:r>
+        <w:rPr>
+          <w:rFonts w:ascii="Arial" w:cs="Arial" w:eastAsia="Arial" w:hAnsi="Arial"/>
+          <w:sz w:val="20"/>
+          <w:szCs w:val="20"/>
+        </w:rPr>
+        <w:t xml:space="preserve">OWNA features and reviews on GetApp (getapp.com/education-childcare-software/a/owna/features). Viewed 4 October 2026.</w:t>
       </w:r>
     </w:p>
     <w:sectPr>
@@ -15278,7 +19747,7 @@
         <w:sz w:val="16"/>
         <w:szCs w:val="16"/>
       </w:rPr>
-      <w:t xml:space="preserve">Next-Gen Childcare Platform | Delivery Plan (BRD v2.1)</w:t>
+      <w:t xml:space="preserve">Next-Gen Childcare Platform | Delivery Plan (BRD v2.2)</w:t>
     </w:r>
     <w:r>
       <w:rPr>

</xml_diff>

<commit_message>
Delivery Plan section 14 (USP review and stage plan); retention schema and migration
Co-Authored-By: Claude Sonnet 5.5 <noreply@anthropic.com>
</commit_message>
<xml_diff>
--- a/Requirement and design/Next_Gen_Childcare_Delivery_Plan.docx
+++ b/Requirement and design/Next_Gen_Childcare_Delivery_Plan.docx
@@ -48,7 +48,7 @@
           <w:sz w:val="20"/>
           <w:szCs w:val="20"/>
         </w:rPr>
-        <w:t xml:space="preserve">How to build a production-grade release of BRD v2.1  |  Prepared 2 October 2026  |  Updated 5 October 2026 (section 13: OWNA gap analysis and decisions)</w:t>
+        <w:t xml:space="preserve">How to build a production-grade release of BRD v2.1  |  Prepared 2 October 2026  |  Updated 11 October 2026 (section 14: competitor USP review; section 13: OWNA gap analysis)</w:t>
       </w:r>
     </w:p>
     <w:p>
@@ -19551,7 +19551,37 @@
           <w:sz w:val="30"/>
           <w:szCs w:val="30"/>
         </w:rPr>
-        <w:t xml:space="preserve">Sources and starting points</w:t>
+        <w:t xml:space="preserve">14. Competitor USP review and update plan (11 October 2026)</w:t>
+      </w:r>
+    </w:p>
+    <w:p>
+      <w:pPr>
+        <w:spacing w:after="120" w:line="276"/>
+      </w:pPr>
+      <w:r>
+        <w:rPr>
+          <w:rFonts w:ascii="Arial" w:cs="Arial" w:eastAsia="Arial" w:hAnsi="Arial"/>
+          <w:sz w:val="20"/>
+          <w:szCs w:val="20"/>
+        </w:rPr>
+        <w:t xml:space="preserve">Added 11 October 2026. Seven USPs claimed by other Australian childcare apps were checked against BRD v2.2. The gaps are now requirements in BRD v2.3 (section 36 and PAR-015). This section sets the delivery order. The working copy of the stage plan is docs/usp-gap-closure-plan.md, and every decision is in docs/decision-log.md.</w:t>
+      </w:r>
+    </w:p>
+    <w:p>
+      <w:pPr>
+        <w:pStyle w:val="Heading2"/>
+        <w:spacing w:after="100" w:before="220"/>
+      </w:pPr>
+      <w:r>
+        <w:rPr>
+          <w:rFonts w:ascii="Arial" w:cs="Arial" w:eastAsia="Arial" w:hAnsi="Arial"/>
+          <w:b/>
+          <w:bCs/>
+          <w:color w:val="1B3A5C"/>
+          <w:sz w:val="24"/>
+          <w:szCs w:val="24"/>
+        </w:rPr>
+        <w:t xml:space="preserve">14.1 Where the build stands</w:t>
       </w:r>
     </w:p>
     <w:p>
@@ -19569,7 +19599,7 @@
           <w:sz w:val="20"/>
           <w:szCs w:val="20"/>
         </w:rPr>
-        <w:t xml:space="preserve">Australian Government Department of Education – registered child care software and the Child Care Subsidy system pages (education.gov.au/early-childhood/providers). Not read in detail for this plan; confirm directly.</w:t>
+        <w:t xml:space="preserve">Built and tested: backend Stages 0–5; U0 and U1; U2 learning API, family feed, offline drafts and portal screens; U3 parent app (Today, Learning, Messages, Bills, absences, casual days, pickup) with Pickups and Family requests pages for staff.</w:t>
       </w:r>
     </w:p>
     <w:p>
@@ -19587,7 +19617,7 @@
           <w:sz w:val="20"/>
           <w:szCs w:val="20"/>
         </w:rPr>
-        <w:t xml:space="preserve">Services Australia – child care providers, PRODA information.</w:t>
+        <w:t xml:space="preserve">Stage PR (pilot readiness), part 1 done: rotating refresh tokens and per-role sessions (OI-28), MFA with recovery codes and optional enforcement for admins (OI-16), read-access audit on 21 sensitive routes (OI-18), and the fixes from the security review of the family-requests module. 379 API tests and 212 parent-app tests pass.</w:t>
       </w:r>
     </w:p>
     <w:p>
@@ -19605,7 +19635,7 @@
           <w:sz w:val="20"/>
           <w:szCs w:val="20"/>
         </w:rPr>
-        <w:t xml:space="preserve">ACECQA – educator-to-child ratios and the ratio calculator (acecqa.gov.au/nqf/educator-to-child-ratios).</w:t>
+        <w:t xml:space="preserve">Stage PR part 2 in progress: records retention, legal hold and guardian data export (OI-17).</w:t>
       </w:r>
     </w:p>
     <w:p>
@@ -19623,7 +19653,2203 @@
           <w:sz w:val="20"/>
           <w:szCs w:val="20"/>
         </w:rPr>
-        <w:t xml:space="preserve">BRD v2.2 (Next_Gen_Childcare_BRD_v2.2.docx), including Sections 13A and 13B and Appendix C. Supersedes v2.1.</w:t>
+        <w:t xml:space="preserve">Mocked or open: payment gateway (OI-12), CCS registration (OI-14), iOS builds, educator-app on-device storage (OI-22), the VPS being outside Australia (demo data only).</w:t>
+      </w:r>
+    </w:p>
+    <w:p>
+      <w:pPr>
+        <w:pStyle w:val="Heading2"/>
+        <w:spacing w:after="100" w:before="220"/>
+      </w:pPr>
+      <w:r>
+        <w:rPr>
+          <w:rFonts w:ascii="Arial" w:cs="Arial" w:eastAsia="Arial" w:hAnsi="Arial"/>
+          <w:b/>
+          <w:bCs/>
+          <w:color w:val="1B3A5C"/>
+          <w:sz w:val="24"/>
+          <w:szCs w:val="24"/>
+        </w:rPr>
+        <w:t xml:space="preserve">14.2 Result of the USP review</w:t>
+      </w:r>
+    </w:p>
+    <w:tbl>
+      <w:tblPr>
+        <w:tblW w:type="dxa" w:w="9638"/>
+        <w:tblBorders>
+          <w:top w:val="single" w:color="auto" w:sz="4"/>
+          <w:left w:val="single" w:color="auto" w:sz="4"/>
+          <w:bottom w:val="single" w:color="auto" w:sz="4"/>
+          <w:right w:val="single" w:color="auto" w:sz="4"/>
+          <w:insideH w:val="single" w:color="auto" w:sz="4"/>
+          <w:insideV w:val="single" w:color="auto" w:sz="4"/>
+        </w:tblBorders>
+      </w:tblPr>
+      <w:tblGrid>
+        <w:gridCol w:w="2500"/>
+        <w:gridCol w:w="3300"/>
+        <w:gridCol w:w="3838"/>
+      </w:tblGrid>
+      <w:tr>
+        <w:trPr>
+          <w:tblHeader/>
+        </w:trPr>
+        <w:tc>
+          <w:tcPr>
+            <w:tcW w:type="dxa" w:w="2500"/>
+            <w:tcBorders>
+              <w:top w:val="single" w:color="C9D1DA" w:sz="4"/>
+              <w:left w:val="single" w:color="C9D1DA" w:sz="4"/>
+              <w:bottom w:val="single" w:color="C9D1DA" w:sz="4"/>
+              <w:right w:val="single" w:color="C9D1DA" w:sz="4"/>
+            </w:tcBorders>
+            <w:shd w:fill="1B3A5C" w:color="auto" w:val="clear"/>
+            <w:tcMar>
+              <w:top w:type="dxa" w:w="70"/>
+              <w:left w:type="dxa" w:w="110"/>
+              <w:bottom w:type="dxa" w:w="70"/>
+              <w:right w:type="dxa" w:w="110"/>
+            </w:tcMar>
+          </w:tcPr>
+          <w:p>
+            <w:pPr>
+              <w:spacing w:after="0"/>
+            </w:pPr>
+            <w:r>
+              <w:rPr>
+                <w:rFonts w:ascii="Arial" w:cs="Arial" w:eastAsia="Arial" w:hAnsi="Arial"/>
+                <w:b/>
+                <w:bCs/>
+                <w:color w:val="FFFFFF"/>
+                <w:sz w:val="18"/>
+                <w:szCs w:val="18"/>
+              </w:rPr>
+              <w:t xml:space="preserve">Competitor USP</w:t>
+            </w:r>
+          </w:p>
+        </w:tc>
+        <w:tc>
+          <w:tcPr>
+            <w:tcW w:type="dxa" w:w="3300"/>
+            <w:tcBorders>
+              <w:top w:val="single" w:color="C9D1DA" w:sz="4"/>
+              <w:left w:val="single" w:color="C9D1DA" w:sz="4"/>
+              <w:bottom w:val="single" w:color="C9D1DA" w:sz="4"/>
+              <w:right w:val="single" w:color="C9D1DA" w:sz="4"/>
+            </w:tcBorders>
+            <w:shd w:fill="1B3A5C" w:color="auto" w:val="clear"/>
+            <w:tcMar>
+              <w:top w:type="dxa" w:w="70"/>
+              <w:left w:type="dxa" w:w="110"/>
+              <w:bottom w:type="dxa" w:w="70"/>
+              <w:right w:type="dxa" w:w="110"/>
+            </w:tcMar>
+          </w:tcPr>
+          <w:p>
+            <w:pPr>
+              <w:spacing w:after="0"/>
+            </w:pPr>
+            <w:r>
+              <w:rPr>
+                <w:rFonts w:ascii="Arial" w:cs="Arial" w:eastAsia="Arial" w:hAnsi="Arial"/>
+                <w:b/>
+                <w:bCs/>
+                <w:color w:val="FFFFFF"/>
+                <w:sz w:val="18"/>
+                <w:szCs w:val="18"/>
+              </w:rPr>
+              <w:t xml:space="preserve">Covered in BRD v2.2?</w:t>
+            </w:r>
+          </w:p>
+        </w:tc>
+        <w:tc>
+          <w:tcPr>
+            <w:tcW w:type="dxa" w:w="3838"/>
+            <w:tcBorders>
+              <w:top w:val="single" w:color="C9D1DA" w:sz="4"/>
+              <w:left w:val="single" w:color="C9D1DA" w:sz="4"/>
+              <w:bottom w:val="single" w:color="C9D1DA" w:sz="4"/>
+              <w:right w:val="single" w:color="C9D1DA" w:sz="4"/>
+            </w:tcBorders>
+            <w:shd w:fill="1B3A5C" w:color="auto" w:val="clear"/>
+            <w:tcMar>
+              <w:top w:type="dxa" w:w="70"/>
+              <w:left w:type="dxa" w:w="110"/>
+              <w:bottom w:type="dxa" w:w="70"/>
+              <w:right w:type="dxa" w:w="110"/>
+            </w:tcMar>
+          </w:tcPr>
+          <w:p>
+            <w:pPr>
+              <w:spacing w:after="0"/>
+            </w:pPr>
+            <w:r>
+              <w:rPr>
+                <w:rFonts w:ascii="Arial" w:cs="Arial" w:eastAsia="Arial" w:hAnsi="Arial"/>
+                <w:b/>
+                <w:bCs/>
+                <w:color w:val="FFFFFF"/>
+                <w:sz w:val="18"/>
+                <w:szCs w:val="18"/>
+              </w:rPr>
+              <w:t xml:space="preserve">Response</w:t>
+            </w:r>
+          </w:p>
+        </w:tc>
+      </w:tr>
+      <w:tr>
+        <w:trPr>
+          <w:cantSplit/>
+        </w:trPr>
+        <w:tc>
+          <w:tcPr>
+            <w:tcW w:type="dxa" w:w="2500"/>
+            <w:tcBorders>
+              <w:top w:val="single" w:color="C9D1DA" w:sz="4"/>
+              <w:left w:val="single" w:color="C9D1DA" w:sz="4"/>
+              <w:bottom w:val="single" w:color="C9D1DA" w:sz="4"/>
+              <w:right w:val="single" w:color="C9D1DA" w:sz="4"/>
+            </w:tcBorders>
+            <w:shd w:fill="FFFFFF" w:color="auto" w:val="clear"/>
+            <w:tcMar>
+              <w:top w:type="dxa" w:w="70"/>
+              <w:left w:type="dxa" w:w="110"/>
+              <w:bottom w:type="dxa" w:w="70"/>
+              <w:right w:type="dxa" w:w="110"/>
+            </w:tcMar>
+          </w:tcPr>
+          <w:p>
+            <w:pPr>
+              <w:spacing w:after="0"/>
+            </w:pPr>
+            <w:r>
+              <w:rPr>
+                <w:rFonts w:ascii="Arial" w:cs="Arial" w:eastAsia="Arial" w:hAnsi="Arial"/>
+                <w:b w:val="false"/>
+                <w:bCs w:val="false"/>
+                <w:sz w:val="18"/>
+                <w:szCs w:val="18"/>
+              </w:rPr>
+              <w:t xml:space="preserve">All-in-one platform</w:t>
+            </w:r>
+          </w:p>
+        </w:tc>
+        <w:tc>
+          <w:tcPr>
+            <w:tcW w:type="dxa" w:w="3300"/>
+            <w:tcBorders>
+              <w:top w:val="single" w:color="C9D1DA" w:sz="4"/>
+              <w:left w:val="single" w:color="C9D1DA" w:sz="4"/>
+              <w:bottom w:val="single" w:color="C9D1DA" w:sz="4"/>
+              <w:right w:val="single" w:color="C9D1DA" w:sz="4"/>
+            </w:tcBorders>
+            <w:shd w:fill="FFFFFF" w:color="auto" w:val="clear"/>
+            <w:tcMar>
+              <w:top w:type="dxa" w:w="70"/>
+              <w:left w:type="dxa" w:w="110"/>
+              <w:bottom w:type="dxa" w:w="70"/>
+              <w:right w:type="dxa" w:w="110"/>
+            </w:tcMar>
+          </w:tcPr>
+          <w:p>
+            <w:pPr>
+              <w:spacing w:after="0"/>
+            </w:pPr>
+            <w:r>
+              <w:rPr>
+                <w:rFonts w:ascii="Arial" w:cs="Arial" w:eastAsia="Arial" w:hAnsi="Arial"/>
+                <w:b w:val="false"/>
+                <w:bCs w:val="false"/>
+                <w:sz w:val="18"/>
+                <w:szCs w:val="18"/>
+              </w:rPr>
+              <w:t xml:space="preserve">Mostly. Payroll is excluded by decision.</w:t>
+            </w:r>
+          </w:p>
+        </w:tc>
+        <w:tc>
+          <w:tcPr>
+            <w:tcW w:type="dxa" w:w="3838"/>
+            <w:tcBorders>
+              <w:top w:val="single" w:color="C9D1DA" w:sz="4"/>
+              <w:left w:val="single" w:color="C9D1DA" w:sz="4"/>
+              <w:bottom w:val="single" w:color="C9D1DA" w:sz="4"/>
+              <w:right w:val="single" w:color="C9D1DA" w:sz="4"/>
+            </w:tcBorders>
+            <w:shd w:fill="FFFFFF" w:color="auto" w:val="clear"/>
+            <w:tcMar>
+              <w:top w:type="dxa" w:w="70"/>
+              <w:left w:type="dxa" w:w="110"/>
+              <w:bottom w:type="dxa" w:w="70"/>
+              <w:right w:type="dxa" w:w="110"/>
+            </w:tcMar>
+          </w:tcPr>
+          <w:p>
+            <w:pPr>
+              <w:spacing w:after="0"/>
+            </w:pPr>
+            <w:r>
+              <w:rPr>
+                <w:rFonts w:ascii="Arial" w:cs="Arial" w:eastAsia="Arial" w:hAnsi="Arial"/>
+                <w:b w:val="false"/>
+                <w:bCs w:val="false"/>
+                <w:sz w:val="18"/>
+                <w:szCs w:val="18"/>
+              </w:rPr>
+              <w:t xml:space="preserve">No change. Payroll stays integration-only (OI-19).</w:t>
+            </w:r>
+          </w:p>
+        </w:tc>
+      </w:tr>
+      <w:tr>
+        <w:trPr>
+          <w:cantSplit/>
+        </w:trPr>
+        <w:tc>
+          <w:tcPr>
+            <w:tcW w:type="dxa" w:w="2500"/>
+            <w:tcBorders>
+              <w:top w:val="single" w:color="C9D1DA" w:sz="4"/>
+              <w:left w:val="single" w:color="C9D1DA" w:sz="4"/>
+              <w:bottom w:val="single" w:color="C9D1DA" w:sz="4"/>
+              <w:right w:val="single" w:color="C9D1DA" w:sz="4"/>
+            </w:tcBorders>
+            <w:shd w:fill="F5F7FA" w:color="auto" w:val="clear"/>
+            <w:tcMar>
+              <w:top w:type="dxa" w:w="70"/>
+              <w:left w:type="dxa" w:w="110"/>
+              <w:bottom w:type="dxa" w:w="70"/>
+              <w:right w:type="dxa" w:w="110"/>
+            </w:tcMar>
+          </w:tcPr>
+          <w:p>
+            <w:pPr>
+              <w:spacing w:after="0"/>
+            </w:pPr>
+            <w:r>
+              <w:rPr>
+                <w:rFonts w:ascii="Arial" w:cs="Arial" w:eastAsia="Arial" w:hAnsi="Arial"/>
+                <w:b w:val="false"/>
+                <w:bCs w:val="false"/>
+                <w:sz w:val="18"/>
+                <w:szCs w:val="18"/>
+              </w:rPr>
+              <w:t xml:space="preserve">High customisability</w:t>
+            </w:r>
+          </w:p>
+        </w:tc>
+        <w:tc>
+          <w:tcPr>
+            <w:tcW w:type="dxa" w:w="3300"/>
+            <w:tcBorders>
+              <w:top w:val="single" w:color="C9D1DA" w:sz="4"/>
+              <w:left w:val="single" w:color="C9D1DA" w:sz="4"/>
+              <w:bottom w:val="single" w:color="C9D1DA" w:sz="4"/>
+              <w:right w:val="single" w:color="C9D1DA" w:sz="4"/>
+            </w:tcBorders>
+            <w:shd w:fill="F5F7FA" w:color="auto" w:val="clear"/>
+            <w:tcMar>
+              <w:top w:type="dxa" w:w="70"/>
+              <w:left w:type="dxa" w:w="110"/>
+              <w:bottom w:type="dxa" w:w="70"/>
+              <w:right w:type="dxa" w:w="110"/>
+            </w:tcMar>
+          </w:tcPr>
+          <w:p>
+            <w:pPr>
+              <w:spacing w:after="0"/>
+            </w:pPr>
+            <w:r>
+              <w:rPr>
+                <w:rFonts w:ascii="Arial" w:cs="Arial" w:eastAsia="Arial" w:hAnsi="Arial"/>
+                <w:b w:val="false"/>
+                <w:bCs w:val="false"/>
+                <w:sz w:val="18"/>
+                <w:szCs w:val="18"/>
+              </w:rPr>
+              <w:t xml:space="preserve">Partly. No feature on/off, custom frameworks, templates or branding.</w:t>
+            </w:r>
+          </w:p>
+        </w:tc>
+        <w:tc>
+          <w:tcPr>
+            <w:tcW w:type="dxa" w:w="3838"/>
+            <w:tcBorders>
+              <w:top w:val="single" w:color="C9D1DA" w:sz="4"/>
+              <w:left w:val="single" w:color="C9D1DA" w:sz="4"/>
+              <w:bottom w:val="single" w:color="C9D1DA" w:sz="4"/>
+              <w:right w:val="single" w:color="C9D1DA" w:sz="4"/>
+            </w:tcBorders>
+            <w:shd w:fill="F5F7FA" w:color="auto" w:val="clear"/>
+            <w:tcMar>
+              <w:top w:type="dxa" w:w="70"/>
+              <w:left w:type="dxa" w:w="110"/>
+              <w:bottom w:type="dxa" w:w="70"/>
+              <w:right w:type="dxa" w:w="110"/>
+            </w:tcMar>
+          </w:tcPr>
+          <w:p>
+            <w:pPr>
+              <w:spacing w:after="0"/>
+            </w:pPr>
+            <w:r>
+              <w:rPr>
+                <w:rFonts w:ascii="Arial" w:cs="Arial" w:eastAsia="Arial" w:hAnsi="Arial"/>
+                <w:b w:val="false"/>
+                <w:bCs w:val="false"/>
+                <w:sz w:val="18"/>
+                <w:szCs w:val="18"/>
+              </w:rPr>
+              <w:t xml:space="preserve">BRD §36.1 (CUS-001–006).</w:t>
+            </w:r>
+          </w:p>
+        </w:tc>
+      </w:tr>
+      <w:tr>
+        <w:trPr>
+          <w:cantSplit/>
+        </w:trPr>
+        <w:tc>
+          <w:tcPr>
+            <w:tcW w:type="dxa" w:w="2500"/>
+            <w:tcBorders>
+              <w:top w:val="single" w:color="C9D1DA" w:sz="4"/>
+              <w:left w:val="single" w:color="C9D1DA" w:sz="4"/>
+              <w:bottom w:val="single" w:color="C9D1DA" w:sz="4"/>
+              <w:right w:val="single" w:color="C9D1DA" w:sz="4"/>
+            </w:tcBorders>
+            <w:shd w:fill="FFFFFF" w:color="auto" w:val="clear"/>
+            <w:tcMar>
+              <w:top w:type="dxa" w:w="70"/>
+              <w:left w:type="dxa" w:w="110"/>
+              <w:bottom w:type="dxa" w:w="70"/>
+              <w:right w:type="dxa" w:w="110"/>
+            </w:tcMar>
+          </w:tcPr>
+          <w:p>
+            <w:pPr>
+              <w:spacing w:after="0"/>
+            </w:pPr>
+            <w:r>
+              <w:rPr>
+                <w:rFonts w:ascii="Arial" w:cs="Arial" w:eastAsia="Arial" w:hAnsi="Arial"/>
+                <w:b w:val="false"/>
+                <w:bCs w:val="false"/>
+                <w:sz w:val="18"/>
+                <w:szCs w:val="18"/>
+              </w:rPr>
+              <w:t xml:space="preserve">Freemium, cost-effective model</w:t>
+            </w:r>
+          </w:p>
+        </w:tc>
+        <w:tc>
+          <w:tcPr>
+            <w:tcW w:type="dxa" w:w="3300"/>
+            <w:tcBorders>
+              <w:top w:val="single" w:color="C9D1DA" w:sz="4"/>
+              <w:left w:val="single" w:color="C9D1DA" w:sz="4"/>
+              <w:bottom w:val="single" w:color="C9D1DA" w:sz="4"/>
+              <w:right w:val="single" w:color="C9D1DA" w:sz="4"/>
+            </w:tcBorders>
+            <w:shd w:fill="FFFFFF" w:color="auto" w:val="clear"/>
+            <w:tcMar>
+              <w:top w:type="dxa" w:w="70"/>
+              <w:left w:type="dxa" w:w="110"/>
+              <w:bottom w:type="dxa" w:w="70"/>
+              <w:right w:type="dxa" w:w="110"/>
+            </w:tcMar>
+          </w:tcPr>
+          <w:p>
+            <w:pPr>
+              <w:spacing w:after="0"/>
+            </w:pPr>
+            <w:r>
+              <w:rPr>
+                <w:rFonts w:ascii="Arial" w:cs="Arial" w:eastAsia="Arial" w:hAnsi="Arial"/>
+                <w:b w:val="false"/>
+                <w:bCs w:val="false"/>
+                <w:sz w:val="18"/>
+                <w:szCs w:val="18"/>
+              </w:rPr>
+              <w:t xml:space="preserve">No. The BRD covers billing families, not packaging the platform.</w:t>
+            </w:r>
+          </w:p>
+        </w:tc>
+        <w:tc>
+          <w:tcPr>
+            <w:tcW w:type="dxa" w:w="3838"/>
+            <w:tcBorders>
+              <w:top w:val="single" w:color="C9D1DA" w:sz="4"/>
+              <w:left w:val="single" w:color="C9D1DA" w:sz="4"/>
+              <w:bottom w:val="single" w:color="C9D1DA" w:sz="4"/>
+              <w:right w:val="single" w:color="C9D1DA" w:sz="4"/>
+            </w:tcBorders>
+            <w:shd w:fill="FFFFFF" w:color="auto" w:val="clear"/>
+            <w:tcMar>
+              <w:top w:type="dxa" w:w="70"/>
+              <w:left w:type="dxa" w:w="110"/>
+              <w:bottom w:type="dxa" w:w="70"/>
+              <w:right w:type="dxa" w:w="110"/>
+            </w:tcMar>
+          </w:tcPr>
+          <w:p>
+            <w:pPr>
+              <w:spacing w:after="0"/>
+            </w:pPr>
+            <w:r>
+              <w:rPr>
+                <w:rFonts w:ascii="Arial" w:cs="Arial" w:eastAsia="Arial" w:hAnsi="Arial"/>
+                <w:b w:val="false"/>
+                <w:bCs w:val="false"/>
+                <w:sz w:val="18"/>
+                <w:szCs w:val="18"/>
+              </w:rPr>
+              <w:t xml:space="preserve">BRD §36.2 (PLT-001–006). Free core, paid per-child add-ons (OI-31).</w:t>
+            </w:r>
+          </w:p>
+        </w:tc>
+      </w:tr>
+      <w:tr>
+        <w:trPr>
+          <w:cantSplit/>
+        </w:trPr>
+        <w:tc>
+          <w:tcPr>
+            <w:tcW w:type="dxa" w:w="2500"/>
+            <w:tcBorders>
+              <w:top w:val="single" w:color="C9D1DA" w:sz="4"/>
+              <w:left w:val="single" w:color="C9D1DA" w:sz="4"/>
+              <w:bottom w:val="single" w:color="C9D1DA" w:sz="4"/>
+              <w:right w:val="single" w:color="C9D1DA" w:sz="4"/>
+            </w:tcBorders>
+            <w:shd w:fill="F5F7FA" w:color="auto" w:val="clear"/>
+            <w:tcMar>
+              <w:top w:type="dxa" w:w="70"/>
+              <w:left w:type="dxa" w:w="110"/>
+              <w:bottom w:type="dxa" w:w="70"/>
+              <w:right w:type="dxa" w:w="110"/>
+            </w:tcMar>
+          </w:tcPr>
+          <w:p>
+            <w:pPr>
+              <w:spacing w:after="0"/>
+            </w:pPr>
+            <w:r>
+              <w:rPr>
+                <w:rFonts w:ascii="Arial" w:cs="Arial" w:eastAsia="Arial" w:hAnsi="Arial"/>
+                <w:b w:val="false"/>
+                <w:bCs w:val="false"/>
+                <w:sz w:val="18"/>
+                <w:szCs w:val="18"/>
+              </w:rPr>
+              <w:t xml:space="preserve">Real-time compliance, ratios, 7-year records</w:t>
+            </w:r>
+          </w:p>
+        </w:tc>
+        <w:tc>
+          <w:tcPr>
+            <w:tcW w:type="dxa" w:w="3300"/>
+            <w:tcBorders>
+              <w:top w:val="single" w:color="C9D1DA" w:sz="4"/>
+              <w:left w:val="single" w:color="C9D1DA" w:sz="4"/>
+              <w:bottom w:val="single" w:color="C9D1DA" w:sz="4"/>
+              <w:right w:val="single" w:color="C9D1DA" w:sz="4"/>
+            </w:tcBorders>
+            <w:shd w:fill="F5F7FA" w:color="auto" w:val="clear"/>
+            <w:tcMar>
+              <w:top w:type="dxa" w:w="70"/>
+              <w:left w:type="dxa" w:w="110"/>
+              <w:bottom w:type="dxa" w:w="70"/>
+              <w:right w:type="dxa" w:w="110"/>
+            </w:tcMar>
+          </w:tcPr>
+          <w:p>
+            <w:pPr>
+              <w:spacing w:after="0"/>
+            </w:pPr>
+            <w:r>
+              <w:rPr>
+                <w:rFonts w:ascii="Arial" w:cs="Arial" w:eastAsia="Arial" w:hAnsi="Arial"/>
+                <w:b w:val="false"/>
+                <w:bCs w:val="false"/>
+                <w:sz w:val="18"/>
+                <w:szCs w:val="18"/>
+              </w:rPr>
+              <w:t xml:space="preserve">Mostly. Ratios and compliance are Phase 2. No retention schedule or audit pack.</w:t>
+            </w:r>
+          </w:p>
+        </w:tc>
+        <w:tc>
+          <w:tcPr>
+            <w:tcW w:type="dxa" w:w="3838"/>
+            <w:tcBorders>
+              <w:top w:val="single" w:color="C9D1DA" w:sz="4"/>
+              <w:left w:val="single" w:color="C9D1DA" w:sz="4"/>
+              <w:bottom w:val="single" w:color="C9D1DA" w:sz="4"/>
+              <w:right w:val="single" w:color="C9D1DA" w:sz="4"/>
+            </w:tcBorders>
+            <w:shd w:fill="F5F7FA" w:color="auto" w:val="clear"/>
+            <w:tcMar>
+              <w:top w:type="dxa" w:w="70"/>
+              <w:left w:type="dxa" w:w="110"/>
+              <w:bottom w:type="dxa" w:w="70"/>
+              <w:right w:type="dxa" w:w="110"/>
+            </w:tcMar>
+          </w:tcPr>
+          <w:p>
+            <w:pPr>
+              <w:spacing w:after="0"/>
+            </w:pPr>
+            <w:r>
+              <w:rPr>
+                <w:rFonts w:ascii="Arial" w:cs="Arial" w:eastAsia="Arial" w:hAnsi="Arial"/>
+                <w:b w:val="false"/>
+                <w:bCs w:val="false"/>
+                <w:sz w:val="18"/>
+                <w:szCs w:val="18"/>
+              </w:rPr>
+              <w:t xml:space="preserve">BRD §36.3 (RET-001–005). The 7-year period is real for CCS records (OI-32).</w:t>
+            </w:r>
+          </w:p>
+        </w:tc>
+      </w:tr>
+      <w:tr>
+        <w:trPr>
+          <w:cantSplit/>
+        </w:trPr>
+        <w:tc>
+          <w:tcPr>
+            <w:tcW w:type="dxa" w:w="2500"/>
+            <w:tcBorders>
+              <w:top w:val="single" w:color="C9D1DA" w:sz="4"/>
+              <w:left w:val="single" w:color="C9D1DA" w:sz="4"/>
+              <w:bottom w:val="single" w:color="C9D1DA" w:sz="4"/>
+              <w:right w:val="single" w:color="C9D1DA" w:sz="4"/>
+            </w:tcBorders>
+            <w:shd w:fill="FFFFFF" w:color="auto" w:val="clear"/>
+            <w:tcMar>
+              <w:top w:type="dxa" w:w="70"/>
+              <w:left w:type="dxa" w:w="110"/>
+              <w:bottom w:type="dxa" w:w="70"/>
+              <w:right w:type="dxa" w:w="110"/>
+            </w:tcMar>
+          </w:tcPr>
+          <w:p>
+            <w:pPr>
+              <w:spacing w:after="0"/>
+            </w:pPr>
+            <w:r>
+              <w:rPr>
+                <w:rFonts w:ascii="Arial" w:cs="Arial" w:eastAsia="Arial" w:hAnsi="Arial"/>
+                <w:b w:val="false"/>
+                <w:bCs w:val="false"/>
+                <w:sz w:val="18"/>
+                <w:szCs w:val="18"/>
+              </w:rPr>
+              <w:t xml:space="preserve">Family engagement and payments</w:t>
+            </w:r>
+          </w:p>
+        </w:tc>
+        <w:tc>
+          <w:tcPr>
+            <w:tcW w:type="dxa" w:w="3300"/>
+            <w:tcBorders>
+              <w:top w:val="single" w:color="C9D1DA" w:sz="4"/>
+              <w:left w:val="single" w:color="C9D1DA" w:sz="4"/>
+              <w:bottom w:val="single" w:color="C9D1DA" w:sz="4"/>
+              <w:right w:val="single" w:color="C9D1DA" w:sz="4"/>
+            </w:tcBorders>
+            <w:shd w:fill="FFFFFF" w:color="auto" w:val="clear"/>
+            <w:tcMar>
+              <w:top w:type="dxa" w:w="70"/>
+              <w:left w:type="dxa" w:w="110"/>
+              <w:bottom w:type="dxa" w:w="70"/>
+              <w:right w:type="dxa" w:w="110"/>
+            </w:tcMar>
+          </w:tcPr>
+          <w:p>
+            <w:pPr>
+              <w:spacing w:after="0"/>
+            </w:pPr>
+            <w:r>
+              <w:rPr>
+                <w:rFonts w:ascii="Arial" w:cs="Arial" w:eastAsia="Arial" w:hAnsi="Arial"/>
+                <w:b w:val="false"/>
+                <w:bCs w:val="false"/>
+                <w:sz w:val="18"/>
+                <w:szCs w:val="18"/>
+              </w:rPr>
+              <w:t xml:space="preserve">Mostly. Parents could not sign children in or out digitally.</w:t>
+            </w:r>
+          </w:p>
+        </w:tc>
+        <w:tc>
+          <w:tcPr>
+            <w:tcW w:type="dxa" w:w="3838"/>
+            <w:tcBorders>
+              <w:top w:val="single" w:color="C9D1DA" w:sz="4"/>
+              <w:left w:val="single" w:color="C9D1DA" w:sz="4"/>
+              <w:bottom w:val="single" w:color="C9D1DA" w:sz="4"/>
+              <w:right w:val="single" w:color="C9D1DA" w:sz="4"/>
+            </w:tcBorders>
+            <w:shd w:fill="FFFFFF" w:color="auto" w:val="clear"/>
+            <w:tcMar>
+              <w:top w:type="dxa" w:w="70"/>
+              <w:left w:type="dxa" w:w="110"/>
+              <w:bottom w:type="dxa" w:w="70"/>
+              <w:right w:type="dxa" w:w="110"/>
+            </w:tcMar>
+          </w:tcPr>
+          <w:p>
+            <w:pPr>
+              <w:spacing w:after="0"/>
+            </w:pPr>
+            <w:r>
+              <w:rPr>
+                <w:rFonts w:ascii="Arial" w:cs="Arial" w:eastAsia="Arial" w:hAnsi="Arial"/>
+                <w:b w:val="false"/>
+                <w:bCs w:val="false"/>
+                <w:sz w:val="18"/>
+                <w:szCs w:val="18"/>
+              </w:rPr>
+              <w:t xml:space="preserve">PAR-015 added, as a centre option (OI-33).</w:t>
+            </w:r>
+          </w:p>
+        </w:tc>
+      </w:tr>
+      <w:tr>
+        <w:trPr>
+          <w:cantSplit/>
+        </w:trPr>
+        <w:tc>
+          <w:tcPr>
+            <w:tcW w:type="dxa" w:w="2500"/>
+            <w:tcBorders>
+              <w:top w:val="single" w:color="C9D1DA" w:sz="4"/>
+              <w:left w:val="single" w:color="C9D1DA" w:sz="4"/>
+              <w:bottom w:val="single" w:color="C9D1DA" w:sz="4"/>
+              <w:right w:val="single" w:color="C9D1DA" w:sz="4"/>
+            </w:tcBorders>
+            <w:shd w:fill="F5F7FA" w:color="auto" w:val="clear"/>
+            <w:tcMar>
+              <w:top w:type="dxa" w:w="70"/>
+              <w:left w:type="dxa" w:w="110"/>
+              <w:bottom w:type="dxa" w:w="70"/>
+              <w:right w:type="dxa" w:w="110"/>
+            </w:tcMar>
+          </w:tcPr>
+          <w:p>
+            <w:pPr>
+              <w:spacing w:after="0"/>
+            </w:pPr>
+            <w:r>
+              <w:rPr>
+                <w:rFonts w:ascii="Arial" w:cs="Arial" w:eastAsia="Arial" w:hAnsi="Arial"/>
+                <w:b w:val="false"/>
+                <w:bCs w:val="false"/>
+                <w:sz w:val="18"/>
+                <w:szCs w:val="18"/>
+              </w:rPr>
+              <w:t xml:space="preserve">Multi-site HQ control</w:t>
+            </w:r>
+          </w:p>
+        </w:tc>
+        <w:tc>
+          <w:tcPr>
+            <w:tcW w:type="dxa" w:w="3300"/>
+            <w:tcBorders>
+              <w:top w:val="single" w:color="C9D1DA" w:sz="4"/>
+              <w:left w:val="single" w:color="C9D1DA" w:sz="4"/>
+              <w:bottom w:val="single" w:color="C9D1DA" w:sz="4"/>
+              <w:right w:val="single" w:color="C9D1DA" w:sz="4"/>
+            </w:tcBorders>
+            <w:shd w:fill="F5F7FA" w:color="auto" w:val="clear"/>
+            <w:tcMar>
+              <w:top w:type="dxa" w:w="70"/>
+              <w:left w:type="dxa" w:w="110"/>
+              <w:bottom w:type="dxa" w:w="70"/>
+              <w:right w:type="dxa" w:w="110"/>
+            </w:tcMar>
+          </w:tcPr>
+          <w:p>
+            <w:pPr>
+              <w:spacing w:after="0"/>
+            </w:pPr>
+            <w:r>
+              <w:rPr>
+                <w:rFonts w:ascii="Arial" w:cs="Arial" w:eastAsia="Arial" w:hAnsi="Arial"/>
+                <w:b w:val="false"/>
+                <w:bCs w:val="false"/>
+                <w:sz w:val="18"/>
+                <w:szCs w:val="18"/>
+              </w:rPr>
+              <w:t xml:space="preserve">Partly. Deferred to Phase 3 with no requirements.</w:t>
+            </w:r>
+          </w:p>
+        </w:tc>
+        <w:tc>
+          <w:tcPr>
+            <w:tcW w:type="dxa" w:w="3838"/>
+            <w:tcBorders>
+              <w:top w:val="single" w:color="C9D1DA" w:sz="4"/>
+              <w:left w:val="single" w:color="C9D1DA" w:sz="4"/>
+              <w:bottom w:val="single" w:color="C9D1DA" w:sz="4"/>
+              <w:right w:val="single" w:color="C9D1DA" w:sz="4"/>
+            </w:tcBorders>
+            <w:shd w:fill="F5F7FA" w:color="auto" w:val="clear"/>
+            <w:tcMar>
+              <w:top w:type="dxa" w:w="70"/>
+              <w:left w:type="dxa" w:w="110"/>
+              <w:bottom w:type="dxa" w:w="70"/>
+              <w:right w:type="dxa" w:w="110"/>
+            </w:tcMar>
+          </w:tcPr>
+          <w:p>
+            <w:pPr>
+              <w:spacing w:after="0"/>
+            </w:pPr>
+            <w:r>
+              <w:rPr>
+                <w:rFonts w:ascii="Arial" w:cs="Arial" w:eastAsia="Arial" w:hAnsi="Arial"/>
+                <w:b w:val="false"/>
+                <w:bCs w:val="false"/>
+                <w:sz w:val="18"/>
+                <w:szCs w:val="18"/>
+              </w:rPr>
+              <w:t xml:space="preserve">BRD §36.4 (HQ-001–006). Basic dashboard pulled into Phase 2.</w:t>
+            </w:r>
+          </w:p>
+        </w:tc>
+      </w:tr>
+      <w:tr>
+        <w:trPr>
+          <w:cantSplit/>
+        </w:trPr>
+        <w:tc>
+          <w:tcPr>
+            <w:tcW w:type="dxa" w:w="2500"/>
+            <w:tcBorders>
+              <w:top w:val="single" w:color="C9D1DA" w:sz="4"/>
+              <w:left w:val="single" w:color="C9D1DA" w:sz="4"/>
+              <w:bottom w:val="single" w:color="C9D1DA" w:sz="4"/>
+              <w:right w:val="single" w:color="C9D1DA" w:sz="4"/>
+            </w:tcBorders>
+            <w:shd w:fill="FFFFFF" w:color="auto" w:val="clear"/>
+            <w:tcMar>
+              <w:top w:type="dxa" w:w="70"/>
+              <w:left w:type="dxa" w:w="110"/>
+              <w:bottom w:type="dxa" w:w="70"/>
+              <w:right w:type="dxa" w:w="110"/>
+            </w:tcMar>
+          </w:tcPr>
+          <w:p>
+            <w:pPr>
+              <w:spacing w:after="0"/>
+            </w:pPr>
+            <w:r>
+              <w:rPr>
+                <w:rFonts w:ascii="Arial" w:cs="Arial" w:eastAsia="Arial" w:hAnsi="Arial"/>
+                <w:b w:val="false"/>
+                <w:bCs w:val="false"/>
+                <w:sz w:val="18"/>
+                <w:szCs w:val="18"/>
+              </w:rPr>
+              <w:t xml:space="preserve">AI parent assistance</w:t>
+            </w:r>
+          </w:p>
+        </w:tc>
+        <w:tc>
+          <w:tcPr>
+            <w:tcW w:type="dxa" w:w="3300"/>
+            <w:tcBorders>
+              <w:top w:val="single" w:color="C9D1DA" w:sz="4"/>
+              <w:left w:val="single" w:color="C9D1DA" w:sz="4"/>
+              <w:bottom w:val="single" w:color="C9D1DA" w:sz="4"/>
+              <w:right w:val="single" w:color="C9D1DA" w:sz="4"/>
+            </w:tcBorders>
+            <w:shd w:fill="FFFFFF" w:color="auto" w:val="clear"/>
+            <w:tcMar>
+              <w:top w:type="dxa" w:w="70"/>
+              <w:left w:type="dxa" w:w="110"/>
+              <w:bottom w:type="dxa" w:w="70"/>
+              <w:right w:type="dxa" w:w="110"/>
+            </w:tcMar>
+          </w:tcPr>
+          <w:p>
+            <w:pPr>
+              <w:spacing w:after="0"/>
+            </w:pPr>
+            <w:r>
+              <w:rPr>
+                <w:rFonts w:ascii="Arial" w:cs="Arial" w:eastAsia="Arial" w:hAnsi="Arial"/>
+                <w:b w:val="false"/>
+                <w:bCs w:val="false"/>
+                <w:sz w:val="18"/>
+                <w:szCs w:val="18"/>
+              </w:rPr>
+              <w:t xml:space="preserve">Partly. Staff-facing assistant only.</w:t>
+            </w:r>
+          </w:p>
+        </w:tc>
+        <w:tc>
+          <w:tcPr>
+            <w:tcW w:type="dxa" w:w="3838"/>
+            <w:tcBorders>
+              <w:top w:val="single" w:color="C9D1DA" w:sz="4"/>
+              <w:left w:val="single" w:color="C9D1DA" w:sz="4"/>
+              <w:bottom w:val="single" w:color="C9D1DA" w:sz="4"/>
+              <w:right w:val="single" w:color="C9D1DA" w:sz="4"/>
+            </w:tcBorders>
+            <w:shd w:fill="FFFFFF" w:color="auto" w:val="clear"/>
+            <w:tcMar>
+              <w:top w:type="dxa" w:w="70"/>
+              <w:left w:type="dxa" w:w="110"/>
+              <w:bottom w:type="dxa" w:w="70"/>
+              <w:right w:type="dxa" w:w="110"/>
+            </w:tcMar>
+          </w:tcPr>
+          <w:p>
+            <w:pPr>
+              <w:spacing w:after="0"/>
+            </w:pPr>
+            <w:r>
+              <w:rPr>
+                <w:rFonts w:ascii="Arial" w:cs="Arial" w:eastAsia="Arial" w:hAnsi="Arial"/>
+                <w:b w:val="false"/>
+                <w:bCs w:val="false"/>
+                <w:sz w:val="18"/>
+                <w:szCs w:val="18"/>
+              </w:rPr>
+              <w:t xml:space="preserve">BRD §36.5 (AIP-001–007), Phase 3 add-on, Claude on Bedrock in Sydney (OI-34).</w:t>
+            </w:r>
+          </w:p>
+        </w:tc>
+      </w:tr>
+    </w:tbl>
+    <w:p>
+      <w:pPr>
+        <w:spacing w:after="80"/>
+      </w:pPr>
+    </w:p>
+    <w:p>
+      <w:pPr>
+        <w:pStyle w:val="Heading2"/>
+        <w:spacing w:after="100" w:before="220"/>
+      </w:pPr>
+      <w:r>
+        <w:rPr>
+          <w:rFonts w:ascii="Arial" w:cs="Arial" w:eastAsia="Arial" w:hAnsi="Arial"/>
+          <w:b/>
+          <w:bCs/>
+          <w:color w:val="1B3A5C"/>
+          <w:sz w:val="24"/>
+          <w:szCs w:val="24"/>
+        </w:rPr>
+        <w:t xml:space="preserve">14.3 Update plan</w:t>
+      </w:r>
+    </w:p>
+    <w:p>
+      <w:pPr>
+        <w:spacing w:after="120" w:line="276"/>
+      </w:pPr>
+      <w:r>
+        <w:rPr>
+          <w:rFonts w:ascii="Arial" w:cs="Arial" w:eastAsia="Arial" w:hAnsi="Arial"/>
+          <w:sz w:val="20"/>
+          <w:szCs w:val="20"/>
+        </w:rPr>
+        <w:t xml:space="preserve">The same execution model applies: sequential stages, tests before features, structured logging and audit on every endpoint, and a security review of touched modules. Sizes are relative (S, M, L).</w:t>
+      </w:r>
+    </w:p>
+    <w:tbl>
+      <w:tblPr>
+        <w:tblW w:type="dxa" w:w="9638"/>
+        <w:tblBorders>
+          <w:top w:val="single" w:color="auto" w:sz="4"/>
+          <w:left w:val="single" w:color="auto" w:sz="4"/>
+          <w:bottom w:val="single" w:color="auto" w:sz="4"/>
+          <w:right w:val="single" w:color="auto" w:sz="4"/>
+          <w:insideH w:val="single" w:color="auto" w:sz="4"/>
+          <w:insideV w:val="single" w:color="auto" w:sz="4"/>
+        </w:tblBorders>
+      </w:tblPr>
+      <w:tblGrid>
+        <w:gridCol w:w="1500"/>
+        <w:gridCol w:w="4700"/>
+        <w:gridCol w:w="2238"/>
+        <w:gridCol w:w="1200"/>
+      </w:tblGrid>
+      <w:tr>
+        <w:trPr>
+          <w:tblHeader/>
+        </w:trPr>
+        <w:tc>
+          <w:tcPr>
+            <w:tcW w:type="dxa" w:w="1500"/>
+            <w:tcBorders>
+              <w:top w:val="single" w:color="C9D1DA" w:sz="4"/>
+              <w:left w:val="single" w:color="C9D1DA" w:sz="4"/>
+              <w:bottom w:val="single" w:color="C9D1DA" w:sz="4"/>
+              <w:right w:val="single" w:color="C9D1DA" w:sz="4"/>
+            </w:tcBorders>
+            <w:shd w:fill="1B3A5C" w:color="auto" w:val="clear"/>
+            <w:tcMar>
+              <w:top w:type="dxa" w:w="70"/>
+              <w:left w:type="dxa" w:w="110"/>
+              <w:bottom w:type="dxa" w:w="70"/>
+              <w:right w:type="dxa" w:w="110"/>
+            </w:tcMar>
+          </w:tcPr>
+          <w:p>
+            <w:pPr>
+              <w:spacing w:after="0"/>
+            </w:pPr>
+            <w:r>
+              <w:rPr>
+                <w:rFonts w:ascii="Arial" w:cs="Arial" w:eastAsia="Arial" w:hAnsi="Arial"/>
+                <w:b/>
+                <w:bCs/>
+                <w:color w:val="FFFFFF"/>
+                <w:sz w:val="18"/>
+                <w:szCs w:val="18"/>
+              </w:rPr>
+              <w:t xml:space="preserve">Stage</w:t>
+            </w:r>
+          </w:p>
+        </w:tc>
+        <w:tc>
+          <w:tcPr>
+            <w:tcW w:type="dxa" w:w="4700"/>
+            <w:tcBorders>
+              <w:top w:val="single" w:color="C9D1DA" w:sz="4"/>
+              <w:left w:val="single" w:color="C9D1DA" w:sz="4"/>
+              <w:bottom w:val="single" w:color="C9D1DA" w:sz="4"/>
+              <w:right w:val="single" w:color="C9D1DA" w:sz="4"/>
+            </w:tcBorders>
+            <w:shd w:fill="1B3A5C" w:color="auto" w:val="clear"/>
+            <w:tcMar>
+              <w:top w:type="dxa" w:w="70"/>
+              <w:left w:type="dxa" w:w="110"/>
+              <w:bottom w:type="dxa" w:w="70"/>
+              <w:right w:type="dxa" w:w="110"/>
+            </w:tcMar>
+          </w:tcPr>
+          <w:p>
+            <w:pPr>
+              <w:spacing w:after="0"/>
+            </w:pPr>
+            <w:r>
+              <w:rPr>
+                <w:rFonts w:ascii="Arial" w:cs="Arial" w:eastAsia="Arial" w:hAnsi="Arial"/>
+                <w:b/>
+                <w:bCs/>
+                <w:color w:val="FFFFFF"/>
+                <w:sz w:val="18"/>
+                <w:szCs w:val="18"/>
+              </w:rPr>
+              <w:t xml:space="preserve">Scope</w:t>
+            </w:r>
+          </w:p>
+        </w:tc>
+        <w:tc>
+          <w:tcPr>
+            <w:tcW w:type="dxa" w:w="2238"/>
+            <w:tcBorders>
+              <w:top w:val="single" w:color="C9D1DA" w:sz="4"/>
+              <w:left w:val="single" w:color="C9D1DA" w:sz="4"/>
+              <w:bottom w:val="single" w:color="C9D1DA" w:sz="4"/>
+              <w:right w:val="single" w:color="C9D1DA" w:sz="4"/>
+            </w:tcBorders>
+            <w:shd w:fill="1B3A5C" w:color="auto" w:val="clear"/>
+            <w:tcMar>
+              <w:top w:type="dxa" w:w="70"/>
+              <w:left w:type="dxa" w:w="110"/>
+              <w:bottom w:type="dxa" w:w="70"/>
+              <w:right w:type="dxa" w:w="110"/>
+            </w:tcMar>
+          </w:tcPr>
+          <w:p>
+            <w:pPr>
+              <w:spacing w:after="0"/>
+            </w:pPr>
+            <w:r>
+              <w:rPr>
+                <w:rFonts w:ascii="Arial" w:cs="Arial" w:eastAsia="Arial" w:hAnsi="Arial"/>
+                <w:b/>
+                <w:bCs/>
+                <w:color w:val="FFFFFF"/>
+                <w:sz w:val="18"/>
+                <w:szCs w:val="18"/>
+              </w:rPr>
+              <w:t xml:space="preserve">Requirements</w:t>
+            </w:r>
+          </w:p>
+        </w:tc>
+        <w:tc>
+          <w:tcPr>
+            <w:tcW w:type="dxa" w:w="1200"/>
+            <w:tcBorders>
+              <w:top w:val="single" w:color="C9D1DA" w:sz="4"/>
+              <w:left w:val="single" w:color="C9D1DA" w:sz="4"/>
+              <w:bottom w:val="single" w:color="C9D1DA" w:sz="4"/>
+              <w:right w:val="single" w:color="C9D1DA" w:sz="4"/>
+            </w:tcBorders>
+            <w:shd w:fill="1B3A5C" w:color="auto" w:val="clear"/>
+            <w:tcMar>
+              <w:top w:type="dxa" w:w="70"/>
+              <w:left w:type="dxa" w:w="110"/>
+              <w:bottom w:type="dxa" w:w="70"/>
+              <w:right w:type="dxa" w:w="110"/>
+            </w:tcMar>
+          </w:tcPr>
+          <w:p>
+            <w:pPr>
+              <w:spacing w:after="0"/>
+            </w:pPr>
+            <w:r>
+              <w:rPr>
+                <w:rFonts w:ascii="Arial" w:cs="Arial" w:eastAsia="Arial" w:hAnsi="Arial"/>
+                <w:b/>
+                <w:bCs/>
+                <w:color w:val="FFFFFF"/>
+                <w:sz w:val="18"/>
+                <w:szCs w:val="18"/>
+              </w:rPr>
+              <w:t xml:space="preserve">Size</w:t>
+            </w:r>
+          </w:p>
+        </w:tc>
+      </w:tr>
+      <w:tr>
+        <w:trPr>
+          <w:cantSplit/>
+        </w:trPr>
+        <w:tc>
+          <w:tcPr>
+            <w:tcW w:type="dxa" w:w="1500"/>
+            <w:tcBorders>
+              <w:top w:val="single" w:color="C9D1DA" w:sz="4"/>
+              <w:left w:val="single" w:color="C9D1DA" w:sz="4"/>
+              <w:bottom w:val="single" w:color="C9D1DA" w:sz="4"/>
+              <w:right w:val="single" w:color="C9D1DA" w:sz="4"/>
+            </w:tcBorders>
+            <w:shd w:fill="FFFFFF" w:color="auto" w:val="clear"/>
+            <w:tcMar>
+              <w:top w:type="dxa" w:w="70"/>
+              <w:left w:type="dxa" w:w="110"/>
+              <w:bottom w:type="dxa" w:w="70"/>
+              <w:right w:type="dxa" w:w="110"/>
+            </w:tcMar>
+          </w:tcPr>
+          <w:p>
+            <w:pPr>
+              <w:spacing w:after="0"/>
+            </w:pPr>
+            <w:r>
+              <w:rPr>
+                <w:rFonts w:ascii="Arial" w:cs="Arial" w:eastAsia="Arial" w:hAnsi="Arial"/>
+                <w:b w:val="false"/>
+                <w:bCs w:val="false"/>
+                <w:sz w:val="18"/>
+                <w:szCs w:val="18"/>
+              </w:rPr>
+              <w:t xml:space="preserve">PR Pilot readiness</w:t>
+            </w:r>
+          </w:p>
+        </w:tc>
+        <w:tc>
+          <w:tcPr>
+            <w:tcW w:type="dxa" w:w="4700"/>
+            <w:tcBorders>
+              <w:top w:val="single" w:color="C9D1DA" w:sz="4"/>
+              <w:left w:val="single" w:color="C9D1DA" w:sz="4"/>
+              <w:bottom w:val="single" w:color="C9D1DA" w:sz="4"/>
+              <w:right w:val="single" w:color="C9D1DA" w:sz="4"/>
+            </w:tcBorders>
+            <w:shd w:fill="FFFFFF" w:color="auto" w:val="clear"/>
+            <w:tcMar>
+              <w:top w:type="dxa" w:w="70"/>
+              <w:left w:type="dxa" w:w="110"/>
+              <w:bottom w:type="dxa" w:w="70"/>
+              <w:right w:type="dxa" w:w="110"/>
+            </w:tcMar>
+          </w:tcPr>
+          <w:p>
+            <w:pPr>
+              <w:spacing w:after="0"/>
+            </w:pPr>
+            <w:r>
+              <w:rPr>
+                <w:rFonts w:ascii="Arial" w:cs="Arial" w:eastAsia="Arial" w:hAnsi="Arial"/>
+                <w:b w:val="false"/>
+                <w:bCs w:val="false"/>
+                <w:sz w:val="18"/>
+                <w:szCs w:val="18"/>
+              </w:rPr>
+              <w:t xml:space="preserve">Refresh tokens (done); MFA enforcement (built, off by default in the demo pilot); read-access audit (done); retention policy, legal hold, departure and a dry-run plan, a maintenance-only purge job, guardian data export; security review and performance run; VPS redeploy; iOS builds.</w:t>
+            </w:r>
+          </w:p>
+        </w:tc>
+        <w:tc>
+          <w:tcPr>
+            <w:tcW w:type="dxa" w:w="2238"/>
+            <w:tcBorders>
+              <w:top w:val="single" w:color="C9D1DA" w:sz="4"/>
+              <w:left w:val="single" w:color="C9D1DA" w:sz="4"/>
+              <w:bottom w:val="single" w:color="C9D1DA" w:sz="4"/>
+              <w:right w:val="single" w:color="C9D1DA" w:sz="4"/>
+            </w:tcBorders>
+            <w:shd w:fill="FFFFFF" w:color="auto" w:val="clear"/>
+            <w:tcMar>
+              <w:top w:type="dxa" w:w="70"/>
+              <w:left w:type="dxa" w:w="110"/>
+              <w:bottom w:type="dxa" w:w="70"/>
+              <w:right w:type="dxa" w:w="110"/>
+            </w:tcMar>
+          </w:tcPr>
+          <w:p>
+            <w:pPr>
+              <w:spacing w:after="0"/>
+            </w:pPr>
+            <w:r>
+              <w:rPr>
+                <w:rFonts w:ascii="Arial" w:cs="Arial" w:eastAsia="Arial" w:hAnsi="Arial"/>
+                <w:b w:val="false"/>
+                <w:bCs w:val="false"/>
+                <w:sz w:val="18"/>
+                <w:szCs w:val="18"/>
+              </w:rPr>
+              <w:t xml:space="preserve">OI-16, OI-17, OI-18, OI-28; RET-001–003, RET-005; PLT-005</w:t>
+            </w:r>
+          </w:p>
+        </w:tc>
+        <w:tc>
+          <w:tcPr>
+            <w:tcW w:type="dxa" w:w="1200"/>
+            <w:tcBorders>
+              <w:top w:val="single" w:color="C9D1DA" w:sz="4"/>
+              <w:left w:val="single" w:color="C9D1DA" w:sz="4"/>
+              <w:bottom w:val="single" w:color="C9D1DA" w:sz="4"/>
+              <w:right w:val="single" w:color="C9D1DA" w:sz="4"/>
+            </w:tcBorders>
+            <w:shd w:fill="FFFFFF" w:color="auto" w:val="clear"/>
+            <w:tcMar>
+              <w:top w:type="dxa" w:w="70"/>
+              <w:left w:type="dxa" w:w="110"/>
+              <w:bottom w:type="dxa" w:w="70"/>
+              <w:right w:type="dxa" w:w="110"/>
+            </w:tcMar>
+          </w:tcPr>
+          <w:p>
+            <w:pPr>
+              <w:spacing w:after="0"/>
+            </w:pPr>
+            <w:r>
+              <w:rPr>
+                <w:rFonts w:ascii="Arial" w:cs="Arial" w:eastAsia="Arial" w:hAnsi="Arial"/>
+                <w:b w:val="false"/>
+                <w:bCs w:val="false"/>
+                <w:sz w:val="18"/>
+                <w:szCs w:val="18"/>
+              </w:rPr>
+              <w:t xml:space="preserve">L</w:t>
+            </w:r>
+          </w:p>
+        </w:tc>
+      </w:tr>
+      <w:tr>
+        <w:trPr>
+          <w:cantSplit/>
+        </w:trPr>
+        <w:tc>
+          <w:tcPr>
+            <w:tcW w:type="dxa" w:w="1500"/>
+            <w:tcBorders>
+              <w:top w:val="single" w:color="C9D1DA" w:sz="4"/>
+              <w:left w:val="single" w:color="C9D1DA" w:sz="4"/>
+              <w:bottom w:val="single" w:color="C9D1DA" w:sz="4"/>
+              <w:right w:val="single" w:color="C9D1DA" w:sz="4"/>
+            </w:tcBorders>
+            <w:shd w:fill="F5F7FA" w:color="auto" w:val="clear"/>
+            <w:tcMar>
+              <w:top w:type="dxa" w:w="70"/>
+              <w:left w:type="dxa" w:w="110"/>
+              <w:bottom w:type="dxa" w:w="70"/>
+              <w:right w:type="dxa" w:w="110"/>
+            </w:tcMar>
+          </w:tcPr>
+          <w:p>
+            <w:pPr>
+              <w:spacing w:after="0"/>
+            </w:pPr>
+            <w:r>
+              <w:rPr>
+                <w:rFonts w:ascii="Arial" w:cs="Arial" w:eastAsia="Arial" w:hAnsi="Arial"/>
+                <w:b w:val="false"/>
+                <w:bCs w:val="false"/>
+                <w:sz w:val="18"/>
+                <w:szCs w:val="18"/>
+              </w:rPr>
+              <w:t xml:space="preserve">U2b Learning finish</w:t>
+            </w:r>
+          </w:p>
+        </w:tc>
+        <w:tc>
+          <w:tcPr>
+            <w:tcW w:type="dxa" w:w="4700"/>
+            <w:tcBorders>
+              <w:top w:val="single" w:color="C9D1DA" w:sz="4"/>
+              <w:left w:val="single" w:color="C9D1DA" w:sz="4"/>
+              <w:bottom w:val="single" w:color="C9D1DA" w:sz="4"/>
+              <w:right w:val="single" w:color="C9D1DA" w:sz="4"/>
+            </w:tcBorders>
+            <w:shd w:fill="F5F7FA" w:color="auto" w:val="clear"/>
+            <w:tcMar>
+              <w:top w:type="dxa" w:w="70"/>
+              <w:left w:type="dxa" w:w="110"/>
+              <w:bottom w:type="dxa" w:w="70"/>
+              <w:right w:type="dxa" w:w="110"/>
+            </w:tcMar>
+          </w:tcPr>
+          <w:p>
+            <w:pPr>
+              <w:spacing w:after="0"/>
+            </w:pPr>
+            <w:r>
+              <w:rPr>
+                <w:rFonts w:ascii="Arial" w:cs="Arial" w:eastAsia="Arial" w:hAnsi="Arial"/>
+                <w:b w:val="false"/>
+                <w:bCs w:val="false"/>
+                <w:sz w:val="18"/>
+                <w:szCs w:val="18"/>
+              </w:rPr>
+              <w:t xml:space="preserve">Educator-app learning screens; guardian responses; room programs; learning frameworks as configuration (EYLF, MTOP, then VEYLDF and the Queensland guideline, plus custom outcome sets).</w:t>
+            </w:r>
+          </w:p>
+        </w:tc>
+        <w:tc>
+          <w:tcPr>
+            <w:tcW w:type="dxa" w:w="2238"/>
+            <w:tcBorders>
+              <w:top w:val="single" w:color="C9D1DA" w:sz="4"/>
+              <w:left w:val="single" w:color="C9D1DA" w:sz="4"/>
+              <w:bottom w:val="single" w:color="C9D1DA" w:sz="4"/>
+              <w:right w:val="single" w:color="C9D1DA" w:sz="4"/>
+            </w:tcBorders>
+            <w:shd w:fill="F5F7FA" w:color="auto" w:val="clear"/>
+            <w:tcMar>
+              <w:top w:type="dxa" w:w="70"/>
+              <w:left w:type="dxa" w:w="110"/>
+              <w:bottom w:type="dxa" w:w="70"/>
+              <w:right w:type="dxa" w:w="110"/>
+            </w:tcMar>
+          </w:tcPr>
+          <w:p>
+            <w:pPr>
+              <w:spacing w:after="0"/>
+            </w:pPr>
+            <w:r>
+              <w:rPr>
+                <w:rFonts w:ascii="Arial" w:cs="Arial" w:eastAsia="Arial" w:hAnsi="Arial"/>
+                <w:b w:val="false"/>
+                <w:bCs w:val="false"/>
+                <w:sz w:val="18"/>
+                <w:szCs w:val="18"/>
+              </w:rPr>
+              <w:t xml:space="preserve">BRD §10; CUS-002</w:t>
+            </w:r>
+          </w:p>
+        </w:tc>
+        <w:tc>
+          <w:tcPr>
+            <w:tcW w:type="dxa" w:w="1200"/>
+            <w:tcBorders>
+              <w:top w:val="single" w:color="C9D1DA" w:sz="4"/>
+              <w:left w:val="single" w:color="C9D1DA" w:sz="4"/>
+              <w:bottom w:val="single" w:color="C9D1DA" w:sz="4"/>
+              <w:right w:val="single" w:color="C9D1DA" w:sz="4"/>
+            </w:tcBorders>
+            <w:shd w:fill="F5F7FA" w:color="auto" w:val="clear"/>
+            <w:tcMar>
+              <w:top w:type="dxa" w:w="70"/>
+              <w:left w:type="dxa" w:w="110"/>
+              <w:bottom w:type="dxa" w:w="70"/>
+              <w:right w:type="dxa" w:w="110"/>
+            </w:tcMar>
+          </w:tcPr>
+          <w:p>
+            <w:pPr>
+              <w:spacing w:after="0"/>
+            </w:pPr>
+            <w:r>
+              <w:rPr>
+                <w:rFonts w:ascii="Arial" w:cs="Arial" w:eastAsia="Arial" w:hAnsi="Arial"/>
+                <w:b w:val="false"/>
+                <w:bCs w:val="false"/>
+                <w:sz w:val="18"/>
+                <w:szCs w:val="18"/>
+              </w:rPr>
+              <w:t xml:space="preserve">M</w:t>
+            </w:r>
+          </w:p>
+        </w:tc>
+      </w:tr>
+      <w:tr>
+        <w:trPr>
+          <w:cantSplit/>
+        </w:trPr>
+        <w:tc>
+          <w:tcPr>
+            <w:tcW w:type="dxa" w:w="1500"/>
+            <w:tcBorders>
+              <w:top w:val="single" w:color="C9D1DA" w:sz="4"/>
+              <w:left w:val="single" w:color="C9D1DA" w:sz="4"/>
+              <w:bottom w:val="single" w:color="C9D1DA" w:sz="4"/>
+              <w:right w:val="single" w:color="C9D1DA" w:sz="4"/>
+            </w:tcBorders>
+            <w:shd w:fill="FFFFFF" w:color="auto" w:val="clear"/>
+            <w:tcMar>
+              <w:top w:type="dxa" w:w="70"/>
+              <w:left w:type="dxa" w:w="110"/>
+              <w:bottom w:type="dxa" w:w="70"/>
+              <w:right w:type="dxa" w:w="110"/>
+            </w:tcMar>
+          </w:tcPr>
+          <w:p>
+            <w:pPr>
+              <w:spacing w:after="0"/>
+            </w:pPr>
+            <w:r>
+              <w:rPr>
+                <w:rFonts w:ascii="Arial" w:cs="Arial" w:eastAsia="Arial" w:hAnsi="Arial"/>
+                <w:b w:val="false"/>
+                <w:bCs w:val="false"/>
+                <w:sz w:val="18"/>
+                <w:szCs w:val="18"/>
+              </w:rPr>
+              <w:t xml:space="preserve">U3b Parent and educator follow-ups</w:t>
+            </w:r>
+          </w:p>
+        </w:tc>
+        <w:tc>
+          <w:tcPr>
+            <w:tcW w:type="dxa" w:w="4700"/>
+            <w:tcBorders>
+              <w:top w:val="single" w:color="C9D1DA" w:sz="4"/>
+              <w:left w:val="single" w:color="C9D1DA" w:sz="4"/>
+              <w:bottom w:val="single" w:color="C9D1DA" w:sz="4"/>
+              <w:right w:val="single" w:color="C9D1DA" w:sz="4"/>
+            </w:tcBorders>
+            <w:shd w:fill="FFFFFF" w:color="auto" w:val="clear"/>
+            <w:tcMar>
+              <w:top w:type="dxa" w:w="70"/>
+              <w:left w:type="dxa" w:w="110"/>
+              <w:bottom w:type="dxa" w:w="70"/>
+              <w:right w:type="dxa" w:w="110"/>
+            </w:tcMar>
+          </w:tcPr>
+          <w:p>
+            <w:pPr>
+              <w:spacing w:after="0"/>
+            </w:pPr>
+            <w:r>
+              <w:rPr>
+                <w:rFonts w:ascii="Arial" w:cs="Arial" w:eastAsia="Arial" w:hAnsi="Arial"/>
+                <w:b w:val="false"/>
+                <w:bCs w:val="false"/>
+                <w:sz w:val="18"/>
+                <w:szCs w:val="18"/>
+              </w:rPr>
+              <w:t xml:space="preserve">Educator-app pickup screen; notifications for new family requests; on-device storage; parent digital sign-in/out.</w:t>
+            </w:r>
+          </w:p>
+        </w:tc>
+        <w:tc>
+          <w:tcPr>
+            <w:tcW w:type="dxa" w:w="2238"/>
+            <w:tcBorders>
+              <w:top w:val="single" w:color="C9D1DA" w:sz="4"/>
+              <w:left w:val="single" w:color="C9D1DA" w:sz="4"/>
+              <w:bottom w:val="single" w:color="C9D1DA" w:sz="4"/>
+              <w:right w:val="single" w:color="C9D1DA" w:sz="4"/>
+            </w:tcBorders>
+            <w:shd w:fill="FFFFFF" w:color="auto" w:val="clear"/>
+            <w:tcMar>
+              <w:top w:type="dxa" w:w="70"/>
+              <w:left w:type="dxa" w:w="110"/>
+              <w:bottom w:type="dxa" w:w="70"/>
+              <w:right w:type="dxa" w:w="110"/>
+            </w:tcMar>
+          </w:tcPr>
+          <w:p>
+            <w:pPr>
+              <w:spacing w:after="0"/>
+            </w:pPr>
+            <w:r>
+              <w:rPr>
+                <w:rFonts w:ascii="Arial" w:cs="Arial" w:eastAsia="Arial" w:hAnsi="Arial"/>
+                <w:b w:val="false"/>
+                <w:bCs w:val="false"/>
+                <w:sz w:val="18"/>
+                <w:szCs w:val="18"/>
+              </w:rPr>
+              <w:t xml:space="preserve">OI-22, OI-30; PAR-015</w:t>
+            </w:r>
+          </w:p>
+        </w:tc>
+        <w:tc>
+          <w:tcPr>
+            <w:tcW w:type="dxa" w:w="1200"/>
+            <w:tcBorders>
+              <w:top w:val="single" w:color="C9D1DA" w:sz="4"/>
+              <w:left w:val="single" w:color="C9D1DA" w:sz="4"/>
+              <w:bottom w:val="single" w:color="C9D1DA" w:sz="4"/>
+              <w:right w:val="single" w:color="C9D1DA" w:sz="4"/>
+            </w:tcBorders>
+            <w:shd w:fill="FFFFFF" w:color="auto" w:val="clear"/>
+            <w:tcMar>
+              <w:top w:type="dxa" w:w="70"/>
+              <w:left w:type="dxa" w:w="110"/>
+              <w:bottom w:type="dxa" w:w="70"/>
+              <w:right w:type="dxa" w:w="110"/>
+            </w:tcMar>
+          </w:tcPr>
+          <w:p>
+            <w:pPr>
+              <w:spacing w:after="0"/>
+            </w:pPr>
+            <w:r>
+              <w:rPr>
+                <w:rFonts w:ascii="Arial" w:cs="Arial" w:eastAsia="Arial" w:hAnsi="Arial"/>
+                <w:b w:val="false"/>
+                <w:bCs w:val="false"/>
+                <w:sz w:val="18"/>
+                <w:szCs w:val="18"/>
+              </w:rPr>
+              <w:t xml:space="preserve">M</w:t>
+            </w:r>
+          </w:p>
+        </w:tc>
+      </w:tr>
+      <w:tr>
+        <w:trPr>
+          <w:cantSplit/>
+        </w:trPr>
+        <w:tc>
+          <w:tcPr>
+            <w:tcW w:type="dxa" w:w="1500"/>
+            <w:tcBorders>
+              <w:top w:val="single" w:color="C9D1DA" w:sz="4"/>
+              <w:left w:val="single" w:color="C9D1DA" w:sz="4"/>
+              <w:bottom w:val="single" w:color="C9D1DA" w:sz="4"/>
+              <w:right w:val="single" w:color="C9D1DA" w:sz="4"/>
+            </w:tcBorders>
+            <w:shd w:fill="F5F7FA" w:color="auto" w:val="clear"/>
+            <w:tcMar>
+              <w:top w:type="dxa" w:w="70"/>
+              <w:left w:type="dxa" w:w="110"/>
+              <w:bottom w:type="dxa" w:w="70"/>
+              <w:right w:type="dxa" w:w="110"/>
+            </w:tcMar>
+          </w:tcPr>
+          <w:p>
+            <w:pPr>
+              <w:spacing w:after="0"/>
+            </w:pPr>
+            <w:r>
+              <w:rPr>
+                <w:rFonts w:ascii="Arial" w:cs="Arial" w:eastAsia="Arial" w:hAnsi="Arial"/>
+                <w:b w:val="false"/>
+                <w:bCs w:val="false"/>
+                <w:sz w:val="18"/>
+                <w:szCs w:val="18"/>
+              </w:rPr>
+              <w:t xml:space="preserve">C0 Configuration and entitlements</w:t>
+            </w:r>
+          </w:p>
+        </w:tc>
+        <w:tc>
+          <w:tcPr>
+            <w:tcW w:type="dxa" w:w="4700"/>
+            <w:tcBorders>
+              <w:top w:val="single" w:color="C9D1DA" w:sz="4"/>
+              <w:left w:val="single" w:color="C9D1DA" w:sz="4"/>
+              <w:bottom w:val="single" w:color="C9D1DA" w:sz="4"/>
+              <w:right w:val="single" w:color="C9D1DA" w:sz="4"/>
+            </w:tcBorders>
+            <w:shd w:fill="F5F7FA" w:color="auto" w:val="clear"/>
+            <w:tcMar>
+              <w:top w:type="dxa" w:w="70"/>
+              <w:left w:type="dxa" w:w="110"/>
+              <w:bottom w:type="dxa" w:w="70"/>
+              <w:right w:type="dxa" w:w="110"/>
+            </w:tcMar>
+          </w:tcPr>
+          <w:p>
+            <w:pPr>
+              <w:spacing w:after="0"/>
+            </w:pPr>
+            <w:r>
+              <w:rPr>
+                <w:rFonts w:ascii="Arial" w:cs="Arial" w:eastAsia="Arial" w:hAnsi="Arial"/>
+                <w:b w:val="false"/>
+                <w:bCs w:val="false"/>
+                <w:sz w:val="18"/>
+                <w:szCs w:val="18"/>
+              </w:rPr>
+              <w:t xml:space="preserve">Per-centre feature modules (safety-critical ones locked on); plan and entitlement tables checked on the server; protected-core rule; branding and philosophy. Built before U4 so new features are toggle-aware.</w:t>
+            </w:r>
+          </w:p>
+        </w:tc>
+        <w:tc>
+          <w:tcPr>
+            <w:tcW w:type="dxa" w:w="2238"/>
+            <w:tcBorders>
+              <w:top w:val="single" w:color="C9D1DA" w:sz="4"/>
+              <w:left w:val="single" w:color="C9D1DA" w:sz="4"/>
+              <w:bottom w:val="single" w:color="C9D1DA" w:sz="4"/>
+              <w:right w:val="single" w:color="C9D1DA" w:sz="4"/>
+            </w:tcBorders>
+            <w:shd w:fill="F5F7FA" w:color="auto" w:val="clear"/>
+            <w:tcMar>
+              <w:top w:type="dxa" w:w="70"/>
+              <w:left w:type="dxa" w:w="110"/>
+              <w:bottom w:type="dxa" w:w="70"/>
+              <w:right w:type="dxa" w:w="110"/>
+            </w:tcMar>
+          </w:tcPr>
+          <w:p>
+            <w:pPr>
+              <w:spacing w:after="0"/>
+            </w:pPr>
+            <w:r>
+              <w:rPr>
+                <w:rFonts w:ascii="Arial" w:cs="Arial" w:eastAsia="Arial" w:hAnsi="Arial"/>
+                <w:b w:val="false"/>
+                <w:bCs w:val="false"/>
+                <w:sz w:val="18"/>
+                <w:szCs w:val="18"/>
+              </w:rPr>
+              <w:t xml:space="preserve">CUS-001, CUS-004; PLT-001, PLT-002</w:t>
+            </w:r>
+          </w:p>
+        </w:tc>
+        <w:tc>
+          <w:tcPr>
+            <w:tcW w:type="dxa" w:w="1200"/>
+            <w:tcBorders>
+              <w:top w:val="single" w:color="C9D1DA" w:sz="4"/>
+              <w:left w:val="single" w:color="C9D1DA" w:sz="4"/>
+              <w:bottom w:val="single" w:color="C9D1DA" w:sz="4"/>
+              <w:right w:val="single" w:color="C9D1DA" w:sz="4"/>
+            </w:tcBorders>
+            <w:shd w:fill="F5F7FA" w:color="auto" w:val="clear"/>
+            <w:tcMar>
+              <w:top w:type="dxa" w:w="70"/>
+              <w:left w:type="dxa" w:w="110"/>
+              <w:bottom w:type="dxa" w:w="70"/>
+              <w:right w:type="dxa" w:w="110"/>
+            </w:tcMar>
+          </w:tcPr>
+          <w:p>
+            <w:pPr>
+              <w:spacing w:after="0"/>
+            </w:pPr>
+            <w:r>
+              <w:rPr>
+                <w:rFonts w:ascii="Arial" w:cs="Arial" w:eastAsia="Arial" w:hAnsi="Arial"/>
+                <w:b w:val="false"/>
+                <w:bCs w:val="false"/>
+                <w:sz w:val="18"/>
+                <w:szCs w:val="18"/>
+              </w:rPr>
+              <w:t xml:space="preserve">M</w:t>
+            </w:r>
+          </w:p>
+        </w:tc>
+      </w:tr>
+      <w:tr>
+        <w:trPr>
+          <w:cantSplit/>
+        </w:trPr>
+        <w:tc>
+          <w:tcPr>
+            <w:tcW w:type="dxa" w:w="1500"/>
+            <w:tcBorders>
+              <w:top w:val="single" w:color="C9D1DA" w:sz="4"/>
+              <w:left w:val="single" w:color="C9D1DA" w:sz="4"/>
+              <w:bottom w:val="single" w:color="C9D1DA" w:sz="4"/>
+              <w:right w:val="single" w:color="C9D1DA" w:sz="4"/>
+            </w:tcBorders>
+            <w:shd w:fill="FFFFFF" w:color="auto" w:val="clear"/>
+            <w:tcMar>
+              <w:top w:type="dxa" w:w="70"/>
+              <w:left w:type="dxa" w:w="110"/>
+              <w:bottom w:type="dxa" w:w="70"/>
+              <w:right w:type="dxa" w:w="110"/>
+            </w:tcMar>
+          </w:tcPr>
+          <w:p>
+            <w:pPr>
+              <w:spacing w:after="0"/>
+            </w:pPr>
+            <w:r>
+              <w:rPr>
+                <w:rFonts w:ascii="Arial" w:cs="Arial" w:eastAsia="Arial" w:hAnsi="Arial"/>
+                <w:b w:val="false"/>
+                <w:bCs w:val="false"/>
+                <w:sz w:val="18"/>
+                <w:szCs w:val="18"/>
+              </w:rPr>
+              <w:t xml:space="preserve">U4 Forms, health and calendar</w:t>
+            </w:r>
+          </w:p>
+        </w:tc>
+        <w:tc>
+          <w:tcPr>
+            <w:tcW w:type="dxa" w:w="4700"/>
+            <w:tcBorders>
+              <w:top w:val="single" w:color="C9D1DA" w:sz="4"/>
+              <w:left w:val="single" w:color="C9D1DA" w:sz="4"/>
+              <w:bottom w:val="single" w:color="C9D1DA" w:sz="4"/>
+              <w:right w:val="single" w:color="C9D1DA" w:sz="4"/>
+            </w:tcBorders>
+            <w:shd w:fill="FFFFFF" w:color="auto" w:val="clear"/>
+            <w:tcMar>
+              <w:top w:type="dxa" w:w="70"/>
+              <w:left w:type="dxa" w:w="110"/>
+              <w:bottom w:type="dxa" w:w="70"/>
+              <w:right w:type="dxa" w:w="110"/>
+            </w:tcMar>
+          </w:tcPr>
+          <w:p>
+            <w:pPr>
+              <w:spacing w:after="0"/>
+            </w:pPr>
+            <w:r>
+              <w:rPr>
+                <w:rFonts w:ascii="Arial" w:cs="Arial" w:eastAsia="Arial" w:hAnsi="Arial"/>
+                <w:b w:val="false"/>
+                <w:bCs w:val="false"/>
+                <w:sz w:val="18"/>
+                <w:szCs w:val="18"/>
+              </w:rPr>
+              <w:t xml:space="preserve">As in section 13.4, built toggle-aware.</w:t>
+            </w:r>
+          </w:p>
+        </w:tc>
+        <w:tc>
+          <w:tcPr>
+            <w:tcW w:type="dxa" w:w="2238"/>
+            <w:tcBorders>
+              <w:top w:val="single" w:color="C9D1DA" w:sz="4"/>
+              <w:left w:val="single" w:color="C9D1DA" w:sz="4"/>
+              <w:bottom w:val="single" w:color="C9D1DA" w:sz="4"/>
+              <w:right w:val="single" w:color="C9D1DA" w:sz="4"/>
+            </w:tcBorders>
+            <w:shd w:fill="FFFFFF" w:color="auto" w:val="clear"/>
+            <w:tcMar>
+              <w:top w:type="dxa" w:w="70"/>
+              <w:left w:type="dxa" w:w="110"/>
+              <w:bottom w:type="dxa" w:w="70"/>
+              <w:right w:type="dxa" w:w="110"/>
+            </w:tcMar>
+          </w:tcPr>
+          <w:p>
+            <w:pPr>
+              <w:spacing w:after="0"/>
+            </w:pPr>
+            <w:r>
+              <w:rPr>
+                <w:rFonts w:ascii="Arial" w:cs="Arial" w:eastAsia="Arial" w:hAnsi="Arial"/>
+                <w:b w:val="false"/>
+                <w:bCs w:val="false"/>
+                <w:sz w:val="18"/>
+                <w:szCs w:val="18"/>
+              </w:rPr>
+              <w:t xml:space="preserve">PAR-007</w:t>
+            </w:r>
+          </w:p>
+        </w:tc>
+        <w:tc>
+          <w:tcPr>
+            <w:tcW w:type="dxa" w:w="1200"/>
+            <w:tcBorders>
+              <w:top w:val="single" w:color="C9D1DA" w:sz="4"/>
+              <w:left w:val="single" w:color="C9D1DA" w:sz="4"/>
+              <w:bottom w:val="single" w:color="C9D1DA" w:sz="4"/>
+              <w:right w:val="single" w:color="C9D1DA" w:sz="4"/>
+            </w:tcBorders>
+            <w:shd w:fill="FFFFFF" w:color="auto" w:val="clear"/>
+            <w:tcMar>
+              <w:top w:type="dxa" w:w="70"/>
+              <w:left w:type="dxa" w:w="110"/>
+              <w:bottom w:type="dxa" w:w="70"/>
+              <w:right w:type="dxa" w:w="110"/>
+            </w:tcMar>
+          </w:tcPr>
+          <w:p>
+            <w:pPr>
+              <w:spacing w:after="0"/>
+            </w:pPr>
+            <w:r>
+              <w:rPr>
+                <w:rFonts w:ascii="Arial" w:cs="Arial" w:eastAsia="Arial" w:hAnsi="Arial"/>
+                <w:b w:val="false"/>
+                <w:bCs w:val="false"/>
+                <w:sz w:val="18"/>
+                <w:szCs w:val="18"/>
+              </w:rPr>
+              <w:t xml:space="preserve">L</w:t>
+            </w:r>
+          </w:p>
+        </w:tc>
+      </w:tr>
+      <w:tr>
+        <w:trPr>
+          <w:cantSplit/>
+        </w:trPr>
+        <w:tc>
+          <w:tcPr>
+            <w:tcW w:type="dxa" w:w="1500"/>
+            <w:tcBorders>
+              <w:top w:val="single" w:color="C9D1DA" w:sz="4"/>
+              <w:left w:val="single" w:color="C9D1DA" w:sz="4"/>
+              <w:bottom w:val="single" w:color="C9D1DA" w:sz="4"/>
+              <w:right w:val="single" w:color="C9D1DA" w:sz="4"/>
+            </w:tcBorders>
+            <w:shd w:fill="F5F7FA" w:color="auto" w:val="clear"/>
+            <w:tcMar>
+              <w:top w:type="dxa" w:w="70"/>
+              <w:left w:type="dxa" w:w="110"/>
+              <w:bottom w:type="dxa" w:w="70"/>
+              <w:right w:type="dxa" w:w="110"/>
+            </w:tcMar>
+          </w:tcPr>
+          <w:p>
+            <w:pPr>
+              <w:spacing w:after="0"/>
+            </w:pPr>
+            <w:r>
+              <w:rPr>
+                <w:rFonts w:ascii="Arial" w:cs="Arial" w:eastAsia="Arial" w:hAnsi="Arial"/>
+                <w:b w:val="false"/>
+                <w:bCs w:val="false"/>
+                <w:sz w:val="18"/>
+                <w:szCs w:val="18"/>
+              </w:rPr>
+              <w:t xml:space="preserve">U5 Money and insight</w:t>
+            </w:r>
+          </w:p>
+        </w:tc>
+        <w:tc>
+          <w:tcPr>
+            <w:tcW w:type="dxa" w:w="4700"/>
+            <w:tcBorders>
+              <w:top w:val="single" w:color="C9D1DA" w:sz="4"/>
+              <w:left w:val="single" w:color="C9D1DA" w:sz="4"/>
+              <w:bottom w:val="single" w:color="C9D1DA" w:sz="4"/>
+              <w:right w:val="single" w:color="C9D1DA" w:sz="4"/>
+            </w:tcBorders>
+            <w:shd w:fill="F5F7FA" w:color="auto" w:val="clear"/>
+            <w:tcMar>
+              <w:top w:type="dxa" w:w="70"/>
+              <w:left w:type="dxa" w:w="110"/>
+              <w:bottom w:type="dxa" w:w="70"/>
+              <w:right w:type="dxa" w:w="110"/>
+            </w:tcMar>
+          </w:tcPr>
+          <w:p>
+            <w:pPr>
+              <w:spacing w:after="0"/>
+            </w:pPr>
+            <w:r>
+              <w:rPr>
+                <w:rFonts w:ascii="Arial" w:cs="Arial" w:eastAsia="Arial" w:hAnsi="Arial"/>
+                <w:b w:val="false"/>
+                <w:bCs w:val="false"/>
+                <w:sz w:val="18"/>
+                <w:szCs w:val="18"/>
+              </w:rPr>
+              <w:t xml:space="preserve">As in section 13.4, plus a basic multi-site view and the area-manager role.</w:t>
+            </w:r>
+          </w:p>
+        </w:tc>
+        <w:tc>
+          <w:tcPr>
+            <w:tcW w:type="dxa" w:w="2238"/>
+            <w:tcBorders>
+              <w:top w:val="single" w:color="C9D1DA" w:sz="4"/>
+              <w:left w:val="single" w:color="C9D1DA" w:sz="4"/>
+              <w:bottom w:val="single" w:color="C9D1DA" w:sz="4"/>
+              <w:right w:val="single" w:color="C9D1DA" w:sz="4"/>
+            </w:tcBorders>
+            <w:shd w:fill="F5F7FA" w:color="auto" w:val="clear"/>
+            <w:tcMar>
+              <w:top w:type="dxa" w:w="70"/>
+              <w:left w:type="dxa" w:w="110"/>
+              <w:bottom w:type="dxa" w:w="70"/>
+              <w:right w:type="dxa" w:w="110"/>
+            </w:tcMar>
+          </w:tcPr>
+          <w:p>
+            <w:pPr>
+              <w:spacing w:after="0"/>
+            </w:pPr>
+            <w:r>
+              <w:rPr>
+                <w:rFonts w:ascii="Arial" w:cs="Arial" w:eastAsia="Arial" w:hAnsi="Arial"/>
+                <w:b w:val="false"/>
+                <w:bCs w:val="false"/>
+                <w:sz w:val="18"/>
+                <w:szCs w:val="18"/>
+              </w:rPr>
+              <w:t xml:space="preserve">BIL-006/007; HQ-001, HQ-003, HQ-004</w:t>
+            </w:r>
+          </w:p>
+        </w:tc>
+        <w:tc>
+          <w:tcPr>
+            <w:tcW w:type="dxa" w:w="1200"/>
+            <w:tcBorders>
+              <w:top w:val="single" w:color="C9D1DA" w:sz="4"/>
+              <w:left w:val="single" w:color="C9D1DA" w:sz="4"/>
+              <w:bottom w:val="single" w:color="C9D1DA" w:sz="4"/>
+              <w:right w:val="single" w:color="C9D1DA" w:sz="4"/>
+            </w:tcBorders>
+            <w:shd w:fill="F5F7FA" w:color="auto" w:val="clear"/>
+            <w:tcMar>
+              <w:top w:type="dxa" w:w="70"/>
+              <w:left w:type="dxa" w:w="110"/>
+              <w:bottom w:type="dxa" w:w="70"/>
+              <w:right w:type="dxa" w:w="110"/>
+            </w:tcMar>
+          </w:tcPr>
+          <w:p>
+            <w:pPr>
+              <w:spacing w:after="0"/>
+            </w:pPr>
+            <w:r>
+              <w:rPr>
+                <w:rFonts w:ascii="Arial" w:cs="Arial" w:eastAsia="Arial" w:hAnsi="Arial"/>
+                <w:b w:val="false"/>
+                <w:bCs w:val="false"/>
+                <w:sz w:val="18"/>
+                <w:szCs w:val="18"/>
+              </w:rPr>
+              <w:t xml:space="preserve">L</w:t>
+            </w:r>
+          </w:p>
+        </w:tc>
+      </w:tr>
+      <w:tr>
+        <w:trPr>
+          <w:cantSplit/>
+        </w:trPr>
+        <w:tc>
+          <w:tcPr>
+            <w:tcW w:type="dxa" w:w="1500"/>
+            <w:tcBorders>
+              <w:top w:val="single" w:color="C9D1DA" w:sz="4"/>
+              <w:left w:val="single" w:color="C9D1DA" w:sz="4"/>
+              <w:bottom w:val="single" w:color="C9D1DA" w:sz="4"/>
+              <w:right w:val="single" w:color="C9D1DA" w:sz="4"/>
+            </w:tcBorders>
+            <w:shd w:fill="FFFFFF" w:color="auto" w:val="clear"/>
+            <w:tcMar>
+              <w:top w:type="dxa" w:w="70"/>
+              <w:left w:type="dxa" w:w="110"/>
+              <w:bottom w:type="dxa" w:w="70"/>
+              <w:right w:type="dxa" w:w="110"/>
+            </w:tcMar>
+          </w:tcPr>
+          <w:p>
+            <w:pPr>
+              <w:spacing w:after="0"/>
+            </w:pPr>
+            <w:r>
+              <w:rPr>
+                <w:rFonts w:ascii="Arial" w:cs="Arial" w:eastAsia="Arial" w:hAnsi="Arial"/>
+                <w:b w:val="false"/>
+                <w:bCs w:val="false"/>
+                <w:sz w:val="18"/>
+                <w:szCs w:val="18"/>
+              </w:rPr>
+              <w:t xml:space="preserve">Phase 2</w:t>
+            </w:r>
+          </w:p>
+        </w:tc>
+        <w:tc>
+          <w:tcPr>
+            <w:tcW w:type="dxa" w:w="4700"/>
+            <w:tcBorders>
+              <w:top w:val="single" w:color="C9D1DA" w:sz="4"/>
+              <w:left w:val="single" w:color="C9D1DA" w:sz="4"/>
+              <w:bottom w:val="single" w:color="C9D1DA" w:sz="4"/>
+              <w:right w:val="single" w:color="C9D1DA" w:sz="4"/>
+            </w:tcBorders>
+            <w:shd w:fill="FFFFFF" w:color="auto" w:val="clear"/>
+            <w:tcMar>
+              <w:top w:type="dxa" w:w="70"/>
+              <w:left w:type="dxa" w:w="110"/>
+              <w:bottom w:type="dxa" w:w="70"/>
+              <w:right w:type="dxa" w:w="110"/>
+            </w:tcMar>
+          </w:tcPr>
+          <w:p>
+            <w:pPr>
+              <w:spacing w:after="0"/>
+            </w:pPr>
+            <w:r>
+              <w:rPr>
+                <w:rFonts w:ascii="Arial" w:cs="Arial" w:eastAsia="Arial" w:hAnsi="Arial"/>
+                <w:b w:val="false"/>
+                <w:bCs w:val="false"/>
+                <w:sz w:val="18"/>
+                <w:szCs w:val="18"/>
+              </w:rPr>
+              <w:t xml:space="preserve">2A ratios and responsible person first, then 2B staff, timesheets and rostering, 2C service compliance with audit packs, 2D enrolment, documentation templates and add-ons.</w:t>
+            </w:r>
+          </w:p>
+        </w:tc>
+        <w:tc>
+          <w:tcPr>
+            <w:tcW w:type="dxa" w:w="2238"/>
+            <w:tcBorders>
+              <w:top w:val="single" w:color="C9D1DA" w:sz="4"/>
+              <w:left w:val="single" w:color="C9D1DA" w:sz="4"/>
+              <w:bottom w:val="single" w:color="C9D1DA" w:sz="4"/>
+              <w:right w:val="single" w:color="C9D1DA" w:sz="4"/>
+            </w:tcBorders>
+            <w:shd w:fill="FFFFFF" w:color="auto" w:val="clear"/>
+            <w:tcMar>
+              <w:top w:type="dxa" w:w="70"/>
+              <w:left w:type="dxa" w:w="110"/>
+              <w:bottom w:type="dxa" w:w="70"/>
+              <w:right w:type="dxa" w:w="110"/>
+            </w:tcMar>
+          </w:tcPr>
+          <w:p>
+            <w:pPr>
+              <w:spacing w:after="0"/>
+            </w:pPr>
+            <w:r>
+              <w:rPr>
+                <w:rFonts w:ascii="Arial" w:cs="Arial" w:eastAsia="Arial" w:hAnsi="Arial"/>
+                <w:b w:val="false"/>
+                <w:bCs w:val="false"/>
+                <w:sz w:val="18"/>
+                <w:szCs w:val="18"/>
+              </w:rPr>
+              <w:t xml:space="preserve">RAT, ROS, CMP, RET-004, CUS-003/005/006, PLT-003</w:t>
+            </w:r>
+          </w:p>
+        </w:tc>
+        <w:tc>
+          <w:tcPr>
+            <w:tcW w:type="dxa" w:w="1200"/>
+            <w:tcBorders>
+              <w:top w:val="single" w:color="C9D1DA" w:sz="4"/>
+              <w:left w:val="single" w:color="C9D1DA" w:sz="4"/>
+              <w:bottom w:val="single" w:color="C9D1DA" w:sz="4"/>
+              <w:right w:val="single" w:color="C9D1DA" w:sz="4"/>
+            </w:tcBorders>
+            <w:shd w:fill="FFFFFF" w:color="auto" w:val="clear"/>
+            <w:tcMar>
+              <w:top w:type="dxa" w:w="70"/>
+              <w:left w:type="dxa" w:w="110"/>
+              <w:bottom w:type="dxa" w:w="70"/>
+              <w:right w:type="dxa" w:w="110"/>
+            </w:tcMar>
+          </w:tcPr>
+          <w:p>
+            <w:pPr>
+              <w:spacing w:after="0"/>
+            </w:pPr>
+            <w:r>
+              <w:rPr>
+                <w:rFonts w:ascii="Arial" w:cs="Arial" w:eastAsia="Arial" w:hAnsi="Arial"/>
+                <w:b w:val="false"/>
+                <w:bCs w:val="false"/>
+                <w:sz w:val="18"/>
+                <w:szCs w:val="18"/>
+              </w:rPr>
+              <w:t xml:space="preserve">L each</w:t>
+            </w:r>
+          </w:p>
+        </w:tc>
+      </w:tr>
+      <w:tr>
+        <w:trPr>
+          <w:cantSplit/>
+        </w:trPr>
+        <w:tc>
+          <w:tcPr>
+            <w:tcW w:type="dxa" w:w="1500"/>
+            <w:tcBorders>
+              <w:top w:val="single" w:color="C9D1DA" w:sz="4"/>
+              <w:left w:val="single" w:color="C9D1DA" w:sz="4"/>
+              <w:bottom w:val="single" w:color="C9D1DA" w:sz="4"/>
+              <w:right w:val="single" w:color="C9D1DA" w:sz="4"/>
+            </w:tcBorders>
+            <w:shd w:fill="F5F7FA" w:color="auto" w:val="clear"/>
+            <w:tcMar>
+              <w:top w:type="dxa" w:w="70"/>
+              <w:left w:type="dxa" w:w="110"/>
+              <w:bottom w:type="dxa" w:w="70"/>
+              <w:right w:type="dxa" w:w="110"/>
+            </w:tcMar>
+          </w:tcPr>
+          <w:p>
+            <w:pPr>
+              <w:spacing w:after="0"/>
+            </w:pPr>
+            <w:r>
+              <w:rPr>
+                <w:rFonts w:ascii="Arial" w:cs="Arial" w:eastAsia="Arial" w:hAnsi="Arial"/>
+                <w:b w:val="false"/>
+                <w:bCs w:val="false"/>
+                <w:sz w:val="18"/>
+                <w:szCs w:val="18"/>
+              </w:rPr>
+              <w:t xml:space="preserve">Phase 3</w:t>
+            </w:r>
+          </w:p>
+        </w:tc>
+        <w:tc>
+          <w:tcPr>
+            <w:tcW w:type="dxa" w:w="4700"/>
+            <w:tcBorders>
+              <w:top w:val="single" w:color="C9D1DA" w:sz="4"/>
+              <w:left w:val="single" w:color="C9D1DA" w:sz="4"/>
+              <w:bottom w:val="single" w:color="C9D1DA" w:sz="4"/>
+              <w:right w:val="single" w:color="C9D1DA" w:sz="4"/>
+            </w:tcBorders>
+            <w:shd w:fill="F5F7FA" w:color="auto" w:val="clear"/>
+            <w:tcMar>
+              <w:top w:type="dxa" w:w="70"/>
+              <w:left w:type="dxa" w:w="110"/>
+              <w:bottom w:type="dxa" w:w="70"/>
+              <w:right w:type="dxa" w:w="110"/>
+            </w:tcMar>
+          </w:tcPr>
+          <w:p>
+            <w:pPr>
+              <w:spacing w:after="0"/>
+            </w:pPr>
+            <w:r>
+              <w:rPr>
+                <w:rFonts w:ascii="Arial" w:cs="Arial" w:eastAsia="Arial" w:hAnsi="Arial"/>
+                <w:b w:val="false"/>
+                <w:bCs w:val="false"/>
+                <w:sz w:val="18"/>
+                <w:szCs w:val="18"/>
+              </w:rPr>
+              <w:t xml:space="preserve">3A multi-site live ratios and central templates; 3B parent AI assistant; 3C subscription billing and usage metering.</w:t>
+            </w:r>
+          </w:p>
+        </w:tc>
+        <w:tc>
+          <w:tcPr>
+            <w:tcW w:type="dxa" w:w="2238"/>
+            <w:tcBorders>
+              <w:top w:val="single" w:color="C9D1DA" w:sz="4"/>
+              <w:left w:val="single" w:color="C9D1DA" w:sz="4"/>
+              <w:bottom w:val="single" w:color="C9D1DA" w:sz="4"/>
+              <w:right w:val="single" w:color="C9D1DA" w:sz="4"/>
+            </w:tcBorders>
+            <w:shd w:fill="F5F7FA" w:color="auto" w:val="clear"/>
+            <w:tcMar>
+              <w:top w:type="dxa" w:w="70"/>
+              <w:left w:type="dxa" w:w="110"/>
+              <w:bottom w:type="dxa" w:w="70"/>
+              <w:right w:type="dxa" w:w="110"/>
+            </w:tcMar>
+          </w:tcPr>
+          <w:p>
+            <w:pPr>
+              <w:spacing w:after="0"/>
+            </w:pPr>
+            <w:r>
+              <w:rPr>
+                <w:rFonts w:ascii="Arial" w:cs="Arial" w:eastAsia="Arial" w:hAnsi="Arial"/>
+                <w:b w:val="false"/>
+                <w:bCs w:val="false"/>
+                <w:sz w:val="18"/>
+                <w:szCs w:val="18"/>
+              </w:rPr>
+              <w:t xml:space="preserve">HQ-002/005/006; AIP; PLT-004/006</w:t>
+            </w:r>
+          </w:p>
+        </w:tc>
+        <w:tc>
+          <w:tcPr>
+            <w:tcW w:type="dxa" w:w="1200"/>
+            <w:tcBorders>
+              <w:top w:val="single" w:color="C9D1DA" w:sz="4"/>
+              <w:left w:val="single" w:color="C9D1DA" w:sz="4"/>
+              <w:bottom w:val="single" w:color="C9D1DA" w:sz="4"/>
+              <w:right w:val="single" w:color="C9D1DA" w:sz="4"/>
+            </w:tcBorders>
+            <w:shd w:fill="F5F7FA" w:color="auto" w:val="clear"/>
+            <w:tcMar>
+              <w:top w:type="dxa" w:w="70"/>
+              <w:left w:type="dxa" w:w="110"/>
+              <w:bottom w:type="dxa" w:w="70"/>
+              <w:right w:type="dxa" w:w="110"/>
+            </w:tcMar>
+          </w:tcPr>
+          <w:p>
+            <w:pPr>
+              <w:spacing w:after="0"/>
+            </w:pPr>
+            <w:r>
+              <w:rPr>
+                <w:rFonts w:ascii="Arial" w:cs="Arial" w:eastAsia="Arial" w:hAnsi="Arial"/>
+                <w:b w:val="false"/>
+                <w:bCs w:val="false"/>
+                <w:sz w:val="18"/>
+                <w:szCs w:val="18"/>
+              </w:rPr>
+              <w:t xml:space="preserve">M to L</w:t>
+            </w:r>
+          </w:p>
+        </w:tc>
+      </w:tr>
+    </w:tbl>
+    <w:p>
+      <w:pPr>
+        <w:spacing w:after="80"/>
+      </w:pPr>
+    </w:p>
+    <w:p>
+      <w:pPr>
+        <w:spacing w:after="120" w:line="276"/>
+      </w:pPr>
+      <w:r>
+        <w:rPr>
+          <w:rFonts w:ascii="Arial" w:cs="Arial" w:eastAsia="Arial" w:hAnsi="Arial"/>
+          <w:sz w:val="20"/>
+          <w:szCs w:val="20"/>
+        </w:rPr>
+        <w:t xml:space="preserve">Recommended order: PR, U2b, U3b, C0, U4, U5, then Phase 2 (2A to 2D), then Phase 3. Re-run the security review and performance tests at the end of each stage that touches sign-in, money or child data.</w:t>
+      </w:r>
+    </w:p>
+    <w:p>
+      <w:pPr>
+        <w:pStyle w:val="Heading2"/>
+        <w:spacing w:after="100" w:before="220"/>
+      </w:pPr>
+      <w:r>
+        <w:rPr>
+          <w:rFonts w:ascii="Arial" w:cs="Arial" w:eastAsia="Arial" w:hAnsi="Arial"/>
+          <w:b/>
+          <w:bCs/>
+          <w:color w:val="1B3A5C"/>
+          <w:sz w:val="24"/>
+          <w:szCs w:val="24"/>
+        </w:rPr>
+        <w:t xml:space="preserve">14.4 Decisions made (11 October 2026)</w:t>
       </w:r>
     </w:p>
     <w:p>
@@ -19641,7 +21867,7 @@
           <w:sz w:val="20"/>
           <w:szCs w:val="20"/>
         </w:rPr>
-        <w:t xml:space="preserve">OWNA website (owna.com.au) and parent app feature page (owna.app/features/childcare-app-for-parents). Viewed 4 October 2026.</w:t>
+        <w:t xml:space="preserve">Adopt BRD v2.3. Payroll stays out of scope (reaffirms OI-19).</w:t>
       </w:r>
     </w:p>
     <w:p>
@@ -19659,7 +21885,7 @@
           <w:sz w:val="20"/>
           <w:szCs w:val="20"/>
         </w:rPr>
-        <w:t xml:space="preserve">OWNA Childcare App on the Apple App Store, Australia (apps.apple.com/au/app/owna-childcare-app/id1318604128): description, rating and reviews. Viewed 4 October 2026.</w:t>
+        <w:t xml:space="preserve">OI-31 pricing: the parent app is free to families. Centres get a free core (attendance, care records, family feed and messaging, announcements, basic forms and reports, full data export) and pay per enrolled child for add-ons (billing and CCS, learning, rostering and ratios, compliance, multi-site, AI assistant). Safety and compliance functions are never withheld. No price points are set.</w:t>
       </w:r>
     </w:p>
     <w:p>
@@ -19677,7 +21903,347 @@
           <w:sz w:val="20"/>
           <w:szCs w:val="20"/>
         </w:rPr>
+        <w:t xml:space="preserve">OI-32 retention: the longest applicable minimum applies. Seven years for CCS and billing records and child attendance; incident, injury, trauma and illness records until the child is 25; centres may lengthen but never shorten. The seven-year CCS figure comes from Department of Education guidance seen through a search summary and must be confirmed on the source page.</w:t>
+      </w:r>
+    </w:p>
+    <w:p>
+      <w:pPr>
+        <w:pStyle w:val="ListParagraph"/>
+        <w:numPr>
+          <w:ilvl w:val="0"/>
+          <w:numId w:val="2"/>
+        </w:numPr>
+        <w:spacing w:after="60" w:line="264"/>
+      </w:pPr>
+      <w:r>
+        <w:rPr>
+          <w:rFonts w:ascii="Arial" w:cs="Arial" w:eastAsia="Arial" w:hAnsi="Arial"/>
+          <w:sz w:val="20"/>
+          <w:szCs w:val="20"/>
+        </w:rPr>
+        <w:t xml:space="preserve">OI-33: parent sign-in/out is allowed as a centre option, not required. OI-34: Claude on Amazon Bedrock in Sydney with cross-region inference limited to Sydney and Melbourne, PII redacted first. OI-35: add VEYLDF and the Queensland Kindergarten Learning Guideline plus custom outcome sets.</w:t>
+      </w:r>
+    </w:p>
+    <w:p>
+      <w:pPr>
+        <w:pStyle w:val="ListParagraph"/>
+        <w:numPr>
+          <w:ilvl w:val="0"/>
+          <w:numId w:val="2"/>
+        </w:numPr>
+        <w:spacing w:after="60" w:line="264"/>
+      </w:pPr>
+      <w:r>
+        <w:rPr>
+          <w:rFonts w:ascii="Arial" w:cs="Arial" w:eastAsia="Arial" w:hAnsi="Arial"/>
+          <w:sz w:val="20"/>
+          <w:szCs w:val="20"/>
+        </w:rPr>
+        <w:t xml:space="preserve">These five are working defaults chosen by Claude on the owner’s instruction, with sources in docs/decision-log.md. Compliance should confirm them before the stages that depend on them.</w:t>
+      </w:r>
+    </w:p>
+    <w:p>
+      <w:pPr>
+        <w:pStyle w:val="Heading2"/>
+        <w:spacing w:after="100" w:before="220"/>
+      </w:pPr>
+      <w:r>
+        <w:rPr>
+          <w:rFonts w:ascii="Arial" w:cs="Arial" w:eastAsia="Arial" w:hAnsi="Arial"/>
+          <w:b/>
+          <w:bCs/>
+          <w:color w:val="1B3A5C"/>
+          <w:sz w:val="24"/>
+          <w:szCs w:val="24"/>
+        </w:rPr>
+        <w:t xml:space="preserve">14.5 Actions only the owner can take</w:t>
+      </w:r>
+    </w:p>
+    <w:p>
+      <w:pPr>
+        <w:pStyle w:val="ListParagraph"/>
+        <w:numPr>
+          <w:ilvl w:val="0"/>
+          <w:numId w:val="2"/>
+        </w:numPr>
+        <w:spacing w:after="60" w:line="264"/>
+      </w:pPr>
+      <w:r>
+        <w:rPr>
+          <w:rFonts w:ascii="Arial" w:cs="Arial" w:eastAsia="Arial" w:hAnsi="Arial"/>
+          <w:sz w:val="20"/>
+          <w:szCs w:val="20"/>
+        </w:rPr>
+        <w:t xml:space="preserve">Redeploy the VPS (git pull, then deploy.sh) and rebuild both Android apps with EAS; both need the owner’s access.</w:t>
+      </w:r>
+    </w:p>
+    <w:p>
+      <w:pPr>
+        <w:pStyle w:val="ListParagraph"/>
+        <w:numPr>
+          <w:ilvl w:val="0"/>
+          <w:numId w:val="2"/>
+        </w:numPr>
+        <w:spacing w:after="60" w:line="264"/>
+      </w:pPr>
+      <w:r>
+        <w:rPr>
+          <w:rFonts w:ascii="Arial" w:cs="Arial" w:eastAsia="Arial" w:hAnsi="Arial"/>
+          <w:sz w:val="20"/>
+          <w:szCs w:val="20"/>
+        </w:rPr>
+        <w:t xml:space="preserve">Apple Developer account and registered devices for iOS builds.</w:t>
+      </w:r>
+    </w:p>
+    <w:p>
+      <w:pPr>
+        <w:pStyle w:val="ListParagraph"/>
+        <w:numPr>
+          <w:ilvl w:val="0"/>
+          <w:numId w:val="2"/>
+        </w:numPr>
+        <w:spacing w:after="60" w:line="264"/>
+      </w:pPr>
+      <w:r>
+        <w:rPr>
+          <w:rFonts w:ascii="Arial" w:cs="Arial" w:eastAsia="Arial" w:hAnsi="Arial"/>
+          <w:sz w:val="20"/>
+          <w:szCs w:val="20"/>
+        </w:rPr>
+        <w:t xml:space="preserve">Payment merchant account (OI-12) and CCS registration (OI-05, OI-14).</w:t>
+      </w:r>
+    </w:p>
+    <w:p>
+      <w:pPr>
+        <w:pStyle w:val="ListParagraph"/>
+        <w:numPr>
+          <w:ilvl w:val="0"/>
+          <w:numId w:val="2"/>
+        </w:numPr>
+        <w:spacing w:after="60" w:line="264"/>
+      </w:pPr>
+      <w:r>
+        <w:rPr>
+          <w:rFonts w:ascii="Arial" w:cs="Arial" w:eastAsia="Arial" w:hAnsi="Arial"/>
+          <w:sz w:val="20"/>
+          <w:szCs w:val="20"/>
+        </w:rPr>
+        <w:t xml:space="preserve">Set MFA_ENFORCEMENT=required on the server before any real family uses it.</w:t>
+      </w:r>
+    </w:p>
+    <w:p>
+      <w:pPr>
+        <w:pStyle w:val="Heading1"/>
+        <w:spacing w:after="140" w:before="320"/>
+      </w:pPr>
+      <w:r>
+        <w:rPr>
+          <w:rFonts w:ascii="Arial" w:cs="Arial" w:eastAsia="Arial" w:hAnsi="Arial"/>
+          <w:b/>
+          <w:bCs/>
+          <w:color w:val="1B3A5C"/>
+          <w:sz w:val="30"/>
+          <w:szCs w:val="30"/>
+        </w:rPr>
+        <w:t xml:space="preserve">Sources and starting points</w:t>
+      </w:r>
+    </w:p>
+    <w:p>
+      <w:pPr>
+        <w:pStyle w:val="ListParagraph"/>
+        <w:numPr>
+          <w:ilvl w:val="0"/>
+          <w:numId w:val="2"/>
+        </w:numPr>
+        <w:spacing w:after="60" w:line="264"/>
+      </w:pPr>
+      <w:r>
+        <w:rPr>
+          <w:rFonts w:ascii="Arial" w:cs="Arial" w:eastAsia="Arial" w:hAnsi="Arial"/>
+          <w:sz w:val="20"/>
+          <w:szCs w:val="20"/>
+        </w:rPr>
+        <w:t xml:space="preserve">Australian Government Department of Education – registered child care software and the Child Care Subsidy system pages (education.gov.au/early-childhood/providers). Not read in detail for this plan; confirm directly.</w:t>
+      </w:r>
+    </w:p>
+    <w:p>
+      <w:pPr>
+        <w:pStyle w:val="ListParagraph"/>
+        <w:numPr>
+          <w:ilvl w:val="0"/>
+          <w:numId w:val="2"/>
+        </w:numPr>
+        <w:spacing w:after="60" w:line="264"/>
+      </w:pPr>
+      <w:r>
+        <w:rPr>
+          <w:rFonts w:ascii="Arial" w:cs="Arial" w:eastAsia="Arial" w:hAnsi="Arial"/>
+          <w:sz w:val="20"/>
+          <w:szCs w:val="20"/>
+        </w:rPr>
+        <w:t xml:space="preserve">Services Australia – child care providers, PRODA information.</w:t>
+      </w:r>
+    </w:p>
+    <w:p>
+      <w:pPr>
+        <w:pStyle w:val="ListParagraph"/>
+        <w:numPr>
+          <w:ilvl w:val="0"/>
+          <w:numId w:val="2"/>
+        </w:numPr>
+        <w:spacing w:after="60" w:line="264"/>
+      </w:pPr>
+      <w:r>
+        <w:rPr>
+          <w:rFonts w:ascii="Arial" w:cs="Arial" w:eastAsia="Arial" w:hAnsi="Arial"/>
+          <w:sz w:val="20"/>
+          <w:szCs w:val="20"/>
+        </w:rPr>
+        <w:t xml:space="preserve">ACECQA – educator-to-child ratios and the ratio calculator (acecqa.gov.au/nqf/educator-to-child-ratios).</w:t>
+      </w:r>
+    </w:p>
+    <w:p>
+      <w:pPr>
+        <w:pStyle w:val="ListParagraph"/>
+        <w:numPr>
+          <w:ilvl w:val="0"/>
+          <w:numId w:val="2"/>
+        </w:numPr>
+        <w:spacing w:after="60" w:line="264"/>
+      </w:pPr>
+      <w:r>
+        <w:rPr>
+          <w:rFonts w:ascii="Arial" w:cs="Arial" w:eastAsia="Arial" w:hAnsi="Arial"/>
+          <w:sz w:val="20"/>
+          <w:szCs w:val="20"/>
+        </w:rPr>
+        <w:t xml:space="preserve">BRD v2.2 (Next_Gen_Childcare_BRD_v2.2.docx), including Sections 13A and 13B and Appendix C. Supersedes v2.1.</w:t>
+      </w:r>
+    </w:p>
+    <w:p>
+      <w:pPr>
+        <w:pStyle w:val="ListParagraph"/>
+        <w:numPr>
+          <w:ilvl w:val="0"/>
+          <w:numId w:val="2"/>
+        </w:numPr>
+        <w:spacing w:after="60" w:line="264"/>
+      </w:pPr>
+      <w:r>
+        <w:rPr>
+          <w:rFonts w:ascii="Arial" w:cs="Arial" w:eastAsia="Arial" w:hAnsi="Arial"/>
+          <w:sz w:val="20"/>
+          <w:szCs w:val="20"/>
+        </w:rPr>
+        <w:t xml:space="preserve">OWNA website (owna.com.au) and parent app feature page (owna.app/features/childcare-app-for-parents). Viewed 4 October 2026.</w:t>
+      </w:r>
+    </w:p>
+    <w:p>
+      <w:pPr>
+        <w:pStyle w:val="ListParagraph"/>
+        <w:numPr>
+          <w:ilvl w:val="0"/>
+          <w:numId w:val="2"/>
+        </w:numPr>
+        <w:spacing w:after="60" w:line="264"/>
+      </w:pPr>
+      <w:r>
+        <w:rPr>
+          <w:rFonts w:ascii="Arial" w:cs="Arial" w:eastAsia="Arial" w:hAnsi="Arial"/>
+          <w:sz w:val="20"/>
+          <w:szCs w:val="20"/>
+        </w:rPr>
+        <w:t xml:space="preserve">OWNA Childcare App on the Apple App Store, Australia (apps.apple.com/au/app/owna-childcare-app/id1318604128): description, rating and reviews. Viewed 4 October 2026.</w:t>
+      </w:r>
+    </w:p>
+    <w:p>
+      <w:pPr>
+        <w:pStyle w:val="ListParagraph"/>
+        <w:numPr>
+          <w:ilvl w:val="0"/>
+          <w:numId w:val="2"/>
+        </w:numPr>
+        <w:spacing w:after="60" w:line="264"/>
+      </w:pPr>
+      <w:r>
+        <w:rPr>
+          <w:rFonts w:ascii="Arial" w:cs="Arial" w:eastAsia="Arial" w:hAnsi="Arial"/>
+          <w:sz w:val="20"/>
+          <w:szCs w:val="20"/>
+        </w:rPr>
         <w:t xml:space="preserve">OWNA features and reviews on GetApp (getapp.com/education-childcare-software/a/owna/features). Viewed 4 October 2026.</w:t>
+      </w:r>
+    </w:p>
+    <w:p>
+      <w:pPr>
+        <w:pStyle w:val="ListParagraph"/>
+        <w:numPr>
+          <w:ilvl w:val="0"/>
+          <w:numId w:val="2"/>
+        </w:numPr>
+        <w:spacing w:after="60" w:line="264"/>
+      </w:pPr>
+      <w:r>
+        <w:rPr>
+          <w:rFonts w:ascii="Arial" w:cs="Arial" w:eastAsia="Arial" w:hAnsi="Arial"/>
+          <w:sz w:val="20"/>
+          <w:szCs w:val="20"/>
+        </w:rPr>
+        <w:t xml:space="preserve">BRD v2.3 (Next_Gen_Childcare_BRD_v2.3.docx), section 36. Supersedes v2.2 for scope; v2.2 is kept for history.</w:t>
+      </w:r>
+    </w:p>
+    <w:p>
+      <w:pPr>
+        <w:pStyle w:val="ListParagraph"/>
+        <w:numPr>
+          <w:ilvl w:val="0"/>
+          <w:numId w:val="2"/>
+        </w:numPr>
+        <w:spacing w:after="60" w:line="264"/>
+      </w:pPr>
+      <w:r>
+        <w:rPr>
+          <w:rFonts w:ascii="Arial" w:cs="Arial" w:eastAsia="Arial" w:hAnsi="Arial"/>
+          <w:sz w:val="20"/>
+          <w:szCs w:val="20"/>
+        </w:rPr>
+        <w:t xml:space="preserve">Education and Care Services National Regulations, regulation 183 (record retention), as summarised by Meridian Lawyers and ACECQA. Seen 11 October 2026.</w:t>
+      </w:r>
+    </w:p>
+    <w:p>
+      <w:pPr>
+        <w:pStyle w:val="ListParagraph"/>
+        <w:numPr>
+          <w:ilvl w:val="0"/>
+          <w:numId w:val="2"/>
+        </w:numPr>
+        <w:spacing w:after="60" w:line="264"/>
+      </w:pPr>
+      <w:r>
+        <w:rPr>
+          <w:rFonts w:ascii="Arial" w:cs="Arial" w:eastAsia="Arial" w:hAnsi="Arial"/>
+          <w:sz w:val="20"/>
+          <w:szCs w:val="20"/>
+        </w:rPr>
+        <w:t xml:space="preserve">Department of Education, “What records you need to keep” (education.gov.au/early-childhood/providers/howto/record-keeping): seen only as a search summary on 11 October 2026; the page timed out when opened. Confirm directly.</w:t>
+      </w:r>
+    </w:p>
+    <w:p>
+      <w:pPr>
+        <w:pStyle w:val="ListParagraph"/>
+        <w:numPr>
+          <w:ilvl w:val="0"/>
+          <w:numId w:val="2"/>
+        </w:numPr>
+        <w:spacing w:after="60" w:line="264"/>
+      </w:pPr>
+      <w:r>
+        <w:rPr>
+          <w:rFonts w:ascii="Arial" w:cs="Arial" w:eastAsia="Arial" w:hAnsi="Arial"/>
+          <w:sz w:val="20"/>
+          <w:szCs w:val="20"/>
+        </w:rPr>
+        <w:t xml:space="preserve">Amazon Bedrock cross-region inference for Australia (Sydney and Melbourne), AWS announcement summaries. Seen 11 October 2026; confirm current model availability.</w:t>
       </w:r>
     </w:p>
     <w:sectPr>

</xml_diff>